<commit_message>
Name the speakers and add guidance for recording the discussion
Alber takes Project Lead / Analyst, Julebeth Data Engineer, Mardy
Statistician / Modeler, with a note on swapping the two member roles as
blocks and on where a fourth member would slot in.

The instructor asked for the discussion to be recorded, which changes
enough to be worth its own section: speakers identify themselves by name
on first line so a voice maps to a mark under Section 1.4, segment-by-
segment takes rather than one long one, screen recording rather than
filming a monitor since every exhibit is on screen, a test recording
before the real one, and a recorded closing that answers the Q&A
questions since a recording has no live examiner.

Co-Authored-By: Claude Opus 5 <noreply@anthropic.com>
Claude-Session: https://claude.ai/code/session_01VZUVZ4Kh74tBbebjZDm9fE
</commit_message>
<xml_diff>
--- a/docs/Discussion_Script.docx
+++ b/docs/Discussion_Script.docx
@@ -110,6 +110,107 @@
     <w:p>
       <w:r>
         <w:t>Every figure quoted here has been checked against the database. If you are asked where a number comes from, the answer is always a specific query or a specific worksheet cell, and those are named in the margin notes.</w:t>
+      </w:r>
+    </w:p>
+    <w:p>
+      <w:pPr>
+        <w:pStyle w:val="Heading3"/>
+      </w:pPr>
+      <w:r>
+        <w:t>Recording it</w:t>
+      </w:r>
+    </w:p>
+    <w:p>
+      <w:r>
+        <w:t>Your instructor asked for a recording, so a few things change. Read this before you press record, not after the first take.</w:t>
+      </w:r>
+    </w:p>
+    <w:p>
+      <w:r>
+        <w:rPr>
+          <w:b/>
+        </w:rPr>
+        <w:t>Say your name the first time you speak.</w:t>
+      </w:r>
+      <w:r>
+        <w:t xml:space="preserve"> "I'm Julebeth, I handled the data and the database." On a recording your instructor is matching a voice to a name for a mark under Section 1.4 — do not make them guess. Say the segment number or task too if the recording will be scrubbed through: "Task 1.2, the dataset."</w:t>
+      </w:r>
+    </w:p>
+    <w:p>
+      <w:r>
+        <w:rPr>
+          <w:b/>
+        </w:rPr>
+        <w:t>Record in segments, not one continuous take.</w:t>
+      </w:r>
+      <w:r>
+        <w:t xml:space="preserve"> Ten short recordings you can re-take individually beat one fifteen-minute take that gets ruined at minute twelve. Stitch them, or submit them numbered. If it has to be one take, agree in advance that small stumbles are not worth restarting for — nobody is marking fluency.</w:t>
+      </w:r>
+    </w:p>
+    <w:p>
+      <w:r>
+        <w:rPr>
+          <w:b/>
+        </w:rPr>
+        <w:t>One person talks at a time.</w:t>
+      </w:r>
+      <w:r>
+        <w:t xml:space="preserve"> Overlapping voices are fine in a room and unintelligible on a recording. Leave a beat after each speaker finishes before the next one starts; it also gives you clean cut points.</w:t>
+      </w:r>
+    </w:p>
+    <w:p>
+      <w:r>
+        <w:rPr>
+          <w:b/>
+        </w:rPr>
+        <w:t>Screen-record with audio rather than filming a monitor.</w:t>
+      </w:r>
+      <w:r>
+        <w:t xml:space="preserve"> Every exhibit in this project is on a screen — the ERD, the query output, the workbook, the figures. If you film a laptop the numbers will not be readable, and unreadable evidence is the same as no evidence. Whoever drives the screen should not also be the one speaking, if you can spare the person.</w:t>
+      </w:r>
+    </w:p>
+    <w:p>
+      <w:r>
+        <w:rPr>
+          <w:b/>
+        </w:rPr>
+        <w:t>Do a thirty-second test first.</w:t>
+      </w:r>
+      <w:r>
+        <w:t xml:space="preserve"> Record, play it back, check three things: every voice is audible, the screen text is legible at the recording's resolution, and there is no room echo or fan noise drowning you. Fixing this after a full take is the most common way groups lose an evening.</w:t>
+      </w:r>
+    </w:p>
+    <w:p>
+      <w:r>
+        <w:rPr>
+          <w:b/>
+        </w:rPr>
+        <w:t>A recording is permanent, so the honest parts matter more, not less.</w:t>
+      </w:r>
+      <w:r>
+        <w:t xml:space="preserve"> The synthetic data, the Checkpoint 1 correction, the forecast that lost — say all three out loud, on the record, before anyone asks. A recording where you volunteer your own error reads as competence; one where the error surfaces later reads very differently.</w:t>
+      </w:r>
+    </w:p>
+    <w:p>
+      <w:r>
+        <w:rPr>
+          <w:b/>
+        </w:rPr>
+        <w:t>Q&amp;A on a recording.</w:t>
+      </w:r>
+      <w:r>
+        <w:t xml:space="preserve"> There is nobody to ask questions, so use the Q&amp;A table two ways: rehearse with it, then record a short closing where each speaker answers one or two of the questions from their own area. It shows you can defend the work, which is what the live version would have tested.</w:t>
+      </w:r>
+    </w:p>
+    <w:p>
+      <w:r>
+        <w:rPr>
+          <w:b/>
+        </w:rPr>
+        <w:t>Before you submit:</w:t>
+      </w:r>
+      <w:r>
+        <w:t xml:space="preserve"> play the whole thing back once, end to end. Check the file opens, the audio does not cut out, and the length fits any limit you were given. Name the file with your group and the checkpoint.</w:t>
       </w:r>
     </w:p>
     <w:p>
@@ -148,7 +249,7 @@
               <w:rPr>
                 <w:b/>
               </w:rPr>
-              <w:t>Label</w:t>
+              <w:t>Speaker</w:t>
             </w:r>
           </w:p>
         </w:tc>
@@ -208,7 +309,7 @@
                 <w:b/>
                 <w:sz w:val="18"/>
               </w:rPr>
-              <w:t>LEAD</w:t>
+              <w:t>Alber</w:t>
             </w:r>
           </w:p>
         </w:tc>
@@ -274,7 +375,7 @@
                 <w:b/>
                 <w:sz w:val="18"/>
               </w:rPr>
-              <w:t>DATA</w:t>
+              <w:t>Julebeth</w:t>
             </w:r>
           </w:p>
         </w:tc>
@@ -340,7 +441,7 @@
                 <w:b/>
                 <w:sz w:val="18"/>
               </w:rPr>
-              <w:t>STATS</w:t>
+              <w:t>Mardy</w:t>
             </w:r>
           </w:p>
         </w:tc>
@@ -404,7 +505,7 @@
     </w:p>
     <w:p>
       <w:r>
-        <w:t xml:space="preserve">If your group has four members, the </w:t>
+        <w:t xml:space="preserve">Julebeth and Mardy can swap roles if the other split suits you better — the segments move as blocks, so trading segments 2, 3, 5 for segments 4, 6, 7, 8, 9 is the whole change. If a fourth member joins as </w:t>
       </w:r>
       <w:r>
         <w:rPr>
@@ -413,7 +514,7 @@
         <w:t>BI Developer / Visualizer</w:t>
       </w:r>
       <w:r>
-        <w:t xml:space="preserve"> takes the figures and charts: split segment 4 (the queries) and segment 9 (the forecast chart) so that the visualiser presents each chart and STATS presents the number behind it.</w:t>
+        <w:t>, give them the charts: split segments 4 and 9 so they present each figure and Mardy presents the number behind it.</w:t>
       </w:r>
     </w:p>
     <w:p>
@@ -969,7 +1070,7 @@
         <w:rPr>
           <w:i/>
         </w:rPr>
-        <w:t>About 2 minutes. LEAD opens.</w:t>
+        <w:t>About 2 minutes. Alber opens.</w:t>
       </w:r>
     </w:p>
     <w:p>
@@ -977,7 +1078,7 @@
         <w:rPr>
           <w:b/>
         </w:rPr>
-        <w:t>LEAD.</w:t>
+        <w:t>Alber.</w:t>
       </w:r>
       <w:r>
         <w:t xml:space="preserve"> Our domain is Retail and Sales Analytics, and our topic is sales trend analysis. The subject is a multi-category retailer — electronics, furniture and office supplies — trading across six US states between 2020 and 2025.</w:t>
@@ -1002,7 +1103,7 @@
         <w:rPr>
           <w:b/>
         </w:rPr>
-        <w:t>DATA.</w:t>
+        <w:t>Julebeth.</w:t>
       </w:r>
       <w:r>
         <w:t xml:space="preserve"> Why is that an analytical problem? Falling sales is not exactly a mystery.</w:t>
@@ -1013,7 +1114,7 @@
         <w:rPr>
           <w:b/>
         </w:rPr>
-        <w:t>LEAD.</w:t>
+        <w:t>Alber.</w:t>
       </w:r>
       <w:r>
         <w:t xml:space="preserve"> Because of what </w:t>
@@ -1042,7 +1143,7 @@
         <w:rPr>
           <w:b/>
         </w:rPr>
-        <w:t>STATS.</w:t>
+        <w:t>Mardy.</w:t>
       </w:r>
       <w:r>
         <w:t xml:space="preserve"> So the business questions.</w:t>
@@ -1053,7 +1154,7 @@
         <w:rPr>
           <w:b/>
         </w:rPr>
-        <w:t>LEAD.</w:t>
+        <w:t>Alber.</w:t>
       </w:r>
       <w:r>
         <w:t xml:space="preserve"> Three of them, and every deliverable in this project maps back to one:</w:t>
@@ -1361,7 +1462,7 @@
         <w:rPr>
           <w:i/>
         </w:rPr>
-        <w:t>About 2.5 minutes. DATA leads.</w:t>
+        <w:t>About 2.5 minutes. Julebeth leads.</w:t>
       </w:r>
     </w:p>
     <w:p>
@@ -1369,7 +1470,7 @@
         <w:rPr>
           <w:b/>
         </w:rPr>
-        <w:t>DATA.</w:t>
+        <w:t>Julebeth.</w:t>
       </w:r>
       <w:r>
         <w:t xml:space="preserve"> The dataset is a retail sales export, 1,194 transaction lines and 12 columns, covering 22 March 2020 to 15 March 2025. The brief asks for at least 200 rows. The grain — and this is the word to remember — is </w:t>
@@ -1416,7 +1517,7 @@
         <w:rPr>
           <w:b/>
         </w:rPr>
-        <w:t>LEAD.</w:t>
+        <w:t>Alber.</w:t>
       </w:r>
       <w:r>
         <w:t xml:space="preserve"> Why not repair it instead?</w:t>
@@ -1427,7 +1528,7 @@
         <w:rPr>
           <w:b/>
         </w:rPr>
-        <w:t>DATA.</w:t>
+        <w:t>Julebeth.</w:t>
       </w:r>
       <w:r>
         <w:t xml:space="preserve"> Because repairing it means deciding which of two rows with the same ID is the "real" one, and we have no evidence for that decision. Inventing that evidence is data fabrication, which the brief says is grounds for a failing mark. Documenting the defect costs us nothing analytically — no question we ask needs order identity.</w:t>
@@ -1544,7 +1645,7 @@
         <w:rPr>
           <w:b/>
         </w:rPr>
-        <w:t>STATS.</w:t>
+        <w:t>Mardy.</w:t>
       </w:r>
       <w:r>
         <w:t xml:space="preserve"> And we did not fix any of it.</w:t>
@@ -1555,7 +1656,7 @@
         <w:rPr>
           <w:b/>
         </w:rPr>
-        <w:t>DATA.</w:t>
+        <w:t>Julebeth.</w:t>
       </w:r>
       <w:r>
         <w:t xml:space="preserve"> We did not. Fixing it would mean inventing numbers. What we did instead was state it, prove it, and carry the limitation into every conclusion. The method is unaffected — every query and every statistic in this project would run identically against a real export.</w:t>
@@ -1579,7 +1680,7 @@
         <w:rPr>
           <w:i/>
         </w:rPr>
-        <w:t>About 2 minutes. DATA continues, with the ERD on screen.</w:t>
+        <w:t>About 2 minutes. Julebeth continues, with the ERD on screen.</w:t>
       </w:r>
     </w:p>
     <w:p>
@@ -1587,7 +1688,7 @@
         <w:rPr>
           <w:b/>
         </w:rPr>
-        <w:t>DATA.</w:t>
+        <w:t>Julebeth.</w:t>
       </w:r>
       <w:r>
         <w:t xml:space="preserve"> We normalised the flat file into a </w:t>
@@ -1697,7 +1798,7 @@
         <w:rPr>
           <w:b/>
         </w:rPr>
-        <w:t>LEAD.</w:t>
+        <w:t>Alber.</w:t>
       </w:r>
       <w:r>
         <w:t xml:space="preserve"> Why a star, and not just the one table we started with?</w:t>
@@ -1708,7 +1809,7 @@
         <w:rPr>
           <w:b/>
         </w:rPr>
-        <w:t>DATA.</w:t>
+        <w:t>Julebeth.</w:t>
       </w:r>
       <w:r>
         <w:t xml:space="preserve"> Three reasons.</w:t>
@@ -1772,7 +1873,7 @@
         <w:rPr>
           <w:b/>
         </w:rPr>
-        <w:t>STATS.</w:t>
+        <w:t>Mardy.</w:t>
       </w:r>
       <w:r>
         <w:t xml:space="preserve"> Say something about the </w:t>
@@ -1794,7 +1895,7 @@
         <w:rPr>
           <w:b/>
         </w:rPr>
-        <w:t>DATA.</w:t>
+        <w:t>Julebeth.</w:t>
       </w:r>
       <w:r>
         <w:t xml:space="preserve"> It looks like overkill until you try to write the queries. Two reasons it earns its place. One, it keeps the SQL portable — we never call </w:t>
@@ -1914,7 +2015,7 @@
         <w:rPr>
           <w:i/>
         </w:rPr>
-        <w:t>About 3 minutes. STATS leads. Have the Q3, Q5 and Q8 screenshots ready.</w:t>
+        <w:t>About 3 minutes. Mardy leads. Have the Q3, Q5 and Q8 screenshots ready.</w:t>
       </w:r>
     </w:p>
     <w:p>
@@ -1922,7 +2023,7 @@
         <w:rPr>
           <w:b/>
         </w:rPr>
-        <w:t>STATS.</w:t>
+        <w:t>Mardy.</w:t>
       </w:r>
       <w:r>
         <w:t xml:space="preserve"> Eight queries in four groups: two basic retrievals with </w:t>
@@ -1986,7 +2087,7 @@
         <w:rPr>
           <w:b/>
         </w:rPr>
-        <w:t>LEAD.</w:t>
+        <w:t>Alber.</w:t>
       </w:r>
       <w:r>
         <w:t xml:space="preserve"> Which is actionable in a way that "revenue fell" is not. It points at demand generation, not at pricing.</w:t>
@@ -1997,7 +2098,7 @@
         <w:rPr>
           <w:b/>
         </w:rPr>
-        <w:t>STATS.</w:t>
+        <w:t>Mardy.</w:t>
       </w:r>
       <w:r>
         <w:t xml:space="preserve"> </w:t>
@@ -2017,7 +2118,7 @@
         <w:rPr>
           <w:b/>
         </w:rPr>
-        <w:t>DATA.</w:t>
+        <w:t>Julebeth.</w:t>
       </w:r>
       <w:r>
         <w:t xml:space="preserve"> So it is not a general slowdown.</w:t>
@@ -2028,7 +2129,7 @@
         <w:rPr>
           <w:b/>
         </w:rPr>
-        <w:t>STATS.</w:t>
+        <w:t>Mardy.</w:t>
       </w:r>
       <w:r>
         <w:t xml:space="preserve"> It is not. Two opposite trends are running at once, and the company-wide figure is their average, which describes neither. That is the single most useful thing Checkpoint 1 produced.</w:t>
@@ -2092,7 +2193,7 @@
         <w:rPr>
           <w:i/>
         </w:rPr>
-        <w:t>About 1.5 minutes. DATA leads, workbook on screen.</w:t>
+        <w:t>About 1.5 minutes. Julebeth leads, workbook on screen.</w:t>
       </w:r>
     </w:p>
     <w:p>
@@ -2100,7 +2201,7 @@
         <w:rPr>
           <w:b/>
         </w:rPr>
-        <w:t>DATA.</w:t>
+        <w:t>Julebeth.</w:t>
       </w:r>
       <w:r>
         <w:t xml:space="preserve"> Checkpoint 2 takes the same dataset — the brief requires the same dataset — out of the database and into Excel. The workbook has thirteen sheets.</w:t>
@@ -2190,7 +2291,7 @@
         <w:rPr>
           <w:i/>
         </w:rPr>
-        <w:t>About 1.5 minutes. STATS.</w:t>
+        <w:t>About 1.5 minutes. Mardy.</w:t>
       </w:r>
     </w:p>
     <w:p>
@@ -2198,7 +2299,7 @@
         <w:rPr>
           <w:b/>
         </w:rPr>
-        <w:t>STATS.</w:t>
+        <w:t>Mardy.</w:t>
       </w:r>
       <w:r>
         <w:t xml:space="preserve"> Three numerical variables: Amount, Profit and Quantity. Mean, median, mode, standard deviation, variance, range, quartiles, IQR and coefficient of variation for each, plus a frequency distribution and a histogram.</w:t>
@@ -2234,7 +2335,7 @@
         <w:rPr>
           <w:b/>
         </w:rPr>
-        <w:t>LEAD.</w:t>
+        <w:t>Alber.</w:t>
       </w:r>
       <w:r>
         <w:t xml:space="preserve"> That is the point that changes what we recommend for the dashboard.</w:t>
@@ -2245,7 +2346,7 @@
         <w:rPr>
           <w:b/>
         </w:rPr>
-        <w:t>STATS.</w:t>
+        <w:t>Mardy.</w:t>
       </w:r>
       <w:r>
         <w:t xml:space="preserve"> It is. </w:t>
@@ -2278,7 +2379,7 @@
         <w:rPr>
           <w:i/>
         </w:rPr>
-        <w:t>About 1.5 minutes. STATS, scatter plots on screen.</w:t>
+        <w:t>About 1.5 minutes. Mardy, scatter plots on screen.</w:t>
       </w:r>
     </w:p>
     <w:p>
@@ -2286,7 +2387,7 @@
         <w:rPr>
           <w:b/>
         </w:rPr>
-        <w:t>STATS.</w:t>
+        <w:t>Mardy.</w:t>
       </w:r>
       <w:r>
         <w:t xml:space="preserve"> Two required pairs plus a third for support. Pearson's r, with scatter plots and fitted trendlines.</w:t>
@@ -2348,7 +2449,7 @@
         <w:rPr>
           <w:b/>
         </w:rPr>
-        <w:t>DATA.</w:t>
+        <w:t>Julebeth.</w:t>
       </w:r>
       <w:r>
         <w:t xml:space="preserve"> And the caveat.</w:t>
@@ -2359,7 +2460,7 @@
         <w:rPr>
           <w:b/>
         </w:rPr>
-        <w:t>STATS.</w:t>
+        <w:t>Mardy.</w:t>
       </w:r>
       <w:r>
         <w:t xml:space="preserve"> Correlation is not causation, and we say so explicitly. Order count and revenue could both be driven by something else — market conditions, a campaign we cannot see in this data. What we can say is that the association is strong and consistent over 57 months, not that one causes the other.</w:t>
@@ -2383,7 +2484,7 @@
         <w:rPr>
           <w:i/>
         </w:rPr>
-        <w:t>About 2 minutes. STATS, ToolPak output on screen.</w:t>
+        <w:t>About 2 minutes. Mardy, ToolPak output on screen.</w:t>
       </w:r>
     </w:p>
     <w:p>
@@ -2391,7 +2492,7 @@
         <w:rPr>
           <w:b/>
         </w:rPr>
-        <w:t>STATS.</w:t>
+        <w:t>Mardy.</w:t>
       </w:r>
       <w:r>
         <w:t xml:space="preserve"> We regressed monthly revenue on monthly order count over the 57 complete months. The equation:</w:t>
@@ -2471,7 +2572,7 @@
         <w:rPr>
           <w:b/>
         </w:rPr>
-        <w:t>LEAD.</w:t>
+        <w:t>Alber.</w:t>
       </w:r>
       <w:r>
         <w:t xml:space="preserve"> And the forecast the brief asks for.</w:t>
@@ -2482,7 +2583,7 @@
         <w:rPr>
           <w:b/>
         </w:rPr>
-        <w:t>STATS.</w:t>
+        <w:t>Mardy.</w:t>
       </w:r>
       <w:r>
         <w:t xml:space="preserve"> The company is running about four orders per month below its 2022 level. At 5,224 per order, closing that gap is worth roughly </w:t>
@@ -2529,7 +2630,7 @@
         <w:rPr>
           <w:i/>
         </w:rPr>
-        <w:t>About 2.5 minutes. STATS and LEAD share this. Figure 2 on screen, then the forecast chart.</w:t>
+        <w:t>About 2.5 minutes. Mardy and Alber share this. Figure 2 on screen, then the forecast chart.</w:t>
       </w:r>
     </w:p>
     <w:p>
@@ -2537,7 +2638,7 @@
         <w:rPr>
           <w:b/>
         </w:rPr>
-        <w:t>STATS.</w:t>
+        <w:t>Mardy.</w:t>
       </w:r>
       <w:r>
         <w:t xml:space="preserve"> This is the segment that carries our topic, so I want to be precise about what we did and did not find.</w:t>
@@ -2562,7 +2663,7 @@
         <w:rPr>
           <w:b/>
         </w:rPr>
-        <w:t>LEAD.</w:t>
+        <w:t>Alber.</w:t>
       </w:r>
       <w:r>
         <w:t xml:space="preserve"> Then why is there no growth rate in the forecast?</w:t>
@@ -2573,7 +2674,7 @@
         <w:rPr>
           <w:b/>
         </w:rPr>
-        <w:t>STATS.</w:t>
+        <w:t>Mardy.</w:t>
       </w:r>
       <w:r>
         <w:t xml:space="preserve"> Because we tested for one and there isn't a single one. We fitted a straight line across all 57 months and it explains </w:t>
@@ -2621,7 +2722,7 @@
         <w:rPr>
           <w:b/>
         </w:rPr>
-        <w:t>DATA.</w:t>
+        <w:t>Julebeth.</w:t>
       </w:r>
       <w:r>
         <w:t xml:space="preserve"> And you tested whether that actually worked.</w:t>
@@ -2632,7 +2733,7 @@
         <w:rPr>
           <w:b/>
         </w:rPr>
-        <w:t>STATS.</w:t>
+        <w:t>Mardy.</w:t>
       </w:r>
       <w:r>
         <w:t xml:space="preserve"> We did, and it is the part of this project I would most want the instructor to see. We held out the two months we could check and compared the seasonal forecast against a naive flat average. </w:t>
@@ -2657,7 +2758,7 @@
         <w:rPr>
           <w:b/>
         </w:rPr>
-        <w:t>LEAD.</w:t>
+        <w:t>Alber.</w:t>
       </w:r>
       <w:r>
         <w:t xml:space="preserve"> So why keep the seasonal method?</w:t>
@@ -2668,7 +2769,7 @@
         <w:rPr>
           <w:b/>
         </w:rPr>
-        <w:t>STATS.</w:t>
+        <w:t>Mardy.</w:t>
       </w:r>
       <w:r>
         <w:t xml:space="preserve"> Because switching methods on the strength of two observations is overfitting the holdout — you would be choosing the model that happened to win on a two-month sample, which is not evidence. We report the result, we keep the method, and we say plainly that our forecast reliability over this horizon is weak. The reliability discussion the brief asks for is not a formality here; we have measured our own error and it is 22.7%.</w:t>
@@ -2692,7 +2793,7 @@
         <w:rPr>
           <w:i/>
         </w:rPr>
-        <w:t>About 2 minutes. LEAD closes, with DATA on the correction.</w:t>
+        <w:t>About 2 minutes. Alber closes, with Julebeth on the correction.</w:t>
       </w:r>
     </w:p>
     <w:p>
@@ -2700,7 +2801,7 @@
         <w:rPr>
           <w:b/>
         </w:rPr>
-        <w:t>DATA.</w:t>
+        <w:t>Julebeth.</w:t>
       </w:r>
       <w:r>
         <w:t xml:space="preserve"> Before the conclusion, one thing we have to put on the record ourselves. Building the Checkpoint 2 monthly series exposed an </w:t>
@@ -2950,7 +3051,7 @@
         <w:rPr>
           <w:b/>
         </w:rPr>
-        <w:t>LEAD.</w:t>
+        <w:t>Alber.</w:t>
       </w:r>
       <w:r>
         <w:t xml:space="preserve"> Three recommendations come out of this, and each one is tied to a measurement rather than an opinion.</w:t>
@@ -2994,7 +3095,7 @@
         <w:rPr>
           <w:b/>
         </w:rPr>
-        <w:t>STATS.</w:t>
+        <w:t>Mardy.</w:t>
       </w:r>
       <w:r>
         <w:t xml:space="preserve"> And the honest summary of the limitations.</w:t>
@@ -3005,7 +3106,7 @@
         <w:rPr>
           <w:b/>
         </w:rPr>
-        <w:t>LEAD.</w:t>
+        <w:t>Alber.</w:t>
       </w:r>
       <w:r>
         <w:t xml:space="preserve"> Three. The data is synthetic, so the </w:t>
@@ -3154,7 +3255,7 @@
               <w:rPr>
                 <w:sz w:val="18"/>
               </w:rPr>
-              <w:t>DATA</w:t>
+              <w:t>Julebeth</w:t>
             </w:r>
           </w:p>
         </w:tc>
@@ -3233,7 +3334,7 @@
               <w:rPr>
                 <w:sz w:val="18"/>
               </w:rPr>
-              <w:t>DATA</w:t>
+              <w:t>Julebeth</w:t>
             </w:r>
           </w:p>
         </w:tc>
@@ -3298,7 +3399,7 @@
               <w:rPr>
                 <w:sz w:val="18"/>
               </w:rPr>
-              <w:t>DATA</w:t>
+              <w:t>Julebeth</w:t>
             </w:r>
           </w:p>
         </w:tc>
@@ -3377,7 +3478,7 @@
               <w:rPr>
                 <w:sz w:val="18"/>
               </w:rPr>
-              <w:t>DATA</w:t>
+              <w:t>Julebeth</w:t>
             </w:r>
           </w:p>
         </w:tc>
@@ -3470,7 +3571,7 @@
               <w:rPr>
                 <w:sz w:val="18"/>
               </w:rPr>
-              <w:t>DATA</w:t>
+              <w:t>Julebeth</w:t>
             </w:r>
           </w:p>
         </w:tc>
@@ -3535,7 +3636,7 @@
               <w:rPr>
                 <w:sz w:val="18"/>
               </w:rPr>
-              <w:t>STATS</w:t>
+              <w:t>Mardy</w:t>
             </w:r>
           </w:p>
         </w:tc>
@@ -3613,7 +3714,7 @@
               <w:rPr>
                 <w:sz w:val="18"/>
               </w:rPr>
-              <w:t>STATS</w:t>
+              <w:t>Mardy</w:t>
             </w:r>
           </w:p>
         </w:tc>
@@ -3678,7 +3779,7 @@
               <w:rPr>
                 <w:sz w:val="18"/>
               </w:rPr>
-              <w:t>STATS</w:t>
+              <w:t>Mardy</w:t>
             </w:r>
           </w:p>
         </w:tc>
@@ -3743,7 +3844,7 @@
               <w:rPr>
                 <w:sz w:val="18"/>
               </w:rPr>
-              <w:t>STATS</w:t>
+              <w:t>Mardy</w:t>
             </w:r>
           </w:p>
         </w:tc>
@@ -3808,7 +3909,7 @@
               <w:rPr>
                 <w:sz w:val="18"/>
               </w:rPr>
-              <w:t>STATS</w:t>
+              <w:t>Mardy</w:t>
             </w:r>
           </w:p>
         </w:tc>
@@ -3873,7 +3974,7 @@
               <w:rPr>
                 <w:sz w:val="18"/>
               </w:rPr>
-              <w:t>STATS</w:t>
+              <w:t>Mardy</w:t>
             </w:r>
           </w:p>
         </w:tc>
@@ -3938,7 +4039,7 @@
               <w:rPr>
                 <w:sz w:val="18"/>
               </w:rPr>
-              <w:t>DATA</w:t>
+              <w:t>Julebeth</w:t>
             </w:r>
           </w:p>
         </w:tc>
@@ -4003,7 +4104,7 @@
               <w:rPr>
                 <w:sz w:val="18"/>
               </w:rPr>
-              <w:t>LEAD</w:t>
+              <w:t>Alber</w:t>
             </w:r>
           </w:p>
         </w:tc>
@@ -4068,7 +4169,7 @@
               <w:rPr>
                 <w:sz w:val="18"/>
               </w:rPr>
-              <w:t>LEAD</w:t>
+              <w:t>Alber</w:t>
             </w:r>
           </w:p>
         </w:tc>

</xml_diff>

<commit_message>
Shift the load onto the leader and lighten the two member parts
Alber goes from about 5:30 to 10:30 and Julebeth and Mardy drop to roughly
6:30 each. Three things moved to him: the Checkpoint 2 workbook, which now
sits between the two checkpoints as a short bridge; the Checkpoint 1
correction, which the group is better served having the leader own; and all
the anticipated questions, previously split three ways and now one block
before the close, where they stand in for the live defense.

Five parts rather than four: Alber records 1, 3 and 5, Julebeth 2 and Mardy
4. Transitions rewritten around the new seams — Julebeth now ends on the
handover into Checkpoint 2, and Mardy ends on the monthly series turning up
the error Alber then describes.

Co-Authored-By: Claude Opus 5 <noreply@anthropic.com>
Claude-Session: https://claude.ai/code/session_01VZUVZ4Kh74tBbebjZDm9fE
</commit_message>
<xml_diff>
--- a/docs/Discussion_Script.docx
+++ b/docs/Discussion_Script.docx
@@ -281,7 +281,7 @@
               <w:rPr>
                 <w:sz w:val="18"/>
               </w:rPr>
-              <w:t>7:30</w:t>
+              <w:t>6:40</w:t>
             </w:r>
           </w:p>
         </w:tc>
@@ -325,7 +325,7 @@
               <w:rPr>
                 <w:sz w:val="18"/>
               </w:rPr>
-              <w:t>Mardy</w:t>
+              <w:t>Alber</w:t>
             </w:r>
           </w:p>
         </w:tc>
@@ -346,7 +346,7 @@
               <w:rPr>
                 <w:sz w:val="18"/>
               </w:rPr>
-              <w:t>Checkpoint 2 — the workbook, statistics, regression, the forecast, and the correction</w:t>
+              <w:t>The Checkpoint 2 workbook</w:t>
             </w:r>
           </w:p>
         </w:tc>
@@ -367,7 +367,7 @@
               <w:rPr>
                 <w:sz w:val="18"/>
               </w:rPr>
-              <w:t>10:00</w:t>
+              <w:t>1:30</w:t>
             </w:r>
           </w:p>
         </w:tc>
@@ -411,6 +411,92 @@
               <w:rPr>
                 <w:sz w:val="18"/>
               </w:rPr>
+              <w:t>Mardy</w:t>
+            </w:r>
+          </w:p>
+        </w:tc>
+        <w:tc>
+          <w:tcPr>
+            <w:tcW w:type="dxa" w:w="2340"/>
+          </w:tcPr>
+          <w:p>
+            <w:pPr>
+              <w:spacing w:line="240" w:lineRule="auto"/>
+            </w:pPr>
+            <w:r>
+              <w:rPr>
+                <w:sz w:val="18"/>
+              </w:rPr>
+            </w:r>
+            <w:r>
+              <w:rPr>
+                <w:sz w:val="18"/>
+              </w:rPr>
+              <w:t>Checkpoint 2 — descriptive statistics, correlation, regression, the trend and the forecast</w:t>
+            </w:r>
+          </w:p>
+        </w:tc>
+        <w:tc>
+          <w:tcPr>
+            <w:tcW w:type="dxa" w:w="2340"/>
+          </w:tcPr>
+          <w:p>
+            <w:pPr>
+              <w:spacing w:line="240" w:lineRule="auto"/>
+            </w:pPr>
+            <w:r>
+              <w:rPr>
+                <w:sz w:val="18"/>
+              </w:rPr>
+            </w:r>
+            <w:r>
+              <w:rPr>
+                <w:sz w:val="18"/>
+              </w:rPr>
+              <w:t>6:25</w:t>
+            </w:r>
+          </w:p>
+        </w:tc>
+      </w:tr>
+      <w:tr>
+        <w:tc>
+          <w:tcPr>
+            <w:tcW w:type="dxa" w:w="2340"/>
+          </w:tcPr>
+          <w:p>
+            <w:pPr>
+              <w:spacing w:line="240" w:lineRule="auto"/>
+            </w:pPr>
+            <w:r>
+              <w:rPr>
+                <w:sz w:val="18"/>
+              </w:rPr>
+            </w:r>
+            <w:r>
+              <w:rPr>
+                <w:sz w:val="18"/>
+              </w:rPr>
+              <w:t>5</w:t>
+            </w:r>
+          </w:p>
+        </w:tc>
+        <w:tc>
+          <w:tcPr>
+            <w:tcW w:type="dxa" w:w="2340"/>
+          </w:tcPr>
+          <w:p>
+            <w:pPr>
+              <w:spacing w:line="240" w:lineRule="auto"/>
+            </w:pPr>
+            <w:r>
+              <w:rPr>
+                <w:sz w:val="18"/>
+              </w:rPr>
+            </w:r>
+            <w:r>
+              <w:rPr>
+                <w:sz w:val="18"/>
+              </w:rPr>
               <w:t>Alber</w:t>
             </w:r>
           </w:p>
@@ -432,7 +518,7 @@
               <w:rPr>
                 <w:sz w:val="18"/>
               </w:rPr>
-              <w:t>What it means for the business, the limitations, and the close</w:t>
+              <w:t>The correction, what it means for the business, the questions, the close</w:t>
             </w:r>
           </w:p>
         </w:tc>
@@ -453,7 +539,7 @@
               <w:rPr>
                 <w:sz w:val="18"/>
               </w:rPr>
-              <w:t>2:30</w:t>
+              <w:t>6:00</w:t>
             </w:r>
           </w:p>
         </w:tc>
@@ -484,7 +570,30 @@
         <w:t>23 minutes</w:t>
       </w:r>
       <w:r>
-        <w:t xml:space="preserve"> assembled. If you were given a time limit shorter than that, the two places to cut are the descriptive statistics and the correlation in Part 3 — each survives as two sentences. Do not cut a whole task; the brief's tasks are what is being marked.</w:t>
+        <w:t xml:space="preserve"> assembled — about </w:t>
+      </w:r>
+      <w:r>
+        <w:rPr>
+          <w:b/>
+        </w:rPr>
+        <w:t>10:30</w:t>
+      </w:r>
+      <w:r>
+        <w:t xml:space="preserve"> of it Alber, and </w:t>
+      </w:r>
+      <w:r>
+        <w:rPr>
+          <w:b/>
+        </w:rPr>
+        <w:t>6:30</w:t>
+      </w:r>
+      <w:r>
+        <w:t xml:space="preserve"> each for Julebeth and Mardy. Alber records three separate files; Julebeth and Mardy record one each.</w:t>
+      </w:r>
+    </w:p>
+    <w:p>
+      <w:r>
+        <w:t>If you were given a time limit shorter than that, the two places to cut are the descriptive statistics and the correlation in Part 4 — each survives as two sentences. Do not cut a whole task; the brief's tasks are what is being marked.</w:t>
       </w:r>
     </w:p>
     <w:p>
@@ -577,10 +686,10 @@
         <w:rPr>
           <w:b/>
         </w:rPr>
-        <w:t>Say your name once, at the very start of your part.</w:t>
-      </w:r>
-      <w:r>
-        <w:t xml:space="preserve"> Just the name — your instructor is matching a voice to a name for a mark under Section 1.4, and the video may not show your face. Then go straight into the material.</w:t>
+        <w:t>Say your name once, at the start of your first part.</w:t>
+      </w:r>
+      <w:r>
+        <w:t xml:space="preserve"> Just the name — your instructor is matching a voice to a name for a mark under Section 1.4, and the video may not show your face. Alber records three parts and only needs to do this in Part 1; the later two just continue.</w:t>
       </w:r>
     </w:p>
     <w:p>
@@ -686,7 +795,7 @@
     </w:p>
     <w:p>
       <w:r>
-        <w:t>Join the four parts in order: 1, 2, 3, 4. There is nothing to interleave.</w:t>
+        <w:t>Join the five parts in order: 1, 2, 3, 4, 5. There is nothing to interleave.</w:t>
       </w:r>
     </w:p>
     <w:p>
@@ -719,7 +828,7 @@
         <w:t>Keep the transitions.</w:t>
       </w:r>
       <w:r>
-        <w:t xml:space="preserve"> The last line of each part sets up the next one. Cut the dead air and the stumbles; leave those lines alone, because they are what makes four recordings sound like one explanation.</w:t>
+        <w:t xml:space="preserve"> The last line of each part sets up the next one. Cut the dead air and the stumbles; leave those lines alone, because they are what makes five recordings sound like one explanation.</w:t>
       </w:r>
     </w:p>
     <w:p>
@@ -1234,7 +1343,7 @@
               <w:rPr>
                 <w:sz w:val="18"/>
               </w:rPr>
-              <w:t>3</w:t>
+              <w:t>4</w:t>
             </w:r>
           </w:p>
         </w:tc>
@@ -1299,7 +1408,7 @@
               <w:rPr>
                 <w:sz w:val="18"/>
               </w:rPr>
-              <w:t>3</w:t>
+              <w:t>4</w:t>
             </w:r>
           </w:p>
         </w:tc>
@@ -1364,7 +1473,7 @@
               <w:rPr>
                 <w:sz w:val="18"/>
               </w:rPr>
-              <w:t>3</w:t>
+              <w:t>4</w:t>
             </w:r>
           </w:p>
         </w:tc>
@@ -1429,7 +1538,7 @@
               <w:rPr>
                 <w:sz w:val="18"/>
               </w:rPr>
-              <w:t>3</w:t>
+              <w:t>4</w:t>
             </w:r>
           </w:p>
         </w:tc>
@@ -1494,7 +1603,7 @@
               <w:rPr>
                 <w:sz w:val="18"/>
               </w:rPr>
-              <w:t>3</w:t>
+              <w:t>5</w:t>
             </w:r>
           </w:p>
         </w:tc>
@@ -1559,7 +1668,7 @@
               <w:rPr>
                 <w:sz w:val="18"/>
               </w:rPr>
-              <w:t>4</w:t>
+              <w:t>5</w:t>
             </w:r>
           </w:p>
         </w:tc>
@@ -1624,7 +1733,7 @@
               <w:rPr>
                 <w:sz w:val="18"/>
               </w:rPr>
-              <w:t>4</w:t>
+              <w:t>5</w:t>
             </w:r>
           </w:p>
         </w:tc>
@@ -2225,7 +2334,7 @@
         <w:rPr>
           <w:i/>
         </w:rPr>
-        <w:t>About 7.5 minutes. Record straight through — the three sections below run on from each other, so treat them as one talk with three topics.</w:t>
+        <w:t>About 6.5 minutes. Record straight through — the three sections below run on from each other, so treat them as one talk with three topics.</w:t>
       </w:r>
     </w:p>
     <w:p>
@@ -3057,70 +3166,6 @@
       </w:r>
     </w:p>
     <w:p>
-      <w:pPr>
-        <w:pStyle w:val="Heading2"/>
-      </w:pPr>
-      <w:r>
-        <w:t>Questions worth answering here</w:t>
-      </w:r>
-    </w:p>
-    <w:p>
-      <w:r>
-        <w:t>Still speaking continuously, close your part by raising three questions this work invites and answering them:</w:t>
-      </w:r>
-    </w:p>
-    <w:p>
-      <w:r>
-        <w:rPr>
-          <w:b/>
-        </w:rPr>
-        <w:t>Does a fake dataset invalidate the project?</w:t>
-      </w:r>
-      <w:r>
-        <w:t xml:space="preserve"> It invalidates the </w:t>
-      </w:r>
-      <w:r>
-        <w:rPr>
-          <w:i/>
-        </w:rPr>
-        <w:t>figures</w:t>
-      </w:r>
-      <w:r>
-        <w:t xml:space="preserve">, not the </w:t>
-      </w:r>
-      <w:r>
-        <w:rPr>
-          <w:i/>
-        </w:rPr>
-        <w:t>method</w:t>
-      </w:r>
-      <w:r>
-        <w:t>. It was proved with five signals and no corrections were fabricated, which would have been worse. The schema, the queries and the analysis would run identically on real data.</w:t>
-      </w:r>
-    </w:p>
-    <w:p>
-      <w:r>
-        <w:rPr>
-          <w:b/>
-        </w:rPr>
-        <w:t>Why not use `Order ID` as the primary key?</w:t>
-      </w:r>
-      <w:r>
-        <w:t xml:space="preserve"> 1,194 rows, 547 distinct IDs, and the repeats span different dates and different customers. It identifies neither a row nor an order.</w:t>
-      </w:r>
-    </w:p>
-    <w:p>
-      <w:r>
-        <w:rPr>
-          <w:b/>
-        </w:rPr>
-        <w:t>Why exclude 2025, and why show 2020 per month?</w:t>
-      </w:r>
-      <w:r>
-        <w:t xml:space="preserve"> Both ends of the file are partial. Including them whole would show fake growth at one end and a fake collapse at the other.</w:t>
-      </w:r>
-    </w:p>
-    <w:p>
       <w:r>
         <w:rPr>
           <w:b/>
@@ -3141,7 +3186,7 @@
         <w:pStyle w:val="Heading1"/>
       </w:pPr>
       <w:r>
-        <w:t>Part 3 — Mardy</w:t>
+        <w:t>Part 3 — Alber</w:t>
       </w:r>
     </w:p>
     <w:p>
@@ -3149,7 +3194,7 @@
         <w:rPr>
           <w:i/>
         </w:rPr>
-        <w:t>About 10 minutes. Record straight through — six topics, one continuous talk. This is the longest part, so if you need a breath between sections, pause rather than restarting.</w:t>
+        <w:t>About 1.5 minutes. A short bridge between the two checkpoints — no need to say your name again.</w:t>
       </w:r>
     </w:p>
     <w:p>
@@ -3170,7 +3215,7 @@
     </w:p>
     <w:p>
       <w:r>
-        <w:t>Say your name, then pick the thread up: Checkpoint 2 uses the same dataset — the brief requires it — taken out of the database and into Excel.</w:t>
+        <w:t>Pick the thread up: the first thing Checkpoint 2 needed was the workbook itself, built on the same dataset the brief requires.</w:t>
       </w:r>
     </w:p>
     <w:p>
@@ -3278,6 +3323,38 @@
       </w:r>
     </w:p>
     <w:p>
+      <w:r>
+        <w:rPr>
+          <w:b/>
+        </w:rPr>
+        <w:t>End the part on this line:</w:t>
+      </w:r>
+      <w:r>
+        <w:t xml:space="preserve"> with the data laid out that way and checked, the statistics could be run on it.</w:t>
+      </w:r>
+    </w:p>
+    <w:p>
+      <w:r>
+        <w:br w:type="page"/>
+      </w:r>
+    </w:p>
+    <w:p>
+      <w:pPr>
+        <w:pStyle w:val="Heading1"/>
+      </w:pPr>
+      <w:r>
+        <w:t>Part 4 — Mardy</w:t>
+      </w:r>
+    </w:p>
+    <w:p>
+      <w:r>
+        <w:rPr>
+          <w:i/>
+        </w:rPr>
+        <w:t>About 6.5 minutes. Record straight through — four topics, one continuous talk.</w:t>
+      </w:r>
+    </w:p>
+    <w:p>
       <w:pPr>
         <w:pStyle w:val="Heading2"/>
       </w:pPr>
@@ -3291,6 +3368,11 @@
           <w:i/>
         </w:rPr>
         <w:t>Task 2.2 · on screen: the Amount histogram</w:t>
+      </w:r>
+    </w:p>
+    <w:p>
+      <w:r>
+        <w:t>Say your name, then pick the thread up: the first thing asked of that data was what it looks like.</w:t>
       </w:r>
     </w:p>
     <w:p>
@@ -3857,6 +3939,38 @@
       </w:r>
       <w:r>
         <w:t xml:space="preserve"> Because switching on the strength of two observations is overfitting the holdout — you would be choosing the model that happened to win on a two-month sample, which is not evidence. The result is reported, the method is kept, and the forecast's reliability over this horizon is stated plainly as weak. The reliability discussion the brief asks for is not a formality here: the error was measured, and it is 22.7%</w:t>
+      </w:r>
+    </w:p>
+    <w:p>
+      <w:r>
+        <w:rPr>
+          <w:b/>
+        </w:rPr>
+        <w:t>End the part on this line:</w:t>
+      </w:r>
+      <w:r>
+        <w:t xml:space="preserve"> building that monthly series also turned up something nobody expected — and it was a mistake of our own.</w:t>
+      </w:r>
+    </w:p>
+    <w:p>
+      <w:r>
+        <w:br w:type="page"/>
+      </w:r>
+    </w:p>
+    <w:p>
+      <w:pPr>
+        <w:pStyle w:val="Heading1"/>
+      </w:pPr>
+      <w:r>
+        <w:t>Part 5 — Alber</w:t>
+      </w:r>
+    </w:p>
+    <w:p>
+      <w:r>
+        <w:rPr>
+          <w:i/>
+        </w:rPr>
+        <w:t>About 6 minutes. Record straight through — no need to say your name again.</w:t>
       </w:r>
     </w:p>
     <w:p>
@@ -4160,77 +4274,71 @@
         <w:pStyle w:val="Heading2"/>
       </w:pPr>
       <w:r>
-        <w:t>Questions worth answering here</w:t>
+        <w:t>What it means for the business</w:t>
       </w:r>
     </w:p>
     <w:p>
       <w:r>
-        <w:t>Still speaking continuously, close your part by raising three questions and answering them:</w:t>
+        <w:rPr>
+          <w:i/>
+        </w:rPr>
+        <w:t>On screen: the findings summary</w:t>
       </w:r>
     </w:p>
     <w:p>
+      <w:r>
+        <w:t>With that correction made, here is what the analysis actually tells the business. Three recommendations, each tied to a measurement rather than an opinion:</w:t>
+      </w:r>
+    </w:p>
+    <w:p>
+      <w:pPr>
+        <w:pStyle w:val="ListBullet"/>
+      </w:pPr>
       <w:r>
         <w:rPr>
           <w:b/>
         </w:rPr>
-        <w:t>Is R² = 0.85 good?</w:t>
-      </w:r>
-      <w:r>
-        <w:t xml:space="preserve"> For cross-sectional business data, yes — but R² alone is not the test. The p-value of 1.98 × 10⁻²⁴ is what says the slope is not zero.</w:t>
+        <w:t>Track order count, not revenue.</w:t>
+      </w:r>
+      <w:r>
+        <w:t xml:space="preserve"> Revenue is the lagging indicator; order count is what drives it, r = 0.923, and it is the thing the business can act on</w:t>
       </w:r>
     </w:p>
     <w:p>
+      <w:pPr>
+        <w:pStyle w:val="ListBullet"/>
+      </w:pPr>
       <w:r>
         <w:rPr>
           <w:b/>
         </w:rPr>
-        <w:t>The trend test found nothing — doesn't that sink a *trend* project?</w:t>
-      </w:r>
-      <w:r>
-        <w:t xml:space="preserve"> It found that no single line fits both regimes, which is itself the finding. The trend is real, it is just piecewise, and Figure 2 shows it.</w:t>
+        <w:t>Plan seasonality by category, not company-wide.</w:t>
+      </w:r>
+      <w:r>
+        <w:t xml:space="preserve"> The blended curve is wrong for all three categories — Electronics peaks in Q2, Furniture and Office Supplies in Q4. A single planning curve over-stocks Electronics in Q4 and under-stocks it in Q2</w:t>
       </w:r>
     </w:p>
     <w:p>
+      <w:pPr>
+        <w:pStyle w:val="ListBullet"/>
+      </w:pPr>
       <w:r>
         <w:rPr>
           <w:b/>
         </w:rPr>
-        <w:t>The forecast lost to a flat average — why keep it?</w:t>
-      </w:r>
-      <w:r>
-        <w:t xml:space="preserve"> Choosing a method on two observations is overfitting the holdout. The loss is reported and the reliability stated honestly.</w:t>
-      </w:r>
-    </w:p>
-    <w:p>
+        <w:t>Investigate Printers first.</w:t>
+      </w:r>
+      <w:r>
+        <w:t xml:space="preserve"> One sub-category, </w:t>
+      </w:r>
       <w:r>
         <w:rPr>
           <w:b/>
         </w:rPr>
-        <w:t>End the part on this line:</w:t>
-      </w:r>
-      <w:r>
-        <w:t xml:space="preserve"> that is what the analysis found — what remains is what it means for the business.</w:t>
-      </w:r>
-    </w:p>
-    <w:p>
-      <w:r>
-        <w:br w:type="page"/>
-      </w:r>
-    </w:p>
-    <w:p>
-      <w:pPr>
-        <w:pStyle w:val="Heading1"/>
-      </w:pPr>
-      <w:r>
-        <w:t>Part 4 — Alber</w:t>
-      </w:r>
-    </w:p>
-    <w:p>
-      <w:r>
-        <w:rPr>
-          <w:i/>
-        </w:rPr>
-        <w:t>About 2.5 minutes. Record straight through.</w:t>
+        <w:t>136,865</w:t>
+      </w:r>
+      <w:r>
+        <w:t xml:space="preserve"> lost, over half the entire gap. Whether that is supply, competition, or a category in structural decline is not something this dataset can answer — but it tells us where to look, and that is what the analysis was for</w:t>
       </w:r>
     </w:p>
     <w:p>
@@ -4238,20 +4346,12 @@
         <w:pStyle w:val="Heading2"/>
       </w:pPr>
       <w:r>
-        <w:t>What it means for the business</w:t>
+        <w:t>The limitations</w:t>
       </w:r>
     </w:p>
     <w:p>
       <w:r>
-        <w:rPr>
-          <w:i/>
-        </w:rPr>
-        <w:t>On screen: the findings summary</w:t>
-      </w:r>
-    </w:p>
-    <w:p>
-      <w:r>
-        <w:t>Pick the thread up — with the correction made, here is what the analysis actually tells the business. Three recommendations, each tied to a measurement rather than an opinion:</w:t>
+        <w:t>Three, stated plainly and in your own voice:</w:t>
       </w:r>
     </w:p>
     <w:p>
@@ -4262,10 +4362,10 @@
         <w:rPr>
           <w:b/>
         </w:rPr>
-        <w:t>Track order count, not revenue.</w:t>
-      </w:r>
-      <w:r>
-        <w:t xml:space="preserve"> Revenue is the lagging indicator; order count is what drives it, r = 0.923, and it is the thing the business can act on</w:t>
+        <w:t>The data is synthetic.</w:t>
+      </w:r>
+      <w:r>
+        <w:t xml:space="preserve"> The figures illustrate the method rather than describe a real company. It was proved, it was stated, and no corrections were invented, because that would have been worse</w:t>
       </w:r>
     </w:p>
     <w:p>
@@ -4276,10 +4376,10 @@
         <w:rPr>
           <w:b/>
         </w:rPr>
-        <w:t>Plan seasonality by category, not company-wide.</w:t>
-      </w:r>
-      <w:r>
-        <w:t xml:space="preserve"> The blended curve is wrong for all three categories — Electronics peaks in Q2, Furniture and Office Supplies in Q4. A single planning curve over-stocks Electronics in Q4 and under-stocks it in Q2</w:t>
+        <w:t>The forecast is weak.</w:t>
+      </w:r>
+      <w:r>
+        <w:t xml:space="preserve"> 22.7% mean absolute error against a flat average's 14.9%. Our own error was measured and reported rather than the test quietly dropped</w:t>
       </w:r>
     </w:p>
     <w:p>
@@ -4290,19 +4390,24 @@
         <w:rPr>
           <w:b/>
         </w:rPr>
-        <w:t>Investigate Printers first.</w:t>
-      </w:r>
-      <w:r>
-        <w:t xml:space="preserve"> One sub-category, </w:t>
+        <w:t>Correlation is not causation.</w:t>
+      </w:r>
+      <w:r>
+        <w:t xml:space="preserve"> Order count and revenue move together; that is not proof that one causes the other</w:t>
+      </w:r>
+    </w:p>
+    <w:p>
+      <w:r>
+        <w:t xml:space="preserve">Then what the group </w:t>
       </w:r>
       <w:r>
         <w:rPr>
-          <w:b/>
+          <w:i/>
         </w:rPr>
-        <w:t>136,865</w:t>
-      </w:r>
-      <w:r>
-        <w:t xml:space="preserve"> lost, over half the entire gap. Whether that is supply, competition, or a category in structural decline is not something this dataset can answer — but it tells us where to look, and that is what the analysis was for</w:t>
+        <w:t>would</w:t>
+      </w:r>
+      <w:r>
+        <w:t xml:space="preserve"> stand behind: the method. A defect-documented dataset, a normalised schema with enforced constraints, queries verified on two database engines, and statistics tested for significance rather than eyeballed — with the negative results reported alongside the positive ones.</w:t>
       </w:r>
     </w:p>
     <w:p>
@@ -4310,12 +4415,152 @@
         <w:pStyle w:val="Heading2"/>
       </w:pPr>
       <w:r>
-        <w:t>The limitations</w:t>
+        <w:t>The questions we would expect</w:t>
       </w:r>
     </w:p>
     <w:p>
       <w:r>
-        <w:t>Three, stated plainly and in your own voice:</w:t>
+        <w:t>Still speaking continuously, raise these and answer them in your own words. This is the part that stands in for a live defense, so take it slowly.</w:t>
+      </w:r>
+    </w:p>
+    <w:p>
+      <w:r>
+        <w:rPr>
+          <w:b/>
+        </w:rPr>
+        <w:t>Does a fake dataset invalidate the project?</w:t>
+      </w:r>
+      <w:r>
+        <w:t xml:space="preserve"> It invalidates the </w:t>
+      </w:r>
+      <w:r>
+        <w:rPr>
+          <w:i/>
+        </w:rPr>
+        <w:t>figures</w:t>
+      </w:r>
+      <w:r>
+        <w:t xml:space="preserve">, not the </w:t>
+      </w:r>
+      <w:r>
+        <w:rPr>
+          <w:i/>
+        </w:rPr>
+        <w:t>method</w:t>
+      </w:r>
+      <w:r>
+        <w:t>. It was proved with five signals and no corrections were fabricated, which would have been worse. The schema, the queries and the analysis would run identically on real data.</w:t>
+      </w:r>
+    </w:p>
+    <w:p>
+      <w:r>
+        <w:rPr>
+          <w:b/>
+        </w:rPr>
+        <w:t>Why not use `Order ID` as the primary key?</w:t>
+      </w:r>
+      <w:r>
+        <w:t xml:space="preserve"> 1,194 rows, 547 distinct IDs, and the repeats span different dates and different customers. It identifies neither a row nor an order.</w:t>
+      </w:r>
+    </w:p>
+    <w:p>
+      <w:r>
+        <w:rPr>
+          <w:b/>
+        </w:rPr>
+        <w:t>Why exclude 2025, and why show 2020 per month?</w:t>
+      </w:r>
+      <w:r>
+        <w:t xml:space="preserve"> Both ends of the file are partial. Including them whole would show fake growth at one end and a fake collapse at the other — which is exactly the mistake we made and corrected.</w:t>
+      </w:r>
+    </w:p>
+    <w:p>
+      <w:r>
+        <w:rPr>
+          <w:b/>
+        </w:rPr>
+        <w:t>Is R² = 0.85 good?</w:t>
+      </w:r>
+      <w:r>
+        <w:t xml:space="preserve"> For cross-sectional business data, yes — but R² alone is not the test. The p-value of 1.98 × 10⁻²⁴ is what says the slope is not zero.</w:t>
+      </w:r>
+    </w:p>
+    <w:p>
+      <w:r>
+        <w:rPr>
+          <w:b/>
+        </w:rPr>
+        <w:t>The trend test found nothing — doesn't that sink a *trend* project?</w:t>
+      </w:r>
+      <w:r>
+        <w:t xml:space="preserve"> It found that no single line fits both regimes, which is itself the finding. The trend is real, it is just piecewise, and Figure 2 shows it.</w:t>
+      </w:r>
+    </w:p>
+    <w:p>
+      <w:r>
+        <w:rPr>
+          <w:b/>
+        </w:rPr>
+        <w:t>The forecast lost to a flat average — why keep it?</w:t>
+      </w:r>
+      <w:r>
+        <w:t xml:space="preserve"> Choosing a method on two observations is overfitting the holdout. The loss is reported and the reliability stated honestly.</w:t>
+      </w:r>
+    </w:p>
+    <w:p>
+      <w:r>
+        <w:rPr>
+          <w:b/>
+        </w:rPr>
+        <w:t>What would you do differently?</w:t>
+      </w:r>
+      <w:r>
+        <w:t xml:space="preserve"> Validate the source before building on it, and check the completeness of both ends of the date range first — that is exactly what caused the one real error, and it would have cost ten minutes to catch at the start.</w:t>
+      </w:r>
+    </w:p>
+    <w:p>
+      <w:r>
+        <w:rPr>
+          <w:b/>
+        </w:rPr>
+        <w:t>What is next?</w:t>
+      </w:r>
+      <w:r>
+        <w:t xml:space="preserve"> Checkpoint 3, the dashboard, built on </w:t>
+      </w:r>
+      <w:r>
+        <w:rPr>
+          <w:b/>
+        </w:rPr>
+        <w:t>order count</w:t>
+      </w:r>
+      <w:r>
+        <w:t xml:space="preserve"> as the primary KPI rather than revenue because it is the leading indicator and the actionable one, and segmented on </w:t>
+      </w:r>
+      <w:r>
+        <w:rPr>
+          <w:b/>
+        </w:rPr>
+        <w:t>margin</w:t>
+      </w:r>
+      <w:r>
+        <w:t xml:space="preserve"> rather than revenue, given how weakly those two turned out to be related.</w:t>
+      </w:r>
+    </w:p>
+    <w:p>
+      <w:pPr>
+        <w:pStyle w:val="Heading2"/>
+      </w:pPr>
+      <w:r>
+        <w:t>Close</w:t>
+      </w:r>
+    </w:p>
+    <w:p>
+      <w:r>
+        <w:rPr>
+          <w:i/>
+        </w:rPr>
+        <w:t>On screen: the cover page again, or the team slide</w:t>
       </w:r>
     </w:p>
     <w:p>
@@ -4323,13 +4568,7 @@
         <w:pStyle w:val="ListBullet"/>
       </w:pPr>
       <w:r>
-        <w:rPr>
-          <w:b/>
-        </w:rPr>
-        <w:t>The data is synthetic.</w:t>
-      </w:r>
-      <w:r>
-        <w:t xml:space="preserve"> The figures illustrate the method rather than describe a real company. It was proved, it was stated, and no corrections were invented, because that would have been worse</w:t>
+        <w:t>One sentence on what the project found: growth stopped in 2022, it was driven by a small number of sub-categories rather than a general slowdown, and order count is the measurable driver</w:t>
       </w:r>
     </w:p>
     <w:p>
@@ -4337,13 +4576,25 @@
         <w:pStyle w:val="ListBullet"/>
       </w:pPr>
       <w:r>
-        <w:rPr>
-          <w:b/>
-        </w:rPr>
-        <w:t>The forecast is weak.</w:t>
-      </w:r>
-      <w:r>
-        <w:t xml:space="preserve"> 22.7% mean absolute error against a flat average's 14.9%. Our own error was measured and reported rather than the test quietly dropped</w:t>
+        <w:t>Thank the instructor, name the three of you, and state that any member can answer questions on any part of the project — which is what Section 1.4 asks for, and which is true if you have rehearsed</w:t>
+      </w:r>
+    </w:p>
+    <w:p>
+      <w:r>
+        <w:br w:type="page"/>
+      </w:r>
+    </w:p>
+    <w:p>
+      <w:pPr>
+        <w:pStyle w:val="Heading2"/>
+      </w:pPr>
+      <w:r>
+        <w:t>Checklist</w:t>
+      </w:r>
+    </w:p>
+    <w:p>
+      <w:r>
+        <w:t>Each of you, before you record:</w:t>
       </w:r>
     </w:p>
     <w:p>
@@ -4351,43 +4602,7 @@
         <w:pStyle w:val="ListBullet"/>
       </w:pPr>
       <w:r>
-        <w:rPr>
-          <w:b/>
-        </w:rPr>
-        <w:t>Correlation is not causation.</w:t>
-      </w:r>
-      <w:r>
-        <w:t xml:space="preserve"> Order count and revenue move together; that is not proof that one causes the other</w:t>
-      </w:r>
-    </w:p>
-    <w:p>
-      <w:r>
-        <w:t xml:space="preserve">Then what the group </w:t>
-      </w:r>
-      <w:r>
-        <w:rPr>
-          <w:i/>
-        </w:rPr>
-        <w:t>would</w:t>
-      </w:r>
-      <w:r>
-        <w:t xml:space="preserve"> stand behind: the method. A defect-documented dataset, a normalised schema with enforced constraints, queries verified on two database engines, and statistics tested for significance rather than eyeballed — with the negative results reported alongside the positive ones.</w:t>
-      </w:r>
-    </w:p>
-    <w:p>
-      <w:pPr>
-        <w:pStyle w:val="Heading2"/>
-      </w:pPr>
-      <w:r>
-        <w:t>Close</w:t>
-      </w:r>
-    </w:p>
-    <w:p>
-      <w:r>
-        <w:rPr>
-          <w:i/>
-        </w:rPr>
-        <w:t>On screen: the cover page again, or the team slide</w:t>
+        <w:t>Every number you say out loud, you can point to — a query, a figure, or a cell</w:t>
       </w:r>
     </w:p>
     <w:p>
@@ -4395,43 +4610,7 @@
         <w:pStyle w:val="ListBullet"/>
       </w:pPr>
       <w:r>
-        <w:t xml:space="preserve">Two questions worth answering before you finish. </w:t>
-      </w:r>
-      <w:r>
-        <w:rPr>
-          <w:i/>
-        </w:rPr>
-        <w:t>What would you do differently?</w:t>
-      </w:r>
-      <w:r>
-        <w:t xml:space="preserve"> Validate the source before building on it, and check the completeness of both ends of the date range first — that is exactly what caused the one real error, and it would have cost ten minutes to catch at the start. </w:t>
-      </w:r>
-      <w:r>
-        <w:rPr>
-          <w:i/>
-        </w:rPr>
-        <w:t>What is next?</w:t>
-      </w:r>
-      <w:r>
-        <w:t xml:space="preserve"> Checkpoint 3, the dashboard, built on </w:t>
-      </w:r>
-      <w:r>
-        <w:rPr>
-          <w:b/>
-        </w:rPr>
-        <w:t>order count</w:t>
-      </w:r>
-      <w:r>
-        <w:t xml:space="preserve"> as the primary KPI rather than revenue because it is the leading indicator and the actionable one, and segmented on </w:t>
-      </w:r>
-      <w:r>
-        <w:rPr>
-          <w:b/>
-        </w:rPr>
-        <w:t>margin</w:t>
-      </w:r>
-      <w:r>
-        <w:t xml:space="preserve"> rather than revenue, given how weakly those two turned out to be related</w:t>
+        <w:t>You can say your section's beats with the script closed</w:t>
       </w:r>
     </w:p>
     <w:p>
@@ -4439,7 +4618,7 @@
         <w:pStyle w:val="ListBullet"/>
       </w:pPr>
       <w:r>
-        <w:t>One sentence on what the project found: growth stopped in 2022, it was driven by a small number of sub-categories rather than a general slowdown, and order count is the measurable driver</w:t>
+        <w:t>You can answer a question about someone else's part, because Section 1.4 does not care who recorded which section</w:t>
       </w:r>
     </w:p>
     <w:p>
@@ -4447,25 +4626,7 @@
         <w:pStyle w:val="ListBullet"/>
       </w:pPr>
       <w:r>
-        <w:t>Thank the instructor, name the three of you, and state that any member can answer questions on any part of the project — which is what Section 1.4 asks for, and which is true if you have rehearsed</w:t>
-      </w:r>
-    </w:p>
-    <w:p>
-      <w:r>
-        <w:br w:type="page"/>
-      </w:r>
-    </w:p>
-    <w:p>
-      <w:pPr>
-        <w:pStyle w:val="Heading2"/>
-      </w:pPr>
-      <w:r>
-        <w:t>Checklist</w:t>
-      </w:r>
-    </w:p>
-    <w:p>
-      <w:r>
-        <w:t>Each of you, before you record:</w:t>
+        <w:t>Your exhibits are open and on the right screen before you press record</w:t>
       </w:r>
     </w:p>
     <w:p>
@@ -4473,7 +4634,12 @@
         <w:pStyle w:val="ListBullet"/>
       </w:pPr>
       <w:r>
-        <w:t>Every number you say out loud, you can point to — a query, a figure, or a cell</w:t>
+        <w:t>You have done the thirty-second test</w:t>
+      </w:r>
+    </w:p>
+    <w:p>
+      <w:r>
+        <w:t>Alber, before you submit:</w:t>
       </w:r>
     </w:p>
     <w:p>
@@ -4481,44 +4647,7 @@
         <w:pStyle w:val="ListBullet"/>
       </w:pPr>
       <w:r>
-        <w:t>You can say your section's beats with the script closed</w:t>
-      </w:r>
-    </w:p>
-    <w:p>
-      <w:pPr>
-        <w:pStyle w:val="ListBullet"/>
-      </w:pPr>
-      <w:r>
-        <w:t>You can answer a question about someone else's part, because Section 1.4 does not care who recorded which section</w:t>
-      </w:r>
-    </w:p>
-    <w:p>
-      <w:pPr>
-        <w:pStyle w:val="ListBullet"/>
-      </w:pPr>
-      <w:r>
-        <w:t>Your exhibits are open and on the right screen before you press record</w:t>
-      </w:r>
-    </w:p>
-    <w:p>
-      <w:pPr>
-        <w:pStyle w:val="ListBullet"/>
-      </w:pPr>
-      <w:r>
-        <w:t>You have done the thirty-second test</w:t>
-      </w:r>
-    </w:p>
-    <w:p>
-      <w:r>
-        <w:t>Alber, before you submit:</w:t>
-      </w:r>
-    </w:p>
-    <w:p>
-      <w:pPr>
-        <w:pStyle w:val="ListBullet"/>
-      </w:pPr>
-      <w:r>
-        <w:t>All four parts present and in order, no task missing</w:t>
+        <w:t>All five parts present and in order, no task missing</w:t>
       </w:r>
     </w:p>
     <w:p>

</xml_diff>

<commit_message>
Drop the self-introductions so the recording is only about the project
Nobody says their name, introduces themselves, or refers to who did what.
Every part now opens on the material: the raw export, the workbook, the
descriptive statistics. The close thanks the instructor and ends on the work
rather than on the group.

Section 1.4 still needs a voice mapped to a name, so the title card at the
head of each part becomes mandatory and carries the speaker's name — the
identification moves from the audio to the edit.

Co-Authored-By: Claude Opus 5 <noreply@anthropic.com>
Claude-Session: https://claude.ai/code/session_01VZUVZ4Kh74tBbebjZDm9fE
</commit_message>
<xml_diff>
--- a/docs/Discussion_Script.docx
+++ b/docs/Discussion_Script.docx
@@ -686,10 +686,10 @@
         <w:rPr>
           <w:b/>
         </w:rPr>
-        <w:t>Say your name once, at the start of your first part.</w:t>
-      </w:r>
-      <w:r>
-        <w:t xml:space="preserve"> Just the name — your instructor is matching a voice to a name for a mark under Section 1.4, and the video may not show your face. Alber records three parts and only needs to do this in Part 1; the later two just continue.</w:t>
+        <w:t>Do not introduce yourself, and do not say who did what.</w:t>
+      </w:r>
+      <w:r>
+        <w:t xml:space="preserve"> The recording is about the project, not about the group. Open every part on the material itself. Your instructor still needs to know whose voice is whose for Section 1.4 — the title card at the head of each part carries the name, so nothing is lost by not saying it.</w:t>
       </w:r>
     </w:p>
     <w:p>
@@ -814,10 +814,10 @@
         <w:rPr>
           <w:b/>
         </w:rPr>
-        <w:t>Put a title card between parts</w:t>
-      </w:r>
-      <w:r>
-        <w:t xml:space="preserve"> — a plain slide with the part number, the topic and the speaker's name, held for two seconds. It hides the seam, it tells the instructor who is talking, and it doubles as your figure numbering.</w:t>
+        <w:t>Put a title card at the head of every part</w:t>
+      </w:r>
+      <w:r>
+        <w:t xml:space="preserve"> — a plain slide with the part number, the topic and the speaker's name, held for two seconds. This one is not optional: since nobody introduces themselves on camera, the card is how your instructor knows whose voice is whose for Section 1.4. It also hides the seam and doubles as your figure numbering.</w:t>
       </w:r>
     </w:p>
     <w:p>
@@ -1834,7 +1834,7 @@
     </w:p>
     <w:p>
       <w:r>
-        <w:t>Say your name, then:</w:t>
+        <w:t>Open on the project, not on yourselves:</w:t>
       </w:r>
     </w:p>
     <w:p>
@@ -2355,7 +2355,7 @@
     </w:p>
     <w:p>
       <w:r>
-        <w:t>Say your name, then pick the thread up: here is the raw file, and here is what was wrong with it.</w:t>
+        <w:t>Pick the thread up on the file itself: here is the raw export, and here is what was wrong with it.</w:t>
       </w:r>
     </w:p>
     <w:p>
@@ -3194,7 +3194,7 @@
         <w:rPr>
           <w:i/>
         </w:rPr>
-        <w:t>About 1.5 minutes. A short bridge between the two checkpoints — no need to say your name again.</w:t>
+        <w:t>About 1.5 minutes. A short bridge between the two checkpoints.</w:t>
       </w:r>
     </w:p>
     <w:p>
@@ -3372,7 +3372,7 @@
     </w:p>
     <w:p>
       <w:r>
-        <w:t>Say your name, then pick the thread up: the first thing asked of that data was what it looks like.</w:t>
+        <w:t>Pick the thread up: the first thing asked of that data was what it looks like.</w:t>
       </w:r>
     </w:p>
     <w:p>
@@ -3970,7 +3970,7 @@
         <w:rPr>
           <w:i/>
         </w:rPr>
-        <w:t>About 6 minutes. Record straight through — no need to say your name again.</w:t>
+        <w:t>About 6 minutes. Record straight through.</w:t>
       </w:r>
     </w:p>
     <w:p>
@@ -4576,7 +4576,7 @@
         <w:pStyle w:val="ListBullet"/>
       </w:pPr>
       <w:r>
-        <w:t>Thank the instructor, name the three of you, and state that any member can answer questions on any part of the project — which is what Section 1.4 asks for, and which is true if you have rehearsed</w:t>
+        <w:t>Thank the instructor, and close on the project rather than on the group — the work is what is being marked</w:t>
       </w:r>
     </w:p>
     <w:p>
@@ -4618,7 +4618,7 @@
         <w:pStyle w:val="ListBullet"/>
       </w:pPr>
       <w:r>
-        <w:t>You can answer a question about someone else's part, because Section 1.4 does not care who recorded which section</w:t>
+        <w:t>You can answer a question about any section, not only the one you recorded — Section 1.4 lets the instructor ask any member about any part</w:t>
       </w:r>
     </w:p>
     <w:p>
@@ -4663,7 +4663,7 @@
         <w:pStyle w:val="ListBullet"/>
       </w:pPr>
       <w:r>
-        <w:t>Each speaker names themselves once</w:t>
+        <w:t>Every part carries a title card naming its speaker, since nobody says it aloud</w:t>
       </w:r>
     </w:p>
     <w:p>

</xml_diff>

<commit_message>
Put the name introductions back; keep the ban on contribution claims
The previous change removed too much. Each speaker names themselves again at
the start of their part, which Section 1.4 needs for a voice-to-name mark.
What stays out is any statement of who handled what: name, then straight into
the material, with everything spoken being Checkpoint 1, Checkpoint 2 and how
the work progressed.

Co-Authored-By: Claude Opus 5 <noreply@anthropic.com>
Claude-Session: https://claude.ai/code/session_01VZUVZ4Kh74tBbebjZDm9fE
</commit_message>
<xml_diff>
--- a/docs/Discussion_Script.docx
+++ b/docs/Discussion_Script.docx
@@ -686,10 +686,21 @@
         <w:rPr>
           <w:b/>
         </w:rPr>
-        <w:t>Do not introduce yourself, and do not say who did what.</w:t>
-      </w:r>
-      <w:r>
-        <w:t xml:space="preserve"> The recording is about the project, not about the group. Open every part on the material itself. Your instructor still needs to know whose voice is whose for Section 1.4 — the title card at the head of each part carries the name, so nothing is lost by not saying it.</w:t>
+        <w:t>Say your name once, at the start of your first part</w:t>
+      </w:r>
+      <w:r>
+        <w:t xml:space="preserve"> — your instructor is matching a voice to a name for a mark under Section 1.4, and the video may not show your face. Alber records three parts and only needs to do this in Part 1; the later two just continue.</w:t>
+      </w:r>
+    </w:p>
+    <w:p>
+      <w:r>
+        <w:rPr>
+          <w:b/>
+        </w:rPr>
+        <w:t>Say nothing about who did what.</w:t>
+      </w:r>
+      <w:r>
+        <w:t xml:space="preserve"> Your name, then straight into the material. Nobody claims a task, a role, or a contribution — the recording discusses the project, not the group. Everything you say is about Checkpoint 1 and Checkpoint 2 and how the work progressed.</w:t>
       </w:r>
     </w:p>
     <w:p>
@@ -817,7 +828,7 @@
         <w:t>Put a title card at the head of every part</w:t>
       </w:r>
       <w:r>
-        <w:t xml:space="preserve"> — a plain slide with the part number, the topic and the speaker's name, held for two seconds. This one is not optional: since nobody introduces themselves on camera, the card is how your instructor knows whose voice is whose for Section 1.4. It also hides the seam and doubles as your figure numbering.</w:t>
+        <w:t xml:space="preserve"> — a plain slide with the part number, the topic and the speaker's name, held for two seconds. It hides the seam, it backs up the spoken name for Section 1.4, and it doubles as your figure numbering.</w:t>
       </w:r>
     </w:p>
     <w:p>
@@ -1834,7 +1845,7 @@
     </w:p>
     <w:p>
       <w:r>
-        <w:t>Open on the project, not on yourselves:</w:t>
+        <w:t>Say your name, then go straight into the project:</w:t>
       </w:r>
     </w:p>
     <w:p>
@@ -2355,7 +2366,7 @@
     </w:p>
     <w:p>
       <w:r>
-        <w:t>Pick the thread up on the file itself: here is the raw export, and here is what was wrong with it.</w:t>
+        <w:t>Say your name, then pick the thread up on the file itself: here is the raw export, and here is what was wrong with it.</w:t>
       </w:r>
     </w:p>
     <w:p>
@@ -3194,7 +3205,7 @@
         <w:rPr>
           <w:i/>
         </w:rPr>
-        <w:t>About 1.5 minutes. A short bridge between the two checkpoints.</w:t>
+        <w:t>About 1.5 minutes. A short bridge between the two checkpoints — no need to say your name again.</w:t>
       </w:r>
     </w:p>
     <w:p>
@@ -3372,7 +3383,7 @@
     </w:p>
     <w:p>
       <w:r>
-        <w:t>Pick the thread up: the first thing asked of that data was what it looks like.</w:t>
+        <w:t>Say your name, then pick the thread up: the first thing asked of that data was what it looks like.</w:t>
       </w:r>
     </w:p>
     <w:p>
@@ -3970,7 +3981,7 @@
         <w:rPr>
           <w:i/>
         </w:rPr>
-        <w:t>About 6 minutes. Record straight through.</w:t>
+        <w:t>About 6 minutes. Record straight through — no need to say your name again.</w:t>
       </w:r>
     </w:p>
     <w:p>
@@ -4576,7 +4587,7 @@
         <w:pStyle w:val="ListBullet"/>
       </w:pPr>
       <w:r>
-        <w:t>Thank the instructor, and close on the project rather than on the group — the work is what is being marked</w:t>
+        <w:t>Thank the instructor, name the three of you, and state that any member can answer questions on any part of the project — which is what Section 1.4 asks for, and which is true if you have rehearsed</w:t>
       </w:r>
     </w:p>
     <w:p>
@@ -4663,7 +4674,7 @@
         <w:pStyle w:val="ListBullet"/>
       </w:pPr>
       <w:r>
-        <w:t>Every part carries a title card naming its speaker, since nobody says it aloud</w:t>
+        <w:t>Each speaker names themselves once, and nobody claims a task or a role</w:t>
       </w:r>
     </w:p>
     <w:p>

</xml_diff>

<commit_message>
Rewrite the script as spoken lines rather than an outline of beats
The previous version listed what to cover; this one is the words. Every part
is now continuous prose in a speaking voice, read straight off the page:
full sentences, contractions, the questions asked out loud before they are
answered. Stage directions are bracketed italics and are the only thing not
spoken.

Timings measured rather than estimated — about 28 minutes at 140 words a
minute, Alber 10:30 across three parts, Julebeth 8:45, Mardy 8:30, with two
named cuts if a limit is shorter than that.

Every figure carried over unchanged and re-checked against the reports. The
note about Section 3.2 is now one short paragraph at the top asking them to
reword as they read, rather than a section structured around it.

Co-Authored-By: Claude Opus 5 <noreply@anthropic.com>
Claude-Session: https://claude.ai/code/session_01VZUVZ4Kh74tBbebjZDm9fE
</commit_message>
<xml_diff>
--- a/docs/Discussion_Script.docx
+++ b/docs/Discussion_Script.docx
@@ -19,11 +19,6 @@
       </w:r>
       <w:r>
         <w:t xml:space="preserve"> Talibon Polytechnic College</w:t>
-      </w:r>
-    </w:p>
-    <w:p>
-      <w:r>
-        <w:t>Each speaker records their own part straight through, in their own time and place. Nobody waits for a cue, nobody answers anybody, and nobody states a role — each part simply continues the explanation where the last one stopped. Alber joins them in order afterwards.</w:t>
       </w:r>
     </w:p>
     <w:tbl>
@@ -174,7 +169,7 @@
               <w:rPr>
                 <w:sz w:val="18"/>
               </w:rPr>
-              <w:t>Opening; the business problem and the three questions</w:t>
+              <w:t>Opening; the business problem</w:t>
             </w:r>
           </w:p>
         </w:tc>
@@ -260,7 +255,7 @@
               <w:rPr>
                 <w:sz w:val="18"/>
               </w:rPr>
-              <w:t>Checkpoint 1 — the dataset, the database, the eight queries and what they found</w:t>
+              <w:t>Checkpoint 1 — the dataset, the database, the queries</w:t>
             </w:r>
           </w:p>
         </w:tc>
@@ -281,7 +276,7 @@
               <w:rPr>
                 <w:sz w:val="18"/>
               </w:rPr>
-              <w:t>6:40</w:t>
+              <w:t>8:45</w:t>
             </w:r>
           </w:p>
         </w:tc>
@@ -432,7 +427,7 @@
               <w:rPr>
                 <w:sz w:val="18"/>
               </w:rPr>
-              <w:t>Checkpoint 2 — descriptive statistics, correlation, regression, the trend and the forecast</w:t>
+              <w:t>Checkpoint 2 — statistics, correlation, regression, the trend</w:t>
             </w:r>
           </w:p>
         </w:tc>
@@ -453,7 +448,7 @@
               <w:rPr>
                 <w:sz w:val="18"/>
               </w:rPr>
-              <w:t>6:25</w:t>
+              <w:t>8:30</w:t>
             </w:r>
           </w:p>
         </w:tc>
@@ -518,7 +513,7 @@
               <w:rPr>
                 <w:sz w:val="18"/>
               </w:rPr>
-              <w:t>The correction, what it means for the business, the questions, the close</w:t>
+              <w:t>The correction, what it means, the questions, the close</w:t>
             </w:r>
           </w:p>
         </w:tc>
@@ -561,52 +556,24 @@
     </w:p>
     <w:p>
       <w:r>
-        <w:t xml:space="preserve">Roughly </w:t>
+        <w:t xml:space="preserve">About </w:t>
       </w:r>
       <w:r>
         <w:rPr>
           <w:b/>
         </w:rPr>
-        <w:t>23 minutes</w:t>
+        <w:t>28 minutes</w:t>
       </w:r>
       <w:r>
-        <w:t xml:space="preserve"> assembled — about </w:t>
-      </w:r>
-      <w:r>
-        <w:rPr>
-          <w:b/>
-        </w:rPr>
-        <w:t>10:30</w:t>
-      </w:r>
-      <w:r>
-        <w:t xml:space="preserve"> of it Alber, and </w:t>
-      </w:r>
-      <w:r>
-        <w:rPr>
-          <w:b/>
-        </w:rPr>
-        <w:t>6:30</w:t>
-      </w:r>
-      <w:r>
-        <w:t xml:space="preserve"> each for Julebeth and Mardy. Alber records three separate files; Julebeth and Mardy record one each.</w:t>
+        <w:t xml:space="preserve"> at a normal speaking pace — Alber 10:30 across his three parts, Julebeth 8:45, Mardy 8:30. If you need it shorter, cut the six limitations down to one line in Part 4 and drop three of the eight questions in Part 5; that takes off about three minutes without losing a task.</w:t>
       </w:r>
     </w:p>
     <w:p>
       <w:r>
-        <w:t>If you were given a time limit shorter than that, the two places to cut are the descriptive statistics and the correlation in Part 4 — each survives as two sentences. Do not cut a whole task; the brief's tasks are what is being marked.</w:t>
-      </w:r>
-    </w:p>
-    <w:p>
-      <w:r>
-        <w:br w:type="page"/>
-      </w:r>
-    </w:p>
-    <w:p>
-      <w:pPr>
-        <w:pStyle w:val="Heading2"/>
-      </w:pPr>
-      <w:r>
-        <w:t>Before you record</w:t>
+        <w:rPr>
+          <w:i/>
+        </w:rPr>
+        <w:t>Lines in italics inside brackets are stage directions — what to have on screen. Do not read them aloud.</w:t>
       </w:r>
     </w:p>
     <w:p>
@@ -614,71 +581,10 @@
         <w:rPr>
           <w:b/>
         </w:rPr>
-        <w:t>Read this part first. It affects your marks.</w:t>
-      </w:r>
-    </w:p>
-    <w:p>
-      <w:r>
-        <w:t xml:space="preserve">Section 3.2 of the brief states that AI-generated analysis is not permitted and that insights must be derived by the students themselves. This script was drafted with AI assistance, so </w:t>
+        <w:t>One thing before you record.</w:t>
       </w:r>
       <w:r>
-        <w:rPr>
-          <w:b/>
-        </w:rPr>
-        <w:t>do not read it out as written</w:t>
-      </w:r>
-      <w:r>
-        <w:t xml:space="preserve">. Use it the way you would use a lecture outline: it tells you </w:t>
-      </w:r>
-      <w:r>
-        <w:rPr>
-          <w:i/>
-        </w:rPr>
-        <w:t>what to cover, in what order, and which number belongs where</w:t>
-      </w:r>
-      <w:r>
-        <w:t>. The sentences that come out of your mouth have to be yours.</w:t>
-      </w:r>
-    </w:p>
-    <w:p>
-      <w:r>
-        <w:t xml:space="preserve">The practical test: read a section's beats, close the script, and say the same thing in your own words. If you cannot say it without looking, you do not understand it yet — and Section 1.4 lets the instructor ask </w:t>
-      </w:r>
-      <w:r>
-        <w:rPr>
-          <w:b/>
-        </w:rPr>
-        <w:t>any member</w:t>
-      </w:r>
-      <w:r>
-        <w:t xml:space="preserve"> to explain </w:t>
-      </w:r>
-      <w:r>
-        <w:rPr>
-          <w:b/>
-        </w:rPr>
-        <w:t>any part</w:t>
-      </w:r>
-      <w:r>
-        <w:t xml:space="preserve"> of the project, recording or no recording.</w:t>
-      </w:r>
-    </w:p>
-    <w:p>
-      <w:r>
-        <w:t>Every figure quoted here has been checked against the database. If you are asked where a number comes from, the answer is always a specific query or a specific worksheet cell, and those are named beside each section.</w:t>
-      </w:r>
-    </w:p>
-    <w:p>
-      <w:r>
-        <w:br w:type="page"/>
-      </w:r>
-    </w:p>
-    <w:p>
-      <w:pPr>
-        <w:pStyle w:val="Heading2"/>
-      </w:pPr>
-      <w:r>
-        <w:t>How to record your part</w:t>
+        <w:t xml:space="preserve"> Section 3.2 of the brief says AI-generated analysis is not permitted. This script was drafted with AI help, so change the wording as you go — say it the way you would say it, swap sentences around, cut what feels stiff. The numbers and the reasoning have to stay; the phrasing should become yours. Read it through once, then record without staring at the page.</w:t>
       </w:r>
     </w:p>
     <w:p>
@@ -686,1124 +592,10 @@
         <w:rPr>
           <w:b/>
         </w:rPr>
-        <w:t>Say your name once, at the start of your first part</w:t>
+        <w:t>Recording notes.</w:t>
       </w:r>
       <w:r>
-        <w:t xml:space="preserve"> — your instructor is matching a voice to a name for a mark under Section 1.4, and the video may not show your face. Alber records three parts and only needs to do this in Part 1; the later two just continue.</w:t>
-      </w:r>
-    </w:p>
-    <w:p>
-      <w:r>
-        <w:rPr>
-          <w:b/>
-        </w:rPr>
-        <w:t>Say nothing about who did what.</w:t>
-      </w:r>
-      <w:r>
-        <w:t xml:space="preserve"> Your name, then straight into the material. Nobody claims a task, a role, or a contribution — the recording discusses the project, not the group. Everything you say is about Checkpoint 1 and Checkpoint 2 and how the work progressed.</w:t>
-      </w:r>
-    </w:p>
-    <w:p>
-      <w:r>
-        <w:rPr>
-          <w:b/>
-        </w:rPr>
-        <w:t>Record straight through.</w:t>
-      </w:r>
-      <w:r>
-        <w:t xml:space="preserve"> Your part is one continuous explanation. If you stumble, do not stop the recording: pause, take a breath, and repeat that sentence from the beginning. Alber cuts the repeat out. Restarting from the top every time you fluff a word is how a twenty-minute job becomes an evening.</w:t>
-      </w:r>
-    </w:p>
-    <w:p>
-      <w:r>
-        <w:rPr>
-          <w:b/>
-        </w:rPr>
-        <w:t>Leave two seconds of silence at the start and the end.</w:t>
-      </w:r>
-      <w:r>
-        <w:t xml:space="preserve"> Press record, wait, then speak. At the end, stop talking and let it run for two seconds before you stop recording. Cuts made against silence are clean; cuts made against a breath are not.</w:t>
-      </w:r>
-    </w:p>
-    <w:p>
-      <w:r>
-        <w:rPr>
-          <w:b/>
-        </w:rPr>
-        <w:t>Screen-record with audio; do not film a monitor.</w:t>
-      </w:r>
-      <w:r>
-        <w:t xml:space="preserve"> Every exhibit in this project is on a screen — the ERD, the query output, the workbook, the figures. Filmed off a monitor the numbers are unreadable, and unreadable evidence is the same as no evidence.</w:t>
-      </w:r>
-    </w:p>
-    <w:p>
-      <w:r>
-        <w:rPr>
-          <w:b/>
-        </w:rPr>
-        <w:t>Have your exhibits open before you press record</w:t>
-      </w:r>
-      <w:r>
-        <w:t>, in the order the script lists them, so you are not hunting for a window mid-sentence.</w:t>
-      </w:r>
-    </w:p>
-    <w:p>
-      <w:r>
-        <w:rPr>
-          <w:b/>
-        </w:rPr>
-        <w:t>Agree three settings before anyone records:</w:t>
-      </w:r>
-      <w:r>
-        <w:t xml:space="preserve"> screen resolution (1920 × 1080 is the safe choice), video format, and roughly how close you sit to the mic. Three parts recorded at three different volumes is the one problem that is genuinely annoying to fix afterwards.</w:t>
-      </w:r>
-    </w:p>
-    <w:p>
-      <w:r>
-        <w:rPr>
-          <w:b/>
-        </w:rPr>
-        <w:t>Do a thirty-second test first.</w:t>
-      </w:r>
-      <w:r>
-        <w:t xml:space="preserve"> Record, play it back, and check three things: your voice is audible, the on-screen text is legible at that resolution, and no fan or echo is drowning you. Finding this out after you have recorded everything is the most common way groups lose an evening.</w:t>
-      </w:r>
-    </w:p>
-    <w:p>
-      <w:r>
-        <w:rPr>
-          <w:b/>
-        </w:rPr>
-        <w:t>Name your file by part number</w:t>
-      </w:r>
-      <w:r>
-        <w:t xml:space="preserve"> — </w:t>
-      </w:r>
-      <w:r>
-        <w:rPr>
-          <w:rFonts w:ascii="Consolas" w:hAnsi="Consolas"/>
-          <w:color w:val="2F6F9F"/>
-          <w:sz w:val="18"/>
-        </w:rPr>
-        <w:t>Part2_Julebeth.mp4</w:t>
-      </w:r>
-      <w:r>
-        <w:t xml:space="preserve"> — and send Alber the take you want used, not every take you shot.</w:t>
-      </w:r>
-    </w:p>
-    <w:p>
-      <w:r>
-        <w:br w:type="page"/>
-      </w:r>
-    </w:p>
-    <w:p>
-      <w:pPr>
-        <w:pStyle w:val="Heading2"/>
-      </w:pPr>
-      <w:r>
-        <w:t>For Alber, as editor</w:t>
-      </w:r>
-    </w:p>
-    <w:p>
-      <w:r>
-        <w:t>Join the five parts in order: 1, 2, 3, 4, 5. There is nothing to interleave.</w:t>
-      </w:r>
-    </w:p>
-    <w:p>
-      <w:r>
-        <w:rPr>
-          <w:b/>
-        </w:rPr>
-        <w:t>Normalise the audio levels first.</w:t>
-      </w:r>
-      <w:r>
-        <w:t xml:space="preserve"> Three people in three rooms will not match, and a viewer reaching for the volume between speakers is the most noticeable flaw a stitched recording can have.</w:t>
-      </w:r>
-    </w:p>
-    <w:p>
-      <w:r>
-        <w:rPr>
-          <w:b/>
-        </w:rPr>
-        <w:t>Put a title card at the head of every part</w:t>
-      </w:r>
-      <w:r>
-        <w:t xml:space="preserve"> — a plain slide with the part number, the topic and the speaker's name, held for two seconds. It hides the seam, it backs up the spoken name for Section 1.4, and it doubles as your figure numbering.</w:t>
-      </w:r>
-    </w:p>
-    <w:p>
-      <w:r>
-        <w:rPr>
-          <w:b/>
-        </w:rPr>
-        <w:t>Keep the transitions.</w:t>
-      </w:r>
-      <w:r>
-        <w:t xml:space="preserve"> The last line of each part sets up the next one. Cut the dead air and the stumbles; leave those lines alone, because they are what makes five recordings sound like one explanation.</w:t>
-      </w:r>
-    </w:p>
-    <w:p>
-      <w:r>
-        <w:t>If a part comes back unusable and re-recording is impossible, cover it yourself rather than leaving a gap — a missing task is a missing mark.</w:t>
-      </w:r>
-    </w:p>
-    <w:p>
-      <w:pPr>
-        <w:pStyle w:val="Heading3"/>
-      </w:pPr>
-      <w:r>
-        <w:t>What to have on screen</w:t>
-      </w:r>
-    </w:p>
-    <w:tbl>
-      <w:tblPr>
-        <w:tblStyle w:val="LightGrid-Accent1"/>
-        <w:tblW w:type="auto" w:w="0"/>
-        <w:jc w:val="center"/>
-        <w:tblLayout w:type="autofit"/>
-        <w:tblLook w:firstColumn="1" w:firstRow="1" w:lastColumn="0" w:lastRow="0" w:noHBand="0" w:noVBand="1" w:val="04A0"/>
-      </w:tblPr>
-      <w:tblGrid>
-        <w:gridCol w:w="3120"/>
-        <w:gridCol w:w="3120"/>
-        <w:gridCol w:w="3120"/>
-      </w:tblGrid>
-      <w:tr>
-        <w:tc>
-          <w:tcPr>
-            <w:tcW w:type="dxa" w:w="3120"/>
-          </w:tcPr>
-          <w:p>
-            <w:r>
-              <w:rPr>
-                <w:b/>
-              </w:rPr>
-            </w:r>
-            <w:r>
-              <w:rPr>
-                <w:b/>
-              </w:rPr>
-              <w:t>Part</w:t>
-            </w:r>
-          </w:p>
-        </w:tc>
-        <w:tc>
-          <w:tcPr>
-            <w:tcW w:type="dxa" w:w="3120"/>
-          </w:tcPr>
-          <w:p>
-            <w:r>
-              <w:rPr>
-                <w:b/>
-              </w:rPr>
-            </w:r>
-            <w:r>
-              <w:rPr>
-                <w:b/>
-              </w:rPr>
-              <w:t>Section</w:t>
-            </w:r>
-          </w:p>
-        </w:tc>
-        <w:tc>
-          <w:tcPr>
-            <w:tcW w:type="dxa" w:w="3120"/>
-          </w:tcPr>
-          <w:p>
-            <w:r>
-              <w:rPr>
-                <w:b/>
-              </w:rPr>
-            </w:r>
-            <w:r>
-              <w:rPr>
-                <w:b/>
-              </w:rPr>
-              <w:t>Show</w:t>
-            </w:r>
-          </w:p>
-        </w:tc>
-      </w:tr>
-      <w:tr>
-        <w:tc>
-          <w:tcPr>
-            <w:tcW w:type="dxa" w:w="3120"/>
-          </w:tcPr>
-          <w:p>
-            <w:pPr>
-              <w:spacing w:line="240" w:lineRule="auto"/>
-            </w:pPr>
-            <w:r>
-              <w:rPr>
-                <w:sz w:val="18"/>
-              </w:rPr>
-            </w:r>
-            <w:r>
-              <w:rPr>
-                <w:sz w:val="18"/>
-              </w:rPr>
-              <w:t>1</w:t>
-            </w:r>
-          </w:p>
-        </w:tc>
-        <w:tc>
-          <w:tcPr>
-            <w:tcW w:type="dxa" w:w="3120"/>
-          </w:tcPr>
-          <w:p>
-            <w:pPr>
-              <w:spacing w:line="240" w:lineRule="auto"/>
-            </w:pPr>
-            <w:r>
-              <w:rPr>
-                <w:sz w:val="18"/>
-              </w:rPr>
-            </w:r>
-            <w:r>
-              <w:rPr>
-                <w:sz w:val="18"/>
-              </w:rPr>
-              <w:t>Opening</w:t>
-            </w:r>
-          </w:p>
-        </w:tc>
-        <w:tc>
-          <w:tcPr>
-            <w:tcW w:type="dxa" w:w="3120"/>
-          </w:tcPr>
-          <w:p>
-            <w:pPr>
-              <w:spacing w:line="240" w:lineRule="auto"/>
-            </w:pPr>
-            <w:r>
-              <w:rPr>
-                <w:sz w:val="18"/>
-              </w:rPr>
-            </w:r>
-            <w:r>
-              <w:rPr>
-                <w:sz w:val="18"/>
-              </w:rPr>
-              <w:t>Cover page</w:t>
-            </w:r>
-          </w:p>
-        </w:tc>
-      </w:tr>
-      <w:tr>
-        <w:tc>
-          <w:tcPr>
-            <w:tcW w:type="dxa" w:w="3120"/>
-          </w:tcPr>
-          <w:p>
-            <w:pPr>
-              <w:spacing w:line="240" w:lineRule="auto"/>
-            </w:pPr>
-            <w:r>
-              <w:rPr>
-                <w:sz w:val="18"/>
-              </w:rPr>
-            </w:r>
-            <w:r>
-              <w:rPr>
-                <w:sz w:val="18"/>
-              </w:rPr>
-              <w:t>1</w:t>
-            </w:r>
-          </w:p>
-        </w:tc>
-        <w:tc>
-          <w:tcPr>
-            <w:tcW w:type="dxa" w:w="3120"/>
-          </w:tcPr>
-          <w:p>
-            <w:pPr>
-              <w:spacing w:line="240" w:lineRule="auto"/>
-            </w:pPr>
-            <w:r>
-              <w:rPr>
-                <w:sz w:val="18"/>
-              </w:rPr>
-            </w:r>
-            <w:r>
-              <w:rPr>
-                <w:sz w:val="18"/>
-              </w:rPr>
-              <w:t>The business problem</w:t>
-            </w:r>
-          </w:p>
-        </w:tc>
-        <w:tc>
-          <w:tcPr>
-            <w:tcW w:type="dxa" w:w="3120"/>
-          </w:tcPr>
-          <w:p>
-            <w:pPr>
-              <w:spacing w:line="240" w:lineRule="auto"/>
-            </w:pPr>
-            <w:r>
-              <w:rPr>
-                <w:sz w:val="18"/>
-              </w:rPr>
-            </w:r>
-            <w:r>
-              <w:rPr>
-                <w:sz w:val="18"/>
-              </w:rPr>
-              <w:t>Figure 1, the annual trend</w:t>
-            </w:r>
-          </w:p>
-        </w:tc>
-      </w:tr>
-      <w:tr>
-        <w:tc>
-          <w:tcPr>
-            <w:tcW w:type="dxa" w:w="3120"/>
-          </w:tcPr>
-          <w:p>
-            <w:pPr>
-              <w:spacing w:line="240" w:lineRule="auto"/>
-            </w:pPr>
-            <w:r>
-              <w:rPr>
-                <w:sz w:val="18"/>
-              </w:rPr>
-            </w:r>
-            <w:r>
-              <w:rPr>
-                <w:sz w:val="18"/>
-              </w:rPr>
-              <w:t>2</w:t>
-            </w:r>
-          </w:p>
-        </w:tc>
-        <w:tc>
-          <w:tcPr>
-            <w:tcW w:type="dxa" w:w="3120"/>
-          </w:tcPr>
-          <w:p>
-            <w:pPr>
-              <w:spacing w:line="240" w:lineRule="auto"/>
-            </w:pPr>
-            <w:r>
-              <w:rPr>
-                <w:sz w:val="18"/>
-              </w:rPr>
-            </w:r>
-            <w:r>
-              <w:rPr>
-                <w:sz w:val="18"/>
-              </w:rPr>
-              <w:t>The dataset</w:t>
-            </w:r>
-          </w:p>
-        </w:tc>
-        <w:tc>
-          <w:tcPr>
-            <w:tcW w:type="dxa" w:w="3120"/>
-          </w:tcPr>
-          <w:p>
-            <w:pPr>
-              <w:spacing w:line="240" w:lineRule="auto"/>
-            </w:pPr>
-            <w:r>
-              <w:rPr>
-                <w:sz w:val="18"/>
-              </w:rPr>
-            </w:r>
-            <w:r>
-              <w:rPr>
-                <w:sz w:val="18"/>
-              </w:rPr>
-              <w:t>The raw CSV, first 15–20 rows</w:t>
-            </w:r>
-          </w:p>
-        </w:tc>
-      </w:tr>
-      <w:tr>
-        <w:tc>
-          <w:tcPr>
-            <w:tcW w:type="dxa" w:w="3120"/>
-          </w:tcPr>
-          <w:p>
-            <w:pPr>
-              <w:spacing w:line="240" w:lineRule="auto"/>
-            </w:pPr>
-            <w:r>
-              <w:rPr>
-                <w:sz w:val="18"/>
-              </w:rPr>
-            </w:r>
-            <w:r>
-              <w:rPr>
-                <w:sz w:val="18"/>
-              </w:rPr>
-              <w:t>2</w:t>
-            </w:r>
-          </w:p>
-        </w:tc>
-        <w:tc>
-          <w:tcPr>
-            <w:tcW w:type="dxa" w:w="3120"/>
-          </w:tcPr>
-          <w:p>
-            <w:pPr>
-              <w:spacing w:line="240" w:lineRule="auto"/>
-            </w:pPr>
-            <w:r>
-              <w:rPr>
-                <w:sz w:val="18"/>
-              </w:rPr>
-            </w:r>
-            <w:r>
-              <w:rPr>
-                <w:sz w:val="18"/>
-              </w:rPr>
-              <w:t>The database</w:t>
-            </w:r>
-          </w:p>
-        </w:tc>
-        <w:tc>
-          <w:tcPr>
-            <w:tcW w:type="dxa" w:w="3120"/>
-          </w:tcPr>
-          <w:p>
-            <w:pPr>
-              <w:spacing w:line="240" w:lineRule="auto"/>
-            </w:pPr>
-            <w:r>
-              <w:rPr>
-                <w:sz w:val="18"/>
-              </w:rPr>
-            </w:r>
-            <w:r>
-              <w:rPr>
-                <w:rFonts w:ascii="Consolas" w:hAnsi="Consolas"/>
-                <w:color w:val="2F6F9F"/>
-                <w:sz w:val="18"/>
-              </w:rPr>
-              <w:t>docs/figures/erd.png</w:t>
-            </w:r>
-            <w:r>
-              <w:rPr>
-                <w:sz w:val="18"/>
-              </w:rPr>
-              <w:t xml:space="preserve">, then the </w:t>
-            </w:r>
-            <w:r>
-              <w:rPr>
-                <w:rFonts w:ascii="Consolas" w:hAnsi="Consolas"/>
-                <w:color w:val="2F6F9F"/>
-                <w:sz w:val="18"/>
-              </w:rPr>
-              <w:t>SHOW TABLES</w:t>
-            </w:r>
-            <w:r>
-              <w:rPr>
-                <w:sz w:val="18"/>
-              </w:rPr>
-              <w:t xml:space="preserve"> screenshot</w:t>
-            </w:r>
-          </w:p>
-        </w:tc>
-      </w:tr>
-      <w:tr>
-        <w:tc>
-          <w:tcPr>
-            <w:tcW w:type="dxa" w:w="3120"/>
-          </w:tcPr>
-          <w:p>
-            <w:pPr>
-              <w:spacing w:line="240" w:lineRule="auto"/>
-            </w:pPr>
-            <w:r>
-              <w:rPr>
-                <w:sz w:val="18"/>
-              </w:rPr>
-            </w:r>
-            <w:r>
-              <w:rPr>
-                <w:sz w:val="18"/>
-              </w:rPr>
-              <w:t>2</w:t>
-            </w:r>
-          </w:p>
-        </w:tc>
-        <w:tc>
-          <w:tcPr>
-            <w:tcW w:type="dxa" w:w="3120"/>
-          </w:tcPr>
-          <w:p>
-            <w:pPr>
-              <w:spacing w:line="240" w:lineRule="auto"/>
-            </w:pPr>
-            <w:r>
-              <w:rPr>
-                <w:sz w:val="18"/>
-              </w:rPr>
-            </w:r>
-            <w:r>
-              <w:rPr>
-                <w:sz w:val="18"/>
-              </w:rPr>
-              <w:t>The queries</w:t>
-            </w:r>
-          </w:p>
-        </w:tc>
-        <w:tc>
-          <w:tcPr>
-            <w:tcW w:type="dxa" w:w="3120"/>
-          </w:tcPr>
-          <w:p>
-            <w:pPr>
-              <w:spacing w:line="240" w:lineRule="auto"/>
-            </w:pPr>
-            <w:r>
-              <w:rPr>
-                <w:sz w:val="18"/>
-              </w:rPr>
-            </w:r>
-            <w:r>
-              <w:rPr>
-                <w:sz w:val="18"/>
-              </w:rPr>
-              <w:t>Query screenshots Q3, Q5, Q8</w:t>
-            </w:r>
-          </w:p>
-        </w:tc>
-      </w:tr>
-      <w:tr>
-        <w:tc>
-          <w:tcPr>
-            <w:tcW w:type="dxa" w:w="3120"/>
-          </w:tcPr>
-          <w:p>
-            <w:pPr>
-              <w:spacing w:line="240" w:lineRule="auto"/>
-            </w:pPr>
-            <w:r>
-              <w:rPr>
-                <w:sz w:val="18"/>
-              </w:rPr>
-            </w:r>
-            <w:r>
-              <w:rPr>
-                <w:sz w:val="18"/>
-              </w:rPr>
-              <w:t>3</w:t>
-            </w:r>
-          </w:p>
-        </w:tc>
-        <w:tc>
-          <w:tcPr>
-            <w:tcW w:type="dxa" w:w="3120"/>
-          </w:tcPr>
-          <w:p>
-            <w:pPr>
-              <w:spacing w:line="240" w:lineRule="auto"/>
-            </w:pPr>
-            <w:r>
-              <w:rPr>
-                <w:sz w:val="18"/>
-              </w:rPr>
-            </w:r>
-            <w:r>
-              <w:rPr>
-                <w:sz w:val="18"/>
-              </w:rPr>
-              <w:t>The workbook</w:t>
-            </w:r>
-          </w:p>
-        </w:tc>
-        <w:tc>
-          <w:tcPr>
-            <w:tcW w:type="dxa" w:w="3120"/>
-          </w:tcPr>
-          <w:p>
-            <w:pPr>
-              <w:spacing w:line="240" w:lineRule="auto"/>
-            </w:pPr>
-            <w:r>
-              <w:rPr>
-                <w:sz w:val="18"/>
-              </w:rPr>
-            </w:r>
-            <w:r>
-              <w:rPr>
-                <w:sz w:val="18"/>
-              </w:rPr>
-              <w:t>Cleaned Data, then a PivotChart</w:t>
-            </w:r>
-          </w:p>
-        </w:tc>
-      </w:tr>
-      <w:tr>
-        <w:tc>
-          <w:tcPr>
-            <w:tcW w:type="dxa" w:w="3120"/>
-          </w:tcPr>
-          <w:p>
-            <w:pPr>
-              <w:spacing w:line="240" w:lineRule="auto"/>
-            </w:pPr>
-            <w:r>
-              <w:rPr>
-                <w:sz w:val="18"/>
-              </w:rPr>
-            </w:r>
-            <w:r>
-              <w:rPr>
-                <w:sz w:val="18"/>
-              </w:rPr>
-              <w:t>4</w:t>
-            </w:r>
-          </w:p>
-        </w:tc>
-        <w:tc>
-          <w:tcPr>
-            <w:tcW w:type="dxa" w:w="3120"/>
-          </w:tcPr>
-          <w:p>
-            <w:pPr>
-              <w:spacing w:line="240" w:lineRule="auto"/>
-            </w:pPr>
-            <w:r>
-              <w:rPr>
-                <w:sz w:val="18"/>
-              </w:rPr>
-            </w:r>
-            <w:r>
-              <w:rPr>
-                <w:sz w:val="18"/>
-              </w:rPr>
-              <w:t>Descriptive statistics</w:t>
-            </w:r>
-          </w:p>
-        </w:tc>
-        <w:tc>
-          <w:tcPr>
-            <w:tcW w:type="dxa" w:w="3120"/>
-          </w:tcPr>
-          <w:p>
-            <w:pPr>
-              <w:spacing w:line="240" w:lineRule="auto"/>
-            </w:pPr>
-            <w:r>
-              <w:rPr>
-                <w:sz w:val="18"/>
-              </w:rPr>
-            </w:r>
-            <w:r>
-              <w:rPr>
-                <w:sz w:val="18"/>
-              </w:rPr>
-              <w:t>The Amount histogram</w:t>
-            </w:r>
-          </w:p>
-        </w:tc>
-      </w:tr>
-      <w:tr>
-        <w:tc>
-          <w:tcPr>
-            <w:tcW w:type="dxa" w:w="3120"/>
-          </w:tcPr>
-          <w:p>
-            <w:pPr>
-              <w:spacing w:line="240" w:lineRule="auto"/>
-            </w:pPr>
-            <w:r>
-              <w:rPr>
-                <w:sz w:val="18"/>
-              </w:rPr>
-            </w:r>
-            <w:r>
-              <w:rPr>
-                <w:sz w:val="18"/>
-              </w:rPr>
-              <w:t>4</w:t>
-            </w:r>
-          </w:p>
-        </w:tc>
-        <w:tc>
-          <w:tcPr>
-            <w:tcW w:type="dxa" w:w="3120"/>
-          </w:tcPr>
-          <w:p>
-            <w:pPr>
-              <w:spacing w:line="240" w:lineRule="auto"/>
-            </w:pPr>
-            <w:r>
-              <w:rPr>
-                <w:sz w:val="18"/>
-              </w:rPr>
-            </w:r>
-            <w:r>
-              <w:rPr>
-                <w:sz w:val="18"/>
-              </w:rPr>
-              <w:t>Correlation</w:t>
-            </w:r>
-          </w:p>
-        </w:tc>
-        <w:tc>
-          <w:tcPr>
-            <w:tcW w:type="dxa" w:w="3120"/>
-          </w:tcPr>
-          <w:p>
-            <w:pPr>
-              <w:spacing w:line="240" w:lineRule="auto"/>
-            </w:pPr>
-            <w:r>
-              <w:rPr>
-                <w:sz w:val="18"/>
-              </w:rPr>
-            </w:r>
-            <w:r>
-              <w:rPr>
-                <w:sz w:val="18"/>
-              </w:rPr>
-              <w:t>Both scatter plots</w:t>
-            </w:r>
-          </w:p>
-        </w:tc>
-      </w:tr>
-      <w:tr>
-        <w:tc>
-          <w:tcPr>
-            <w:tcW w:type="dxa" w:w="3120"/>
-          </w:tcPr>
-          <w:p>
-            <w:pPr>
-              <w:spacing w:line="240" w:lineRule="auto"/>
-            </w:pPr>
-            <w:r>
-              <w:rPr>
-                <w:sz w:val="18"/>
-              </w:rPr>
-            </w:r>
-            <w:r>
-              <w:rPr>
-                <w:sz w:val="18"/>
-              </w:rPr>
-              <w:t>4</w:t>
-            </w:r>
-          </w:p>
-        </w:tc>
-        <w:tc>
-          <w:tcPr>
-            <w:tcW w:type="dxa" w:w="3120"/>
-          </w:tcPr>
-          <w:p>
-            <w:pPr>
-              <w:spacing w:line="240" w:lineRule="auto"/>
-            </w:pPr>
-            <w:r>
-              <w:rPr>
-                <w:sz w:val="18"/>
-              </w:rPr>
-            </w:r>
-            <w:r>
-              <w:rPr>
-                <w:sz w:val="18"/>
-              </w:rPr>
-              <w:t>Regression</w:t>
-            </w:r>
-          </w:p>
-        </w:tc>
-        <w:tc>
-          <w:tcPr>
-            <w:tcW w:type="dxa" w:w="3120"/>
-          </w:tcPr>
-          <w:p>
-            <w:pPr>
-              <w:spacing w:line="240" w:lineRule="auto"/>
-            </w:pPr>
-            <w:r>
-              <w:rPr>
-                <w:sz w:val="18"/>
-              </w:rPr>
-            </w:r>
-            <w:r>
-              <w:rPr>
-                <w:sz w:val="18"/>
-              </w:rPr>
-              <w:t>The ToolPak output</w:t>
-            </w:r>
-          </w:p>
-        </w:tc>
-      </w:tr>
-      <w:tr>
-        <w:tc>
-          <w:tcPr>
-            <w:tcW w:type="dxa" w:w="3120"/>
-          </w:tcPr>
-          <w:p>
-            <w:pPr>
-              <w:spacing w:line="240" w:lineRule="auto"/>
-            </w:pPr>
-            <w:r>
-              <w:rPr>
-                <w:sz w:val="18"/>
-              </w:rPr>
-            </w:r>
-            <w:r>
-              <w:rPr>
-                <w:sz w:val="18"/>
-              </w:rPr>
-              <w:t>4</w:t>
-            </w:r>
-          </w:p>
-        </w:tc>
-        <w:tc>
-          <w:tcPr>
-            <w:tcW w:type="dxa" w:w="3120"/>
-          </w:tcPr>
-          <w:p>
-            <w:pPr>
-              <w:spacing w:line="240" w:lineRule="auto"/>
-            </w:pPr>
-            <w:r>
-              <w:rPr>
-                <w:sz w:val="18"/>
-              </w:rPr>
-            </w:r>
-            <w:r>
-              <w:rPr>
-                <w:sz w:val="18"/>
-              </w:rPr>
-              <w:t>Trend and seasonality</w:t>
-            </w:r>
-          </w:p>
-        </w:tc>
-        <w:tc>
-          <w:tcPr>
-            <w:tcW w:type="dxa" w:w="3120"/>
-          </w:tcPr>
-          <w:p>
-            <w:pPr>
-              <w:spacing w:line="240" w:lineRule="auto"/>
-            </w:pPr>
-            <w:r>
-              <w:rPr>
-                <w:sz w:val="18"/>
-              </w:rPr>
-            </w:r>
-            <w:r>
-              <w:rPr>
-                <w:sz w:val="18"/>
-              </w:rPr>
-              <w:t>Figure 2 with the shading, then the forecast chart</w:t>
-            </w:r>
-          </w:p>
-        </w:tc>
-      </w:tr>
-      <w:tr>
-        <w:tc>
-          <w:tcPr>
-            <w:tcW w:type="dxa" w:w="3120"/>
-          </w:tcPr>
-          <w:p>
-            <w:pPr>
-              <w:spacing w:line="240" w:lineRule="auto"/>
-            </w:pPr>
-            <w:r>
-              <w:rPr>
-                <w:sz w:val="18"/>
-              </w:rPr>
-            </w:r>
-            <w:r>
-              <w:rPr>
-                <w:sz w:val="18"/>
-              </w:rPr>
-              <w:t>5</w:t>
-            </w:r>
-          </w:p>
-        </w:tc>
-        <w:tc>
-          <w:tcPr>
-            <w:tcW w:type="dxa" w:w="3120"/>
-          </w:tcPr>
-          <w:p>
-            <w:pPr>
-              <w:spacing w:line="240" w:lineRule="auto"/>
-            </w:pPr>
-            <w:r>
-              <w:rPr>
-                <w:sz w:val="18"/>
-              </w:rPr>
-            </w:r>
-            <w:r>
-              <w:rPr>
-                <w:sz w:val="18"/>
-              </w:rPr>
-              <w:t>The correction</w:t>
-            </w:r>
-          </w:p>
-        </w:tc>
-        <w:tc>
-          <w:tcPr>
-            <w:tcW w:type="dxa" w:w="3120"/>
-          </w:tcPr>
-          <w:p>
-            <w:pPr>
-              <w:spacing w:line="240" w:lineRule="auto"/>
-            </w:pPr>
-            <w:r>
-              <w:rPr>
-                <w:sz w:val="18"/>
-              </w:rPr>
-            </w:r>
-            <w:r>
-              <w:rPr>
-                <w:sz w:val="18"/>
-              </w:rPr>
-              <w:t>The correction table from the Checkpoint 2 report</w:t>
-            </w:r>
-          </w:p>
-        </w:tc>
-      </w:tr>
-      <w:tr>
-        <w:tc>
-          <w:tcPr>
-            <w:tcW w:type="dxa" w:w="3120"/>
-          </w:tcPr>
-          <w:p>
-            <w:pPr>
-              <w:spacing w:line="240" w:lineRule="auto"/>
-            </w:pPr>
-            <w:r>
-              <w:rPr>
-                <w:sz w:val="18"/>
-              </w:rPr>
-            </w:r>
-            <w:r>
-              <w:rPr>
-                <w:sz w:val="18"/>
-              </w:rPr>
-              <w:t>5</w:t>
-            </w:r>
-          </w:p>
-        </w:tc>
-        <w:tc>
-          <w:tcPr>
-            <w:tcW w:type="dxa" w:w="3120"/>
-          </w:tcPr>
-          <w:p>
-            <w:pPr>
-              <w:spacing w:line="240" w:lineRule="auto"/>
-            </w:pPr>
-            <w:r>
-              <w:rPr>
-                <w:sz w:val="18"/>
-              </w:rPr>
-            </w:r>
-            <w:r>
-              <w:rPr>
-                <w:sz w:val="18"/>
-              </w:rPr>
-              <w:t>What it means</w:t>
-            </w:r>
-          </w:p>
-        </w:tc>
-        <w:tc>
-          <w:tcPr>
-            <w:tcW w:type="dxa" w:w="3120"/>
-          </w:tcPr>
-          <w:p>
-            <w:pPr>
-              <w:spacing w:line="240" w:lineRule="auto"/>
-            </w:pPr>
-            <w:r>
-              <w:rPr>
-                <w:sz w:val="18"/>
-              </w:rPr>
-            </w:r>
-            <w:r>
-              <w:rPr>
-                <w:sz w:val="18"/>
-              </w:rPr>
-              <w:t>The findings summary</w:t>
-            </w:r>
-          </w:p>
-        </w:tc>
-      </w:tr>
-      <w:tr>
-        <w:tc>
-          <w:tcPr>
-            <w:tcW w:type="dxa" w:w="3120"/>
-          </w:tcPr>
-          <w:p>
-            <w:pPr>
-              <w:spacing w:line="240" w:lineRule="auto"/>
-            </w:pPr>
-            <w:r>
-              <w:rPr>
-                <w:sz w:val="18"/>
-              </w:rPr>
-            </w:r>
-            <w:r>
-              <w:rPr>
-                <w:sz w:val="18"/>
-              </w:rPr>
-              <w:t>5</w:t>
-            </w:r>
-          </w:p>
-        </w:tc>
-        <w:tc>
-          <w:tcPr>
-            <w:tcW w:type="dxa" w:w="3120"/>
-          </w:tcPr>
-          <w:p>
-            <w:pPr>
-              <w:spacing w:line="240" w:lineRule="auto"/>
-            </w:pPr>
-            <w:r>
-              <w:rPr>
-                <w:sz w:val="18"/>
-              </w:rPr>
-            </w:r>
-            <w:r>
-              <w:rPr>
-                <w:sz w:val="18"/>
-              </w:rPr>
-              <w:t>Close</w:t>
-            </w:r>
-          </w:p>
-        </w:tc>
-        <w:tc>
-          <w:tcPr>
-            <w:tcW w:type="dxa" w:w="3120"/>
-          </w:tcPr>
-          <w:p>
-            <w:pPr>
-              <w:spacing w:line="240" w:lineRule="auto"/>
-            </w:pPr>
-            <w:r>
-              <w:rPr>
-                <w:sz w:val="18"/>
-              </w:rPr>
-            </w:r>
-            <w:r>
-              <w:rPr>
-                <w:sz w:val="18"/>
-              </w:rPr>
-              <w:t>Cover page again, or the team slide</w:t>
-            </w:r>
-          </w:p>
-        </w:tc>
-      </w:tr>
-    </w:tbl>
-    <w:p>
-      <w:pPr>
-        <w:spacing w:after="200" w:line="240" w:lineRule="auto"/>
-        <w:jc w:val="center"/>
-      </w:pPr>
-      <w:r>
-        <w:rPr>
-          <w:i/>
-          <w:color w:val="7B8994"/>
-          <w:sz w:val="20"/>
-        </w:rPr>
-        <w:t>Table 2. What to have on screen</w:t>
+        <w:t xml:space="preserve"> Record your part in one take, screen-recording with audio rather than filming a monitor. If you stumble, don't stop — pause and repeat the sentence, and Alber cuts it. Leave two seconds of silence at each end. Agree on screen resolution and mic distance beforehand so the three parts match. Alber joins the five files in order, normalises the audio, and puts a two-second title card at the head of each part.</w:t>
       </w:r>
     </w:p>
     <w:p>
@@ -1824,15 +616,22 @@
         <w:rPr>
           <w:i/>
         </w:rPr>
-        <w:t>About 3 minutes. Record straight through.</w:t>
+        <w:t>[Cover page on screen.]</w:t>
       </w:r>
     </w:p>
     <w:p>
-      <w:pPr>
-        <w:pStyle w:val="Heading2"/>
-      </w:pPr>
       <w:r>
-        <w:t>Opening</w:t>
+        <w:t>Good day. My name is Alber, and this is our mini capstone project for BED 106, Business Analytics. Our domain is Retail and Sales Analytics, and our topic is sales trend analysis.</w:t>
+      </w:r>
+    </w:p>
+    <w:p>
+      <w:r>
+        <w:t>What we'll go through is the first two checkpoints. Checkpoint 1 is where we took a raw sales file, cleaned it, and built a database out of it, so we could ask what actually happened to this company. Checkpoint 2 is where we took that same data into Excel and asked a harder question — how strong is the evidence, and can we predict anything from it.</w:t>
+      </w:r>
+    </w:p>
+    <w:p>
+      <w:r>
+        <w:t>The dataset is a retail sales export. 1,194 transaction lines, running from March 2020 to March 2025.</w:t>
       </w:r>
     </w:p>
     <w:p>
@@ -1840,491 +639,62 @@
         <w:rPr>
           <w:i/>
         </w:rPr>
-        <w:t>On screen: the cover page</w:t>
+        <w:t>[Switch to Figure 1, the annual trend.]</w:t>
       </w:r>
     </w:p>
     <w:p>
       <w:r>
-        <w:t>Say your name, then go straight into the project:</w:t>
-      </w:r>
-    </w:p>
-    <w:p>
-      <w:pPr>
-        <w:pStyle w:val="ListBullet"/>
-      </w:pPr>
-      <w:r>
-        <w:t xml:space="preserve">This is our BED 106 Business Analytics mini capstone. Our domain is Retail and Sales Analytics, and our topic is </w:t>
-      </w:r>
-      <w:r>
-        <w:rPr>
-          <w:b/>
-        </w:rPr>
-        <w:t>sales trend analysis</w:t>
-      </w:r>
-    </w:p>
-    <w:p>
-      <w:pPr>
-        <w:pStyle w:val="ListBullet"/>
-      </w:pPr>
-      <w:r>
-        <w:t xml:space="preserve">What the recording covers: </w:t>
-      </w:r>
-      <w:r>
-        <w:rPr>
-          <w:b/>
-        </w:rPr>
-        <w:t>Checkpoint 1</w:t>
-      </w:r>
-      <w:r>
-        <w:t xml:space="preserve">, where we built a database and asked what happened, and </w:t>
-      </w:r>
-      <w:r>
-        <w:rPr>
-          <w:b/>
-        </w:rPr>
-        <w:t>Checkpoint 2</w:t>
-      </w:r>
-      <w:r>
-        <w:t>, where we took the same data into Excel and asked how strong the evidence is and what can be predicted</w:t>
-      </w:r>
-    </w:p>
-    <w:p>
-      <w:pPr>
-        <w:pStyle w:val="ListBullet"/>
-      </w:pPr>
-      <w:r>
-        <w:t>One sentence on the dataset: 1,194 transaction lines, March 2020 to March 2025</w:t>
-      </w:r>
-    </w:p>
-    <w:p>
-      <w:pPr>
-        <w:pStyle w:val="ListBullet"/>
-      </w:pPr>
-      <w:r>
-        <w:t>Then straight into the problem — no need to announce that you are about to start</w:t>
-      </w:r>
-    </w:p>
-    <w:p>
-      <w:pPr>
-        <w:pStyle w:val="Heading2"/>
-      </w:pPr>
-      <w:r>
-        <w:t>The business problem</w:t>
+        <w:t>So here's the problem we're looking at. The company is a multi-category retailer — electronics, furniture and office supplies — selling across six US states. And what happened to it is simple to say: it grew, and then it stopped.</w:t>
       </w:r>
     </w:p>
     <w:p>
       <w:r>
-        <w:rPr>
-          <w:i/>
-        </w:rPr>
-        <w:t>Task 1.1 · on screen: Figure 1</w:t>
-      </w:r>
-    </w:p>
-    <w:p>
-      <w:pPr>
-        <w:pStyle w:val="ListBullet"/>
-      </w:pPr>
-      <w:r>
-        <w:t>The subject is a multi-category retailer — electronics, furniture, office supplies — trading across six US states between 2020 and 2025</w:t>
-      </w:r>
-    </w:p>
-    <w:p>
-      <w:pPr>
-        <w:pStyle w:val="ListBullet"/>
-      </w:pPr>
-      <w:r>
-        <w:t xml:space="preserve">The problem: </w:t>
-      </w:r>
-      <w:r>
-        <w:rPr>
-          <w:b/>
-        </w:rPr>
-        <w:t>the company grew, then stopped.</w:t>
-      </w:r>
-      <w:r>
-        <w:t xml:space="preserve"> On a like-for-like monthly basis revenue rose </w:t>
-      </w:r>
-      <w:r>
-        <w:rPr>
-          <w:b/>
-        </w:rPr>
-        <w:t>30.9%</w:t>
-      </w:r>
-      <w:r>
-        <w:t xml:space="preserve"> from 2020 to the 2022 peak, then fell two years running to finish 2024 </w:t>
-      </w:r>
-      <w:r>
-        <w:rPr>
-          <w:b/>
-        </w:rPr>
-        <w:t>17.6% below</w:t>
-      </w:r>
-      <w:r>
-        <w:t xml:space="preserve"> that peak</w:t>
-      </w:r>
-    </w:p>
-    <w:p>
-      <w:pPr>
-        <w:pStyle w:val="ListBullet"/>
-      </w:pPr>
-      <w:r>
-        <w:t xml:space="preserve">Now the part that makes this an analytical problem rather than an obvious one. Ask it out loud and answer it: </w:t>
-      </w:r>
-      <w:r>
-        <w:rPr>
-          <w:i/>
-        </w:rPr>
-        <w:t>why does a falling sales figure need a database at all?</w:t>
-      </w:r>
-      <w:r>
-        <w:t xml:space="preserve"> Because of what </w:t>
-      </w:r>
-      <w:r>
-        <w:rPr>
-          <w:b/>
-        </w:rPr>
-        <w:t>didn't</w:t>
-      </w:r>
-      <w:r>
-        <w:t xml:space="preserve"> move. Margin held between </w:t>
-      </w:r>
-      <w:r>
-        <w:rPr>
-          <w:b/>
-        </w:rPr>
-        <w:t>23.97% and 26.93%</w:t>
-      </w:r>
-      <w:r>
-        <w:t xml:space="preserve"> for the whole five years, and average order value stayed between </w:t>
-      </w:r>
-      <w:r>
-        <w:rPr>
-          <w:b/>
-        </w:rPr>
-        <w:t>5,008 and 5,444</w:t>
-      </w:r>
-    </w:p>
-    <w:p>
-      <w:pPr>
-        <w:pStyle w:val="ListBullet"/>
-      </w:pPr>
-      <w:r>
-        <w:t xml:space="preserve">Had margin collapsed, the answer would be "we discounted too hard" and none of this would be needed. Margin held steady while revenue fell, which means the company is writing </w:t>
-      </w:r>
-      <w:r>
-        <w:rPr>
-          <w:b/>
-        </w:rPr>
-        <w:t>fewer orders</w:t>
-      </w:r>
-      <w:r>
-        <w:t>, not worse ones — and "fewer orders of what, when, and where" is a question a single annual revenue figure cannot answer</w:t>
-      </w:r>
-    </w:p>
-    <w:p>
-      <w:pPr>
-        <w:pStyle w:val="ListBullet"/>
-      </w:pPr>
-      <w:r>
-        <w:t>The three business questions, which every deliverable maps back to:</w:t>
-      </w:r>
-    </w:p>
-    <w:tbl>
-      <w:tblPr>
-        <w:tblStyle w:val="LightGrid-Accent1"/>
-        <w:tblW w:type="auto" w:w="0"/>
-        <w:jc w:val="center"/>
-        <w:tblLayout w:type="autofit"/>
-        <w:tblLook w:firstColumn="1" w:firstRow="1" w:lastColumn="0" w:lastRow="0" w:noHBand="0" w:noVBand="1" w:val="04A0"/>
-      </w:tblPr>
-      <w:tblGrid>
-        <w:gridCol w:w="3120"/>
-        <w:gridCol w:w="3120"/>
-        <w:gridCol w:w="3120"/>
-      </w:tblGrid>
-      <w:tr>
-        <w:tc>
-          <w:tcPr>
-            <w:tcW w:type="dxa" w:w="3120"/>
-          </w:tcPr>
-          <w:p>
-            <w:r>
-              <w:rPr>
-                <w:b/>
-              </w:rPr>
-            </w:r>
-            <w:r>
-              <w:rPr>
-                <w:b/>
-              </w:rPr>
-              <w:t>#</w:t>
-            </w:r>
-          </w:p>
-        </w:tc>
-        <w:tc>
-          <w:tcPr>
-            <w:tcW w:type="dxa" w:w="3120"/>
-          </w:tcPr>
-          <w:p>
-            <w:r>
-              <w:rPr>
-                <w:b/>
-              </w:rPr>
-            </w:r>
-            <w:r>
-              <w:rPr>
-                <w:b/>
-              </w:rPr>
-              <w:t>Question</w:t>
-            </w:r>
-          </w:p>
-        </w:tc>
-        <w:tc>
-          <w:tcPr>
-            <w:tcW w:type="dxa" w:w="3120"/>
-          </w:tcPr>
-          <w:p>
-            <w:r>
-              <w:rPr>
-                <w:b/>
-              </w:rPr>
-            </w:r>
-            <w:r>
-              <w:rPr>
-                <w:b/>
-              </w:rPr>
-              <w:t>Answered by</w:t>
-            </w:r>
-          </w:p>
-        </w:tc>
-      </w:tr>
-      <w:tr>
-        <w:tc>
-          <w:tcPr>
-            <w:tcW w:type="dxa" w:w="3120"/>
-          </w:tcPr>
-          <w:p>
-            <w:pPr>
-              <w:spacing w:line="240" w:lineRule="auto"/>
-            </w:pPr>
-            <w:r>
-              <w:rPr>
-                <w:sz w:val="18"/>
-              </w:rPr>
-            </w:r>
-            <w:r>
-              <w:rPr>
-                <w:sz w:val="18"/>
-              </w:rPr>
-              <w:t>1</w:t>
-            </w:r>
-          </w:p>
-        </w:tc>
-        <w:tc>
-          <w:tcPr>
-            <w:tcW w:type="dxa" w:w="3120"/>
-          </w:tcPr>
-          <w:p>
-            <w:pPr>
-              <w:spacing w:line="240" w:lineRule="auto"/>
-            </w:pPr>
-            <w:r>
-              <w:rPr>
-                <w:sz w:val="18"/>
-              </w:rPr>
-            </w:r>
-            <w:r>
-              <w:rPr>
-                <w:sz w:val="18"/>
-              </w:rPr>
-              <w:t>How have revenue and profit trended, and is the company still growing?</w:t>
-            </w:r>
-          </w:p>
-        </w:tc>
-        <w:tc>
-          <w:tcPr>
-            <w:tcW w:type="dxa" w:w="3120"/>
-          </w:tcPr>
-          <w:p>
-            <w:pPr>
-              <w:spacing w:line="240" w:lineRule="auto"/>
-            </w:pPr>
-            <w:r>
-              <w:rPr>
-                <w:sz w:val="18"/>
-              </w:rPr>
-            </w:r>
-            <w:r>
-              <w:rPr>
-                <w:sz w:val="18"/>
-              </w:rPr>
-              <w:t>Query 3, and the Checkpoint 2 regression</w:t>
-            </w:r>
-          </w:p>
-        </w:tc>
-      </w:tr>
-      <w:tr>
-        <w:tc>
-          <w:tcPr>
-            <w:tcW w:type="dxa" w:w="3120"/>
-          </w:tcPr>
-          <w:p>
-            <w:pPr>
-              <w:spacing w:line="240" w:lineRule="auto"/>
-            </w:pPr>
-            <w:r>
-              <w:rPr>
-                <w:sz w:val="18"/>
-              </w:rPr>
-            </w:r>
-            <w:r>
-              <w:rPr>
-                <w:sz w:val="18"/>
-              </w:rPr>
-              <w:t>2</w:t>
-            </w:r>
-          </w:p>
-        </w:tc>
-        <w:tc>
-          <w:tcPr>
-            <w:tcW w:type="dxa" w:w="3120"/>
-          </w:tcPr>
-          <w:p>
-            <w:pPr>
-              <w:spacing w:line="240" w:lineRule="auto"/>
-            </w:pPr>
-            <w:r>
-              <w:rPr>
-                <w:sz w:val="18"/>
-              </w:rPr>
-            </w:r>
-            <w:r>
-              <w:rPr>
-                <w:sz w:val="18"/>
-              </w:rPr>
-              <w:t>Which categories and sub-categories drive the trend?</w:t>
-            </w:r>
-          </w:p>
-        </w:tc>
-        <w:tc>
-          <w:tcPr>
-            <w:tcW w:type="dxa" w:w="3120"/>
-          </w:tcPr>
-          <w:p>
-            <w:pPr>
-              <w:spacing w:line="240" w:lineRule="auto"/>
-            </w:pPr>
-            <w:r>
-              <w:rPr>
-                <w:sz w:val="18"/>
-              </w:rPr>
-            </w:r>
-            <w:r>
-              <w:rPr>
-                <w:sz w:val="18"/>
-              </w:rPr>
-              <w:t>Queries 5 and 7</w:t>
-            </w:r>
-          </w:p>
-        </w:tc>
-      </w:tr>
-      <w:tr>
-        <w:tc>
-          <w:tcPr>
-            <w:tcW w:type="dxa" w:w="3120"/>
-          </w:tcPr>
-          <w:p>
-            <w:pPr>
-              <w:spacing w:line="240" w:lineRule="auto"/>
-            </w:pPr>
-            <w:r>
-              <w:rPr>
-                <w:sz w:val="18"/>
-              </w:rPr>
-            </w:r>
-            <w:r>
-              <w:rPr>
-                <w:sz w:val="18"/>
-              </w:rPr>
-              <w:t>3</w:t>
-            </w:r>
-          </w:p>
-        </w:tc>
-        <w:tc>
-          <w:tcPr>
-            <w:tcW w:type="dxa" w:w="3120"/>
-          </w:tcPr>
-          <w:p>
-            <w:pPr>
-              <w:spacing w:line="240" w:lineRule="auto"/>
-            </w:pPr>
-            <w:r>
-              <w:rPr>
-                <w:sz w:val="18"/>
-              </w:rPr>
-            </w:r>
-            <w:r>
-              <w:rPr>
-                <w:sz w:val="18"/>
-              </w:rPr>
-              <w:t>When does demand concentrate, and is the pattern the same for every category?</w:t>
-            </w:r>
-          </w:p>
-        </w:tc>
-        <w:tc>
-          <w:tcPr>
-            <w:tcW w:type="dxa" w:w="3120"/>
-          </w:tcPr>
-          <w:p>
-            <w:pPr>
-              <w:spacing w:line="240" w:lineRule="auto"/>
-            </w:pPr>
-            <w:r>
-              <w:rPr>
-                <w:sz w:val="18"/>
-              </w:rPr>
-            </w:r>
-            <w:r>
-              <w:rPr>
-                <w:sz w:val="18"/>
-              </w:rPr>
-              <w:t>Queries 4 and 8</w:t>
-            </w:r>
-          </w:p>
-        </w:tc>
-      </w:tr>
-    </w:tbl>
-    <w:p>
-      <w:pPr>
-        <w:spacing w:after="200" w:line="240" w:lineRule="auto"/>
-        <w:jc w:val="center"/>
-      </w:pPr>
-      <w:r>
-        <w:rPr>
-          <w:i/>
-          <w:color w:val="7B8994"/>
-          <w:sz w:val="20"/>
-        </w:rPr>
-        <w:t>Table 3. The business problem</w:t>
-      </w:r>
-    </w:p>
-    <w:p>
-      <w:pPr>
-        <w:pStyle w:val="ListBullet"/>
-      </w:pPr>
-      <w:r>
-        <w:t>Why they matter: the decisions hanging off them are what to stock, when to stock it, and where to put the sales effort. Getting them wrong costs inventory that does not sell and campaigns that land in the wrong quarter</w:t>
+        <w:t>On a like-for-like monthly basis, revenue went up 30.9 percent from 2020 to its peak in 2022. Then it fell in each of the next two years, and finished 2024 at 17.6 percent below that peak.</w:t>
       </w:r>
     </w:p>
     <w:p>
       <w:r>
-        <w:rPr>
-          <w:b/>
-        </w:rPr>
-        <w:t>End the part on this line:</w:t>
+        <w:t>Now, you might ask — why does that need a database? Sales went down. That's not a mystery.</w:t>
       </w:r>
+    </w:p>
+    <w:p>
       <w:r>
-        <w:t xml:space="preserve"> none of those questions could be answered until the raw file had been assessed, cleaned and put into a database — which is where Checkpoint 1 starts.</w:t>
+        <w:t>Here's why. It's because of what didn't move. Margin held between 23.97 and 26.93 percent for the whole five years. Average order value stayed between 5,008 and 5,444. Neither of those budged.</w:t>
+      </w:r>
+    </w:p>
+    <w:p>
+      <w:r>
+        <w:t>And that changes the whole question. If margin had collapsed, the answer would just be "we discounted too hard," and nobody would need any of this. But margin held steady while revenue fell. That means the company isn't selling worse orders — it's writing fewer of them. And fewer orders of what, sold when, and sold where — that is not something a single annual revenue figure can tell you.</w:t>
+      </w:r>
+    </w:p>
+    <w:p>
+      <w:r>
+        <w:t>So we set three business questions, and everything in this project comes back to one of them.</w:t>
+      </w:r>
+    </w:p>
+    <w:p>
+      <w:r>
+        <w:t>First: how have revenue and profit trended, and is the company still growing?</w:t>
+      </w:r>
+    </w:p>
+    <w:p>
+      <w:r>
+        <w:t>Second: which categories and sub-categories are driving that trend?</w:t>
+      </w:r>
+    </w:p>
+    <w:p>
+      <w:r>
+        <w:t>And third: when does demand actually concentrate — and is that pattern the same for every category?</w:t>
+      </w:r>
+    </w:p>
+    <w:p>
+      <w:r>
+        <w:t>These matter because of the decisions sitting behind them. What to stock, when to stock it, and where to put the sales effort. Get those wrong and you're paying for inventory that doesn't sell, and running campaigns in the wrong quarter.</w:t>
+      </w:r>
+    </w:p>
+    <w:p>
+      <w:r>
+        <w:t>None of that could be answered from the raw file, though. It had to be assessed, cleaned, and put into a database first — and that's where Checkpoint 1 starts.</w:t>
       </w:r>
     </w:p>
     <w:p>
@@ -2345,15 +715,97 @@
         <w:rPr>
           <w:i/>
         </w:rPr>
-        <w:t>About 6.5 minutes. Record straight through — the three sections below run on from each other, so treat them as one talk with three topics.</w:t>
+        <w:t>[The raw CSV on screen, first 15–20 rows.]</w:t>
       </w:r>
     </w:p>
     <w:p>
-      <w:pPr>
-        <w:pStyle w:val="Heading2"/>
-      </w:pPr>
       <w:r>
-        <w:t>The dataset and what was wrong with it</w:t>
+        <w:t>I'm Julebeth, and I'll take it from the raw file.</w:t>
+      </w:r>
+    </w:p>
+    <w:p>
+      <w:r>
+        <w:t>This is the export we started with — 1,194 transaction lines, 12 columns, running from 22 March 2020 to 15 March 2025. The brief asks for at least 200 rows, so we're well past that.</w:t>
+      </w:r>
+    </w:p>
+    <w:p>
+      <w:r>
+        <w:t>One thing to be clear about first: the grain. Each row here is one product line on an order, not one order. Three products on an order means three rows. Everything we do later depends on that.</w:t>
+      </w:r>
+    </w:p>
+    <w:p>
+      <w:r>
+        <w:t>We ran a quality assessment before touching anything, and we found five problems.</w:t>
+      </w:r>
+    </w:p>
+    <w:p>
+      <w:r>
+        <w:rPr>
+          <w:b/>
+        </w:rPr>
+        <w:t>First, the Order ID column is not a primary key.</w:t>
+      </w:r>
+      <w:r>
+        <w:t xml:space="preserve"> 1,194 rows, but only 547 distinct order IDs — and these aren't duplicate rows. The same ID shows up on different dates, for different customers. So it identifies neither a row nor an order.</w:t>
+      </w:r>
+    </w:p>
+    <w:p>
+      <w:r>
+        <w:t>Why not just repair it? Because repairing it means deciding which of two rows sharing an ID is the real one, and we have no evidence for that decision. Making that evidence up is data fabrication, and the brief says that's grounds for a failing mark. So we kept it as a plain attribute and issued our own key, called sale_id. It costs us nothing, because no question we ask needs order identity.</w:t>
+      </w:r>
+    </w:p>
+    <w:p>
+      <w:r>
+        <w:rPr>
+          <w:b/>
+        </w:rPr>
+        <w:t>Second, the customer name isn't an identifier either.</w:t>
+      </w:r>
+      <w:r>
+        <w:t xml:space="preserve"> 807 customers resolve from 802 distinct names, because five names appear in more than one city. So our customer key is the pair — name and city together.</w:t>
+      </w:r>
+    </w:p>
+    <w:p>
+      <w:r>
+        <w:rPr>
+          <w:b/>
+        </w:rPr>
+        <w:t>Third, the Year-Month column is redundant.</w:t>
+      </w:r>
+      <w:r>
+        <w:t xml:space="preserve"> You can derive it from the date, so it doesn't belong in a normalised schema. We rebuilt it in a dates table.</w:t>
+      </w:r>
+    </w:p>
+    <w:p>
+      <w:r>
+        <w:rPr>
+          <w:b/>
+        </w:rPr>
+        <w:t>Fourth, both ends of the file are partial.</w:t>
+      </w:r>
+      <w:r>
+        <w:t xml:space="preserve"> It starts on 22 March 2020 and stops on 15 March 2025. That sounds minor. It isn't — it's where the one real error in this project came from, and we'll come back to it.</w:t>
+      </w:r>
+    </w:p>
+    <w:p>
+      <w:r>
+        <w:rPr>
+          <w:b/>
+        </w:rPr>
+        <w:t>And fifth, the dataset is synthetic.</w:t>
+      </w:r>
+      <w:r>
+        <w:t xml:space="preserve"> It's not real trading data, and we're saying that up front rather than burying it. We have five pieces of evidence.</w:t>
+      </w:r>
+    </w:p>
+    <w:p>
+      <w:r>
+        <w:t>There isn't one loss-making line in five years — no real retailer has that. 22 of the 802 names end in credential suffixes like MD or DDS, which is what the Faker library produces. There are US cities paired with UPI and EMI payment methods, and those are Indian payment rails. The payment mix is almost perfectly uniform — 206 to 260 across every single method. And the Amount histogram comes out flat instead of right-skewed, which is what a random number generator looks like.</w:t>
+      </w:r>
+    </w:p>
+    <w:p>
+      <w:r>
+        <w:t>And we didn't fix any of it. Fixing it would mean inventing numbers. So we stated it, we proved it, and we carried it through as a limitation. The method isn't affected — every query and every statistic in this project would run exactly the same way on real data.</w:t>
       </w:r>
     </w:p>
     <w:p>
@@ -2361,81 +813,68 @@
         <w:rPr>
           <w:i/>
         </w:rPr>
-        <w:t>Task 1.2 · on screen: the raw CSV, first 15–20 rows</w:t>
+        <w:t>[Switch to the ERD.]</w:t>
       </w:r>
     </w:p>
     <w:p>
       <w:r>
-        <w:t>Say your name, then pick the thread up on the file itself: here is the raw export, and here is what was wrong with it.</w:t>
+        <w:t>So we normalised that flat file into a star schema. One fact table, seven dimension tables around it — eight in total. The fact table is sales, one row per transaction line, and around it we have customers, cities, states, categories, sub_categories, payment_modes and dates.</w:t>
       </w:r>
     </w:p>
     <w:p>
-      <w:pPr>
-        <w:pStyle w:val="ListBullet"/>
-      </w:pPr>
       <w:r>
-        <w:t xml:space="preserve">The dataset is a retail sales export, </w:t>
-      </w:r>
-      <w:r>
-        <w:rPr>
-          <w:b/>
-        </w:rPr>
-        <w:t>1,194 transaction lines and 12 columns</w:t>
-      </w:r>
-      <w:r>
-        <w:t xml:space="preserve">, covering </w:t>
-      </w:r>
-      <w:r>
-        <w:rPr>
-          <w:b/>
-        </w:rPr>
-        <w:t>22 March 2020 to 15 March 2025</w:t>
-      </w:r>
-      <w:r>
-        <w:t>. The brief asks for at least 200 rows</w:t>
+        <w:t>Why a star, instead of the one table we started with? Three reasons.</w:t>
       </w:r>
     </w:p>
     <w:p>
-      <w:pPr>
-        <w:pStyle w:val="ListBullet"/>
-      </w:pPr>
       <w:r>
-        <w:t xml:space="preserve">The word to stress: the </w:t>
+        <w:t>Consistency — in the flat file a category name is repeated on every row that uses it, so one typo creates a category that doesn't exist. In the star that name lives in one place and the fact table just carries an integer key. A typo goes from unlikely to impossible.</w:t>
       </w:r>
+    </w:p>
+    <w:p>
       <w:r>
-        <w:rPr>
-          <w:b/>
-        </w:rPr>
-        <w:t>grain</w:t>
+        <w:t>The brief — Task 1.3 wants at least two related tables with proper primary and foreign keys. What we built has eight tables, eight primary keys, seven foreign keys, six unique constraints and four check constraints. And we tested that those constraints actually reject bad rows; we didn't just assume it.</w:t>
       </w:r>
+    </w:p>
+    <w:p>
       <w:r>
-        <w:t xml:space="preserve"> is one row per </w:t>
+        <w:t>And the queries — the category trend question needs category and date sitting on the same row as the amount, and a star gives you that in one join.</w:t>
       </w:r>
+    </w:p>
+    <w:p>
+      <w:r>
+        <w:t>The dates table looks like overkill until you try to write the queries. It's there for two reasons. We never call YEAR or strftime anywhere, so the same query file runs unchanged on MySQL and on SQLite — we verified that. And it carries two flags the raw dates can't: is_complete_month and is_complete_year. Those are the fix for problem four, and they're what stops anyone from comparing a nine-month 2020 against a full 2021.</w:t>
+      </w:r>
+    </w:p>
+    <w:p>
+      <w:r>
+        <w:t>One thing that cost us real time — year_month is a reserved word in MySQL. Our CREATE TABLE statement failed outright with a syntax error until we put backticks around it. And we only found that because we installed an actual MySQL server and ran the import, instead of assuming the file was fine.</w:t>
+      </w:r>
+    </w:p>
+    <w:p>
       <w:r>
         <w:rPr>
           <w:i/>
         </w:rPr>
-        <w:t>product line on an order</w:t>
-      </w:r>
-      <w:r>
-        <w:t>, not one row per order. Everything downstream depends on that</w:t>
+        <w:t>[Switch to the SHOW TABLES screenshot.]</w:t>
       </w:r>
     </w:p>
     <w:p>
-      <w:pPr>
-        <w:pStyle w:val="ListBullet"/>
-      </w:pPr>
       <w:r>
-        <w:t xml:space="preserve">A quality assessment was run before anything was touched, and it found </w:t>
+        <w:t>The whole thing loads from one file — the database, all eight tables, all the data. And it ends with a verification block whose last row has to read 1,194 rows, 6,182,639 in revenue, 547 order IDs, 57 complete months, and zero orphaned rows.</w:t>
       </w:r>
+    </w:p>
+    <w:p>
       <w:r>
         <w:rPr>
-          <w:b/>
+          <w:i/>
         </w:rPr>
-        <w:t>five problems</w:t>
+        <w:t>[Switch to the query screenshots — Q3 first.]</w:t>
       </w:r>
+    </w:p>
+    <w:p>
       <w:r>
-        <w:t>, in order of how much trouble they caused</w:t>
+        <w:t>So with the database built, we could ask the questions. There are eight queries in four groups: two basic retrievals using WHERE and ORDER BY, two aggregates using GROUP BY, two multi-table joins — ours each join four tables — and two business-insight queries. Here's what they found.</w:t>
       </w:r>
     </w:p>
     <w:p>
@@ -2443,44 +882,18 @@
         <w:rPr>
           <w:b/>
         </w:rPr>
-        <w:t>One — `Order ID` is not a primary key.</w:t>
+        <w:t>First, growth stopped in 2022, and it stopped in a specific way.</w:t>
       </w:r>
       <w:r>
-        <w:t xml:space="preserve"> 1,194 rows, only </w:t>
-      </w:r>
-      <w:r>
-        <w:rPr>
-          <w:b/>
-        </w:rPr>
-        <w:t>547 distinct order IDs</w:t>
-      </w:r>
-      <w:r>
-        <w:t xml:space="preserve">, and the repeats are not duplicate rows: the same ID appears on different dates, for different customers. So it does not identify an order either. It was kept as a plain attribute and a surrogate key, </w:t>
-      </w:r>
-      <w:r>
-        <w:rPr>
-          <w:rFonts w:ascii="Consolas" w:hAnsi="Consolas"/>
-          <w:color w:val="2F6F9F"/>
-          <w:sz w:val="18"/>
-        </w:rPr>
-        <w:t>sale_id</w:t>
-      </w:r>
-      <w:r>
-        <w:t>, was issued instead.</w:t>
+        <w:t xml:space="preserve"> Query 3 aggregates by year, but on a per-month basis, so the partial years can't distort it. Revenue per month went from 92,934 in 2020, up to 121,648 at the 2022 peak, then down to 100,207 in 2024. But margin never left that 24-to-27 percent band, and average order value never left 5,008 to 5,444. Put those together and you have the diagnosis — fewer orders, not cheaper ones and not less profitable ones. Which points at demand generation, not at pricing.</w:t>
       </w:r>
     </w:p>
     <w:p>
       <w:r>
-        <w:t xml:space="preserve">Then answer the obvious objection before it is asked — </w:t>
-      </w:r>
-      <w:r>
         <w:rPr>
           <w:i/>
         </w:rPr>
-        <w:t>why not repair it?</w:t>
-      </w:r>
-      <w:r>
-        <w:t xml:space="preserve"> Because repairing it means deciding which of two rows sharing an ID is the real one, and there is no evidence for that decision. Inventing that evidence is data fabrication, which the brief says is grounds for a failing mark. Documenting the defect costs nothing analytically, because no question in this project needs order identity.</w:t>
+        <w:t>[Switch to Q5.]</w:t>
       </w:r>
     </w:p>
     <w:p>
@@ -2488,28 +901,23 @@
         <w:rPr>
           <w:b/>
         </w:rPr>
-        <w:t>Two — customer name is not an identifier either.</w:t>
+        <w:t>Second, one sub-category explains most of the gap.</w:t>
       </w:r>
       <w:r>
-        <w:t xml:space="preserve"> </w:t>
+        <w:t xml:space="preserve"> Printers lost 136,865 between 2023 and 2024 — a 71 percent collapse, and on its own that's more than half the entire gap between the 2022 peak and 2024. Every Electronics sub-category fell, and the category as a whole is down 40.8 percent. But every Office Supplies sub-category grew — Paper is up 85,689, which is 149.4 percent.</w:t>
       </w:r>
+    </w:p>
+    <w:p>
+      <w:r>
+        <w:t>And that's the point: this is not a general slowdown. Two opposite trends are running at the same time, and the company-wide figure is just their average, which describes neither of them. That's the most useful thing Checkpoint 1 produced.</w:t>
+      </w:r>
+    </w:p>
+    <w:p>
       <w:r>
         <w:rPr>
-          <w:b/>
+          <w:i/>
         </w:rPr>
-        <w:t>807 customers</w:t>
-      </w:r>
-      <w:r>
-        <w:t xml:space="preserve"> resolve from </w:t>
-      </w:r>
-      <w:r>
-        <w:rPr>
-          <w:b/>
-        </w:rPr>
-        <w:t>802 distinct names</w:t>
-      </w:r>
-      <w:r>
-        <w:t>, because five names appear in more than one city. The customer key is the pair (name, city).</w:t>
+        <w:t>[Switch to Q8.]</w:t>
       </w:r>
     </w:p>
     <w:p>
@@ -2517,21 +925,10 @@
         <w:rPr>
           <w:b/>
         </w:rPr>
-        <w:t>Three — `Year-Month` is redundant.</w:t>
+        <w:t>Third, seasonality is category-specific.</w:t>
       </w:r>
       <w:r>
-        <w:t xml:space="preserve"> It is derivable from the date, so it does not belong in a normalised schema. It was rebuilt in the </w:t>
-      </w:r>
-      <w:r>
-        <w:rPr>
-          <w:rFonts w:ascii="Consolas" w:hAnsi="Consolas"/>
-          <w:color w:val="2F6F9F"/>
-          <w:sz w:val="18"/>
-        </w:rPr>
-        <w:t>dates</w:t>
-      </w:r>
-      <w:r>
-        <w:t xml:space="preserve"> table.</w:t>
+        <w:t xml:space="preserve"> The blended figure tells you Q4 is the peak quarter. But split it out, and Electronics actually peaks in Q2, at 30.79 percent of its annual revenue. Furniture peaks in Q4 at 30.84, and Office Supplies in Q4 at 32.16. So one blended planning curve is wrong for all three — it over-stocks Electronics in Q4 and under-stocks it in Q2.</w:t>
       </w:r>
     </w:p>
     <w:p>
@@ -2539,657 +936,15 @@
         <w:rPr>
           <w:b/>
         </w:rPr>
-        <w:t>Four — both ends of the file are partial.</w:t>
+        <w:t>And fourth, geography isn't a factor.</w:t>
       </w:r>
       <w:r>
-        <w:t xml:space="preserve"> It starts 22 March 2020 and stops 15 March 2025. Say that this matters more than it sounds and that it comes back later — it is where the project's one significant error came from.</w:t>
+        <w:t xml:space="preserve"> State revenue spans only 28 percent across five years, and no state trends against the others. Not every finding has to be a discovery — this one tells the business where not to spend its effort.</w:t>
       </w:r>
     </w:p>
     <w:p>
       <w:r>
-        <w:rPr>
-          <w:b/>
-        </w:rPr>
-        <w:t>Five — the dataset is synthetic.</w:t>
-      </w:r>
-      <w:r>
-        <w:t xml:space="preserve"> Say this plainly and do not bury it. Five machine-checked signals:</w:t>
-      </w:r>
-    </w:p>
-    <w:p>
-      <w:pPr>
-        <w:pStyle w:val="ListBullet"/>
-      </w:pPr>
-      <w:r>
-        <w:t>Not one loss-making line in five years — no real retailer has that</w:t>
-      </w:r>
-    </w:p>
-    <w:p>
-      <w:pPr>
-        <w:pStyle w:val="ListBullet"/>
-      </w:pPr>
-      <w:r>
-        <w:t>22 of the 802 names end in credential suffixes like "MD" or "DDS", which is a Faker library artefact</w:t>
-      </w:r>
-    </w:p>
-    <w:p>
-      <w:pPr>
-        <w:pStyle w:val="ListBullet"/>
-      </w:pPr>
-      <w:r>
-        <w:t>US cities paired with UPI and EMI payment methods, which are Indian payment rails</w:t>
-      </w:r>
-    </w:p>
-    <w:p>
-      <w:pPr>
-        <w:pStyle w:val="ListBullet"/>
-      </w:pPr>
-      <w:r>
-        <w:t>The payment mix is near-uniform, 206 to 260 across every method</w:t>
-      </w:r>
-    </w:p>
-    <w:p>
-      <w:pPr>
-        <w:pStyle w:val="ListBullet"/>
-      </w:pPr>
-      <w:r>
-        <w:t>The Amount histogram is flat, not normal — real transaction values are right-skewed</w:t>
-      </w:r>
-    </w:p>
-    <w:p>
-      <w:r>
-        <w:t xml:space="preserve">Then the point that matters: </w:t>
-      </w:r>
-      <w:r>
-        <w:rPr>
-          <w:b/>
-        </w:rPr>
-        <w:t>none of it was fixed.</w:t>
-      </w:r>
-      <w:r>
-        <w:t xml:space="preserve"> Fixing it would mean inventing numbers. It was stated, proved, and carried into every conclusion as a limitation. The method is unaffected — every query and every statistic in this project would run identically against a real export.</w:t>
-      </w:r>
-    </w:p>
-    <w:p>
-      <w:r>
-        <w:rPr>
-          <w:i/>
-        </w:rPr>
-        <w:t>Move straight on:</w:t>
-      </w:r>
-      <w:r>
-        <w:t xml:space="preserve"> with the defects documented, the next step was turning that flat file into a proper database.</w:t>
-      </w:r>
-    </w:p>
-    <w:p>
-      <w:pPr>
-        <w:pStyle w:val="Heading2"/>
-      </w:pPr>
-      <w:r>
-        <w:t>The database</w:t>
-      </w:r>
-    </w:p>
-    <w:p>
-      <w:r>
-        <w:rPr>
-          <w:i/>
-        </w:rPr>
-        <w:t>Task 1.3 · on screen: the ERD, then `SHOW TABLES`</w:t>
-      </w:r>
-    </w:p>
-    <w:p>
-      <w:pPr>
-        <w:pStyle w:val="ListBullet"/>
-      </w:pPr>
-      <w:r>
-        <w:t xml:space="preserve">The flat file was normalised into a </w:t>
-      </w:r>
-      <w:r>
-        <w:rPr>
-          <w:b/>
-        </w:rPr>
-        <w:t>star schema</w:t>
-      </w:r>
-      <w:r>
-        <w:t xml:space="preserve">: one fact table surrounded by seven dimensions, </w:t>
-      </w:r>
-      <w:r>
-        <w:rPr>
-          <w:b/>
-        </w:rPr>
-        <w:t>eight tables</w:t>
-      </w:r>
-      <w:r>
-        <w:t xml:space="preserve"> in total</w:t>
-      </w:r>
-    </w:p>
-    <w:p>
-      <w:pPr>
-        <w:pStyle w:val="ListBullet"/>
-      </w:pPr>
-      <w:r>
-        <w:rPr>
-          <w:rFonts w:ascii="Consolas" w:hAnsi="Consolas"/>
-          <w:color w:val="2F6F9F"/>
-          <w:sz w:val="18"/>
-        </w:rPr>
-        <w:t>sales</w:t>
-      </w:r>
-      <w:r>
-        <w:t xml:space="preserve"> is the fact table, one row per transaction line. Around it: </w:t>
-      </w:r>
-      <w:r>
-        <w:rPr>
-          <w:rFonts w:ascii="Consolas" w:hAnsi="Consolas"/>
-          <w:color w:val="2F6F9F"/>
-          <w:sz w:val="18"/>
-        </w:rPr>
-        <w:t>customers</w:t>
-      </w:r>
-      <w:r>
-        <w:t xml:space="preserve">, </w:t>
-      </w:r>
-      <w:r>
-        <w:rPr>
-          <w:rFonts w:ascii="Consolas" w:hAnsi="Consolas"/>
-          <w:color w:val="2F6F9F"/>
-          <w:sz w:val="18"/>
-        </w:rPr>
-        <w:t>cities</w:t>
-      </w:r>
-      <w:r>
-        <w:t xml:space="preserve">, </w:t>
-      </w:r>
-      <w:r>
-        <w:rPr>
-          <w:rFonts w:ascii="Consolas" w:hAnsi="Consolas"/>
-          <w:color w:val="2F6F9F"/>
-          <w:sz w:val="18"/>
-        </w:rPr>
-        <w:t>states</w:t>
-      </w:r>
-      <w:r>
-        <w:t xml:space="preserve">, </w:t>
-      </w:r>
-      <w:r>
-        <w:rPr>
-          <w:rFonts w:ascii="Consolas" w:hAnsi="Consolas"/>
-          <w:color w:val="2F6F9F"/>
-          <w:sz w:val="18"/>
-        </w:rPr>
-        <w:t>categories</w:t>
-      </w:r>
-      <w:r>
-        <w:t xml:space="preserve">, </w:t>
-      </w:r>
-      <w:r>
-        <w:rPr>
-          <w:rFonts w:ascii="Consolas" w:hAnsi="Consolas"/>
-          <w:color w:val="2F6F9F"/>
-          <w:sz w:val="18"/>
-        </w:rPr>
-        <w:t>sub_categories</w:t>
-      </w:r>
-      <w:r>
-        <w:t xml:space="preserve">, </w:t>
-      </w:r>
-      <w:r>
-        <w:rPr>
-          <w:rFonts w:ascii="Consolas" w:hAnsi="Consolas"/>
-          <w:color w:val="2F6F9F"/>
-          <w:sz w:val="18"/>
-        </w:rPr>
-        <w:t>payment_modes</w:t>
-      </w:r>
-      <w:r>
-        <w:t xml:space="preserve"> and </w:t>
-      </w:r>
-      <w:r>
-        <w:rPr>
-          <w:rFonts w:ascii="Consolas" w:hAnsi="Consolas"/>
-          <w:color w:val="2F6F9F"/>
-          <w:sz w:val="18"/>
-        </w:rPr>
-        <w:t>dates</w:t>
-      </w:r>
-    </w:p>
-    <w:p>
-      <w:pPr>
-        <w:pStyle w:val="ListBullet"/>
-      </w:pPr>
-      <w:r>
-        <w:t xml:space="preserve">Ask it out loud — </w:t>
-      </w:r>
-      <w:r>
-        <w:rPr>
-          <w:i/>
-        </w:rPr>
-        <w:t>why a star, and not the one table we started with?</w:t>
-      </w:r>
-      <w:r>
-        <w:t xml:space="preserve"> Three reasons:</w:t>
-      </w:r>
-    </w:p>
-    <w:p>
-      <w:r>
-        <w:rPr>
-          <w:b/>
-        </w:rPr>
-        <w:t>Consistency.</w:t>
-      </w:r>
-      <w:r>
-        <w:t xml:space="preserve"> In the flat file a category name is repeated on every row that uses it, so a typo in one row creates a category that does not exist. In the star the name lives once in </w:t>
-      </w:r>
-      <w:r>
-        <w:rPr>
-          <w:rFonts w:ascii="Consolas" w:hAnsi="Consolas"/>
-          <w:color w:val="2F6F9F"/>
-          <w:sz w:val="18"/>
-        </w:rPr>
-        <w:t>categories</w:t>
-      </w:r>
-      <w:r>
-        <w:t xml:space="preserve"> and the fact table carries an integer key. A typo becomes impossible rather than merely unlikely.</w:t>
-      </w:r>
-    </w:p>
-    <w:p>
-      <w:r>
-        <w:rPr>
-          <w:b/>
-        </w:rPr>
-        <w:t>The brief asks for it.</w:t>
-      </w:r>
-      <w:r>
-        <w:t xml:space="preserve"> Task 1.3 requires at least two related tables with proper primary and foreign keys. There are </w:t>
-      </w:r>
-      <w:r>
-        <w:rPr>
-          <w:b/>
-        </w:rPr>
-        <w:t>eight tables, eight primary keys, seven foreign keys, six unique constraints and four check constraints</w:t>
-      </w:r>
-      <w:r>
-        <w:t xml:space="preserve"> — and the constraints were tested to confirm they actually reject bad rows, rather than assumed to.</w:t>
-      </w:r>
-    </w:p>
-    <w:p>
-      <w:r>
-        <w:rPr>
-          <w:b/>
-        </w:rPr>
-        <w:t>The queries need it.</w:t>
-      </w:r>
-      <w:r>
-        <w:t xml:space="preserve"> The category trend question needs category and date on the same row as the amount, and a star gives you that in one join.</w:t>
-      </w:r>
-    </w:p>
-    <w:p>
-      <w:r>
-        <w:t xml:space="preserve">Then the </w:t>
-      </w:r>
-      <w:r>
-        <w:rPr>
-          <w:rFonts w:ascii="Consolas" w:hAnsi="Consolas"/>
-          <w:color w:val="2F6F9F"/>
-          <w:sz w:val="18"/>
-        </w:rPr>
-        <w:t>dates</w:t>
-      </w:r>
-      <w:r>
-        <w:t xml:space="preserve"> table, which looks like overkill until you try to write the queries. Two reasons it earns its place:</w:t>
-      </w:r>
-    </w:p>
-    <w:p>
-      <w:pPr>
-        <w:pStyle w:val="ListBullet"/>
-      </w:pPr>
-      <w:r>
-        <w:rPr>
-          <w:b/>
-        </w:rPr>
-        <w:t>Portability.</w:t>
-      </w:r>
-      <w:r>
-        <w:t xml:space="preserve"> </w:t>
-      </w:r>
-      <w:r>
-        <w:rPr>
-          <w:rFonts w:ascii="Consolas" w:hAnsi="Consolas"/>
-          <w:color w:val="2F6F9F"/>
-          <w:sz w:val="18"/>
-        </w:rPr>
-        <w:t>YEAR()</w:t>
-      </w:r>
-      <w:r>
-        <w:t xml:space="preserve"> and </w:t>
-      </w:r>
-      <w:r>
-        <w:rPr>
-          <w:rFonts w:ascii="Consolas" w:hAnsi="Consolas"/>
-          <w:color w:val="2F6F9F"/>
-          <w:sz w:val="18"/>
-        </w:rPr>
-        <w:t>strftime()</w:t>
-      </w:r>
-      <w:r>
-        <w:t xml:space="preserve"> are never called, so the same query file runs unchanged on MySQL and on SQLite, and that was verified</w:t>
-      </w:r>
-    </w:p>
-    <w:p>
-      <w:pPr>
-        <w:pStyle w:val="ListBullet"/>
-      </w:pPr>
-      <w:r>
-        <w:rPr>
-          <w:b/>
-        </w:rPr>
-        <w:t>The completeness flags.</w:t>
-      </w:r>
-      <w:r>
-        <w:t xml:space="preserve"> It carries </w:t>
-      </w:r>
-      <w:r>
-        <w:rPr>
-          <w:rFonts w:ascii="Consolas" w:hAnsi="Consolas"/>
-          <w:color w:val="2F6F9F"/>
-          <w:sz w:val="18"/>
-        </w:rPr>
-        <w:t>is_complete_month</w:t>
-      </w:r>
-      <w:r>
-        <w:t xml:space="preserve"> and </w:t>
-      </w:r>
-      <w:r>
-        <w:rPr>
-          <w:rFonts w:ascii="Consolas" w:hAnsi="Consolas"/>
-          <w:color w:val="2F6F9F"/>
-          <w:sz w:val="18"/>
-        </w:rPr>
-        <w:t>is_complete_year</w:t>
-      </w:r>
-      <w:r>
-        <w:t>, which raw dates cannot. Those flags are the fix for problem four, and they are what stops anyone comparing a nine-month 2020 against a full 2021</w:t>
-      </w:r>
-    </w:p>
-    <w:p>
-      <w:r>
-        <w:t xml:space="preserve">One trap worth telling them about, because it cost real time: </w:t>
-      </w:r>
-      <w:r>
-        <w:rPr>
-          <w:b/>
-        </w:rPr>
-        <w:t>`year_month` is a reserved word in MySQL.</w:t>
-      </w:r>
-      <w:r>
-        <w:t xml:space="preserve"> </w:t>
-      </w:r>
-      <w:r>
-        <w:rPr>
-          <w:rFonts w:ascii="Consolas" w:hAnsi="Consolas"/>
-          <w:color w:val="2F6F9F"/>
-          <w:sz w:val="18"/>
-        </w:rPr>
-        <w:t>CREATE TABLE dates</w:t>
-      </w:r>
-      <w:r>
-        <w:t xml:space="preserve"> failed outright with a syntax error until it was backticked — and that only surfaced because a real MySQL server was installed and the import actually run, rather than the file being assumed correct.</w:t>
-      </w:r>
-    </w:p>
-    <w:p>
-      <w:r>
-        <w:t xml:space="preserve">Finish the section on the loader: the whole thing loads from </w:t>
-      </w:r>
-      <w:r>
-        <w:rPr>
-          <w:b/>
-        </w:rPr>
-        <w:t>one file</w:t>
-      </w:r>
-      <w:r>
-        <w:t xml:space="preserve">, </w:t>
-      </w:r>
-      <w:r>
-        <w:rPr>
-          <w:rFonts w:ascii="Consolas" w:hAnsi="Consolas"/>
-          <w:color w:val="2F6F9F"/>
-          <w:sz w:val="18"/>
-        </w:rPr>
-        <w:t>02_mysql_full_import.sql</w:t>
-      </w:r>
-      <w:r>
-        <w:t>, which creates the database, all eight tables and all the data, and ends with a verification block whose last row must read 1,194 rows, 6,182,639.00 in revenue, 547 order IDs and 57 complete months, with zero orphaned rows.</w:t>
-      </w:r>
-    </w:p>
-    <w:p>
-      <w:r>
-        <w:rPr>
-          <w:i/>
-        </w:rPr>
-        <w:t>Move straight on:</w:t>
-      </w:r>
-      <w:r>
-        <w:t xml:space="preserve"> with the database built, the questions could finally be asked.</w:t>
-      </w:r>
-    </w:p>
-    <w:p>
-      <w:pPr>
-        <w:pStyle w:val="Heading2"/>
-      </w:pPr>
-      <w:r>
-        <w:t>The eight queries</w:t>
-      </w:r>
-    </w:p>
-    <w:p>
-      <w:r>
-        <w:rPr>
-          <w:i/>
-        </w:rPr>
-        <w:t>Task 1.4 · on screen: Q3, Q5 and Q8 screenshots</w:t>
-      </w:r>
-    </w:p>
-    <w:p>
-      <w:pPr>
-        <w:pStyle w:val="ListBullet"/>
-      </w:pPr>
-      <w:r>
-        <w:t xml:space="preserve">Eight queries in four groups: two basic retrievals with </w:t>
-      </w:r>
-      <w:r>
-        <w:rPr>
-          <w:rFonts w:ascii="Consolas" w:hAnsi="Consolas"/>
-          <w:color w:val="2F6F9F"/>
-          <w:sz w:val="18"/>
-        </w:rPr>
-        <w:t>WHERE</w:t>
-      </w:r>
-      <w:r>
-        <w:t xml:space="preserve"> and </w:t>
-      </w:r>
-      <w:r>
-        <w:rPr>
-          <w:rFonts w:ascii="Consolas" w:hAnsi="Consolas"/>
-          <w:color w:val="2F6F9F"/>
-          <w:sz w:val="18"/>
-        </w:rPr>
-        <w:t>ORDER BY</w:t>
-      </w:r>
-      <w:r>
-        <w:t xml:space="preserve">, two aggregates with </w:t>
-      </w:r>
-      <w:r>
-        <w:rPr>
-          <w:rFonts w:ascii="Consolas" w:hAnsi="Consolas"/>
-          <w:color w:val="2F6F9F"/>
-          <w:sz w:val="18"/>
-        </w:rPr>
-        <w:t>GROUP BY</w:t>
-      </w:r>
-      <w:r>
-        <w:t>, two multi-table joins — each joining four tables — and two business-insight queries</w:t>
-      </w:r>
-    </w:p>
-    <w:p>
-      <w:pPr>
-        <w:pStyle w:val="ListBullet"/>
-      </w:pPr>
-      <w:r>
-        <w:t>Skip the mechanics; go to what they found, which is four things</w:t>
-      </w:r>
-    </w:p>
-    <w:p>
-      <w:r>
-        <w:rPr>
-          <w:b/>
-        </w:rPr>
-        <w:t>Finding one — growth stopped in 2022, and in a specific way.</w:t>
-      </w:r>
-      <w:r>
-        <w:t xml:space="preserve"> Query 3 aggregates by year, but on a </w:t>
-      </w:r>
-      <w:r>
-        <w:rPr>
-          <w:b/>
-        </w:rPr>
-        <w:t>per-month</w:t>
-      </w:r>
-      <w:r>
-        <w:t xml:space="preserve"> basis so the partial years cannot distort it. Revenue per month went </w:t>
-      </w:r>
-      <w:r>
-        <w:rPr>
-          <w:b/>
-        </w:rPr>
-        <w:t>92,934 in 2020 → 121,648 at the 2022 peak → 100,207 in 2024</w:t>
-      </w:r>
-      <w:r>
-        <w:t>. Meanwhile margin never left the 24-to-27% band and average order value never left the 5,008-to-5,444 band. That combination is the whole diagnosis: fewer orders, not cheaper or less profitable ones — which points at demand generation rather than at pricing.</w:t>
-      </w:r>
-    </w:p>
-    <w:p>
-      <w:r>
-        <w:rPr>
-          <w:b/>
-        </w:rPr>
-        <w:t>Finding two — one sub-category explains most of the gap.</w:t>
-      </w:r>
-      <w:r>
-        <w:t xml:space="preserve"> Queries 5 and 7 break the trend down. </w:t>
-      </w:r>
-      <w:r>
-        <w:rPr>
-          <w:b/>
-        </w:rPr>
-        <w:t>Printers lost 136,865 between 2023 and 2024, a 71.0% collapse</w:t>
-      </w:r>
-      <w:r>
-        <w:t xml:space="preserve"> — that single line item is over half the entire peak-to-2024 gap. Every Electronics sub-category fell, and the category as a whole is down </w:t>
-      </w:r>
-      <w:r>
-        <w:rPr>
-          <w:b/>
-        </w:rPr>
-        <w:t>40.8%</w:t>
-      </w:r>
-      <w:r>
-        <w:t xml:space="preserve">. Every Office Supplies sub-category grew; </w:t>
-      </w:r>
-      <w:r>
-        <w:rPr>
-          <w:b/>
-        </w:rPr>
-        <w:t>Paper is up 85,689, or 149.4%</w:t>
-      </w:r>
-      <w:r>
-        <w:t>.</w:t>
-      </w:r>
-    </w:p>
-    <w:p>
-      <w:r>
-        <w:t>Say why that matters: it is not a general slowdown. Two opposite trends are running at once, and the company-wide figure is their average, which describes neither. That is the single most useful thing Checkpoint 1 produced.</w:t>
-      </w:r>
-    </w:p>
-    <w:p>
-      <w:r>
-        <w:rPr>
-          <w:b/>
-        </w:rPr>
-        <w:t>Finding three — seasonality is category-specific.</w:t>
-      </w:r>
-      <w:r>
-        <w:t xml:space="preserve"> Queries 4 and 8. The blended figure says Q4 is the peak quarter. Split it out and Electronics actually peaks in </w:t>
-      </w:r>
-      <w:r>
-        <w:rPr>
-          <w:b/>
-        </w:rPr>
-        <w:t>Q2, at 30.79%</w:t>
-      </w:r>
-      <w:r>
-        <w:t xml:space="preserve"> of its annual revenue, while Furniture peaks in Q4 at </w:t>
-      </w:r>
-      <w:r>
-        <w:rPr>
-          <w:b/>
-        </w:rPr>
-        <w:t>30.84%</w:t>
-      </w:r>
-      <w:r>
-        <w:t xml:space="preserve"> and Office Supplies in Q4 at </w:t>
-      </w:r>
-      <w:r>
-        <w:rPr>
-          <w:b/>
-        </w:rPr>
-        <w:t>32.16%</w:t>
-      </w:r>
-      <w:r>
-        <w:t>. So a single blended planning curve is wrong for all three categories — it over-stocks Electronics in Q4 and under-stocks it in Q2.</w:t>
-      </w:r>
-    </w:p>
-    <w:p>
-      <w:r>
-        <w:rPr>
-          <w:b/>
-        </w:rPr>
-        <w:t>Finding four — geography is not a factor.</w:t>
-      </w:r>
-      <w:r>
-        <w:t xml:space="preserve"> Query 6. Across five years, state revenue spans only </w:t>
-      </w:r>
-      <w:r>
-        <w:rPr>
-          <w:b/>
-        </w:rPr>
-        <w:t>28%</w:t>
-      </w:r>
-      <w:r>
-        <w:t xml:space="preserve"> between highest and lowest, with no state trending against the others. Not every finding has to be a discovery — this one tells the business where </w:t>
-      </w:r>
-      <w:r>
-        <w:rPr>
-          <w:i/>
-        </w:rPr>
-        <w:t>not</w:t>
-      </w:r>
-      <w:r>
-        <w:t xml:space="preserve"> to spend its analytical effort.</w:t>
-      </w:r>
-    </w:p>
-    <w:p>
-      <w:r>
-        <w:rPr>
-          <w:b/>
-        </w:rPr>
-        <w:t>End the part on this line:</w:t>
-      </w:r>
-      <w:r>
-        <w:t xml:space="preserve"> that was Checkpoint 1 — what happened. Checkpoint 2 takes the same data into Excel and asks how strong the evidence is, and what can be predicted.</w:t>
-      </w:r>
-    </w:p>
-    <w:p>
-      <w:r>
-        <w:br w:type="page"/>
+        <w:t>So that was Checkpoint 1 — what happened. Checkpoint 2 takes the same data into Excel and asks how strong the evidence actually is, and what we can predict.</w:t>
       </w:r>
     </w:p>
     <w:p>
@@ -3205,15 +960,22 @@
         <w:rPr>
           <w:i/>
         </w:rPr>
-        <w:t>About 1.5 minutes. A short bridge between the two checkpoints — no need to say your name again.</w:t>
+        <w:t>[The workbook on screen — Cleaned Data sheet.]</w:t>
       </w:r>
     </w:p>
     <w:p>
-      <w:pPr>
-        <w:pStyle w:val="Heading2"/>
-      </w:pPr>
       <w:r>
-        <w:t>The workbook</w:t>
+        <w:t>The first thing Checkpoint 2 needed was the workbook itself, built on the same dataset, which the brief requires.</w:t>
+      </w:r>
+    </w:p>
+    <w:p>
+      <w:r>
+        <w:t>It has thirteen sheets. And there's one design decision in it worth explaining, because it's the one we'd defend if asked.</w:t>
+      </w:r>
+    </w:p>
+    <w:p>
+      <w:r>
+        <w:t>Everything in this workbook is live formulas. Not pasted values. About 1,724 of them. The cross-tabs are SUMIFS, COUNTIFS and AVERAGEIFS running against named ranges over the Cleaned Data sheet — so if a single row changed, every statistic downstream would change with it. Pasted values would have looked absolutely identical on the page, and proved nothing.</w:t>
       </w:r>
     </w:p>
     <w:p>
@@ -3221,127 +983,22 @@
         <w:rPr>
           <w:i/>
         </w:rPr>
-        <w:t>Task 2.1 · on screen: Cleaned Data, then a PivotChart</w:t>
+        <w:t>[Switch to a PivotChart.]</w:t>
       </w:r>
     </w:p>
     <w:p>
       <w:r>
-        <w:t>Pick the thread up: the first thing Checkpoint 2 needed was the workbook itself, built on the same dataset the brief requires.</w:t>
-      </w:r>
-    </w:p>
-    <w:p>
-      <w:pPr>
-        <w:pStyle w:val="ListBullet"/>
-      </w:pPr>
-      <w:r>
-        <w:t xml:space="preserve">The workbook has </w:t>
-      </w:r>
-      <w:r>
-        <w:rPr>
-          <w:b/>
-        </w:rPr>
-        <w:t>thirteen sheets</w:t>
-      </w:r>
-    </w:p>
-    <w:p>
-      <w:pPr>
-        <w:pStyle w:val="ListBullet"/>
-      </w:pPr>
-      <w:r>
-        <w:t xml:space="preserve">The one design decision worth defending: </w:t>
-      </w:r>
-      <w:r>
-        <w:rPr>
-          <w:b/>
-        </w:rPr>
-        <w:t>everything is live formulas, not pasted values</w:t>
-      </w:r>
-      <w:r>
-        <w:t xml:space="preserve"> — around </w:t>
-      </w:r>
-      <w:r>
-        <w:rPr>
-          <w:b/>
-        </w:rPr>
-        <w:t>1,724</w:t>
-      </w:r>
-      <w:r>
-        <w:t xml:space="preserve"> of them. The cross-tabs are </w:t>
-      </w:r>
-      <w:r>
-        <w:rPr>
-          <w:rFonts w:ascii="Consolas" w:hAnsi="Consolas"/>
-          <w:color w:val="2F6F9F"/>
-          <w:sz w:val="18"/>
-        </w:rPr>
-        <w:t>SUMIFS</w:t>
-      </w:r>
-      <w:r>
-        <w:t xml:space="preserve">, </w:t>
-      </w:r>
-      <w:r>
-        <w:rPr>
-          <w:rFonts w:ascii="Consolas" w:hAnsi="Consolas"/>
-          <w:color w:val="2F6F9F"/>
-          <w:sz w:val="18"/>
-        </w:rPr>
-        <w:t>COUNTIFS</w:t>
-      </w:r>
-      <w:r>
-        <w:t xml:space="preserve"> and </w:t>
-      </w:r>
-      <w:r>
-        <w:rPr>
-          <w:rFonts w:ascii="Consolas" w:hAnsi="Consolas"/>
-          <w:color w:val="2F6F9F"/>
-          <w:sz w:val="18"/>
-        </w:rPr>
-        <w:t>AVERAGEIFS</w:t>
-      </w:r>
-      <w:r>
-        <w:t xml:space="preserve"> against named ranges over the Cleaned Data sheet, so if a row changed, every statistic downstream would change with it. Pasted values would have looked identical and proved nothing</w:t>
-      </w:r>
-    </w:p>
-    <w:p>
-      <w:pPr>
-        <w:pStyle w:val="ListBullet"/>
-      </w:pPr>
-      <w:r>
-        <w:t xml:space="preserve">Beyond the brief's minimum there are </w:t>
-      </w:r>
-      <w:r>
-        <w:rPr>
-          <w:b/>
-        </w:rPr>
-        <w:t>three native PivotTables</w:t>
-      </w:r>
-      <w:r>
-        <w:t>, each with a bound PivotChart, sharing one pivot cache. The brief asks for three pivot tables and three pivot charts, and the SUMIFS cross-tabs alone would have been arguable</w:t>
-      </w:r>
-    </w:p>
-    <w:p>
-      <w:pPr>
-        <w:pStyle w:val="ListBullet"/>
-      </w:pPr>
-      <w:r>
-        <w:rPr>
-          <w:b/>
-        </w:rPr>
-        <w:t>Seven self-check formulas</w:t>
-      </w:r>
-      <w:r>
-        <w:t xml:space="preserve"> on the Read Me sheet. Each recomputes a headline figure by an independent route and prints OK or MISMATCH — the row count, the revenue total and the regression slope are all checked that way. If a cell is edited that should not have been, the workbook says so</w:t>
+        <w:t>Beyond what the brief asks for, there are three native PivotTables, each with a PivotChart bound to it, all sharing one pivot cache. The brief wants three pivot tables and three pivot charts, and the SUMIFS cross-tabs on their own would have been arguable.</w:t>
       </w:r>
     </w:p>
     <w:p>
       <w:r>
-        <w:rPr>
-          <w:b/>
-        </w:rPr>
-        <w:t>End the part on this line:</w:t>
+        <w:t>And there are seven self-check formulas on the Read Me sheet. Each one recalculates a headline figure by a completely independent route and prints either OK or MISMATCH. The row count, the revenue total, the regression slope — all checked that way. So if a cell gets edited that shouldn't have been, the workbook tells you.</w:t>
       </w:r>
+    </w:p>
+    <w:p>
       <w:r>
-        <w:t xml:space="preserve"> with the data laid out that way and checked, the statistics could be run on it.</w:t>
+        <w:t>With the data laid out that way and checked, we could run the statistics on it.</w:t>
       </w:r>
     </w:p>
     <w:p>
@@ -3362,15 +1019,44 @@
         <w:rPr>
           <w:i/>
         </w:rPr>
-        <w:t>About 6.5 minutes. Record straight through — four topics, one continuous talk.</w:t>
+        <w:t>[The Amount histogram on screen.]</w:t>
       </w:r>
     </w:p>
     <w:p>
-      <w:pPr>
-        <w:pStyle w:val="Heading2"/>
-      </w:pPr>
       <w:r>
-        <w:t>Descriptive statistics</w:t>
+        <w:t>I'm Mardy, and I'll take the analysis.</w:t>
+      </w:r>
+    </w:p>
+    <w:p>
+      <w:r>
+        <w:t>The first thing we asked of that data was simply what it looks like. Three numerical variables — Amount, Profit and Quantity — and for each one we have the mean, median and mode, standard deviation, variance, range, quartiles, the interquartile range and the coefficient of variation, plus a frequency distribution and a histogram.</w:t>
+      </w:r>
+    </w:p>
+    <w:p>
+      <w:r>
+        <w:t>Two things in there are worth your attention. The rest is table-filling.</w:t>
+      </w:r>
+    </w:p>
+    <w:p>
+      <w:r>
+        <w:rPr>
+          <w:b/>
+        </w:rPr>
+        <w:t>The first is that profit is far less predictable than revenue.</w:t>
+      </w:r>
+      <w:r>
+        <w:t xml:space="preserve"> Amount has a coefficient of variation of 54.2 percent. Profit has 82.9, and a skew of plus 0.94 — so it's both more variable and asymmetric, with a long right tail of a few very profitable lines. What that means in practice is that a revenue target does not manage profit. The two don't move together tightly enough for one to stand in for the other.</w:t>
+      </w:r>
+    </w:p>
+    <w:p>
+      <w:r>
+        <w:rPr>
+          <w:b/>
+        </w:rPr>
+        <w:t>The second is that the histogram itself is a finding.</w:t>
+      </w:r>
+      <w:r>
+        <w:t xml:space="preserve"> Amount is spread almost perfectly flat across its range. Real transaction values are right-skewed — lots of small sales, a few big ones. Flat is what a random number generator produces. So our own descriptive statistics independently confirm what Checkpoint 1 said about this data being synthetic, and we report that as evidence rather than hide it.</w:t>
       </w:r>
     </w:p>
     <w:p>
@@ -3378,28 +1064,12 @@
         <w:rPr>
           <w:i/>
         </w:rPr>
-        <w:t>Task 2.2 · on screen: the Amount histogram</w:t>
+        <w:t>[Switch to the scatter plots.]</w:t>
       </w:r>
     </w:p>
     <w:p>
       <w:r>
-        <w:t>Say your name, then pick the thread up: the first thing asked of that data was what it looks like.</w:t>
-      </w:r>
-    </w:p>
-    <w:p>
-      <w:pPr>
-        <w:pStyle w:val="ListBullet"/>
-      </w:pPr>
-      <w:r>
-        <w:t>Three numerical variables — Amount, Profit and Quantity — with mean, median, mode, standard deviation, variance, range, quartiles, IQR and coefficient of variation for each, plus a frequency distribution and a histogram</w:t>
-      </w:r>
-    </w:p>
-    <w:p>
-      <w:pPr>
-        <w:pStyle w:val="ListBullet"/>
-      </w:pPr>
-      <w:r>
-        <w:t>Say that two things in there are worth attention and the rest is table-filling</w:t>
+        <w:t>Next, whether the variables actually move together. Pearson's r on two required pairs plus a third for support, with scatter plots and fitted trendlines.</w:t>
       </w:r>
     </w:p>
     <w:p>
@@ -3407,46 +1077,10 @@
         <w:rPr>
           <w:b/>
         </w:rPr>
-        <w:t>One — profit is far less predictable than revenue.</w:t>
+        <w:t>The first pair is monthly order count against monthly revenue, and r is 0.9227.</w:t>
       </w:r>
       <w:r>
-        <w:t xml:space="preserve"> Amount has a coefficient of variation of </w:t>
-      </w:r>
-      <w:r>
-        <w:rPr>
-          <w:b/>
-        </w:rPr>
-        <w:t>54.2%</w:t>
-      </w:r>
-      <w:r>
-        <w:t xml:space="preserve">. Profit has </w:t>
-      </w:r>
-      <w:r>
-        <w:rPr>
-          <w:b/>
-        </w:rPr>
-        <w:t>82.9%</w:t>
-      </w:r>
-      <w:r>
-        <w:t xml:space="preserve">, and a skew of </w:t>
-      </w:r>
-      <w:r>
-        <w:rPr>
-          <w:b/>
-        </w:rPr>
-        <w:t>+0.94</w:t>
-      </w:r>
-      <w:r>
-        <w:t xml:space="preserve"> — more variable </w:t>
-      </w:r>
-      <w:r>
-        <w:rPr>
-          <w:i/>
-        </w:rPr>
-        <w:t>and</w:t>
-      </w:r>
-      <w:r>
-        <w:t xml:space="preserve"> asymmetric, with a long right tail of a few very profitable lines. Practically: a revenue target does not manage profit, because the two do not move together tightly enough for one to stand in for the other. That is the finding that shapes what the dashboard should be built on.</w:t>
+        <w:t xml:space="preserve"> Strongly positive — order count explains about 85 percent of the variation in monthly revenue. And notice what that does: Checkpoint 1 inferred that fewer orders were the mechanism. This measures it.</w:t>
       </w:r>
     </w:p>
     <w:p>
@@ -3454,18 +1088,26 @@
         <w:rPr>
           <w:b/>
         </w:rPr>
-        <w:t>Two — the histogram is the real finding.</w:t>
+        <w:t>The second pair is line quantity against line amount, and r is 0.0446, with a p-value of 0.123.</w:t>
       </w:r>
       <w:r>
-        <w:t xml:space="preserve"> Amount is distributed almost flat across its range. Real transaction values are right-skewed: many small sales, few large ones. A flat distribution is what a random number generator produces. So the descriptive statistics independently confirm the synthetic-data conclusion from Checkpoint 1 — reported as evidence rather than hidden.</w:t>
+        <w:t xml:space="preserve"> No relationship, and not statistically significant — we cannot reject the null hypothesis that the true correlation is zero. That's a negative result and we're keeping it, because it kills an obvious strategy: a "sell more units" target would not move revenue in this business. Price per line varies far more than units per line.</w:t>
       </w:r>
     </w:p>
     <w:p>
-      <w:pPr>
-        <w:pStyle w:val="Heading2"/>
-      </w:pPr>
       <w:r>
-        <w:t>Correlation</w:t>
+        <w:rPr>
+          <w:b/>
+        </w:rPr>
+        <w:t>And the supporting pair, amount against profit, gives r of 0.6753</w:t>
+      </w:r>
+      <w:r>
+        <w:t xml:space="preserve"> — about 46 percent of profit variation tracks revenue. Moderate, not strong. Which is the same conclusion as those coefficients of variation, reached a different way.</w:t>
+      </w:r>
+    </w:p>
+    <w:p>
+      <w:r>
+        <w:t>One caveat we have to state: correlation is not causation. Order count and revenue could both be driven by something we can't see in this data. What we can say is that the association is strong and consistent across 57 months — not that one causes the other.</w:t>
       </w:r>
     </w:p>
     <w:p>
@@ -3473,15 +1115,22 @@
         <w:rPr>
           <w:i/>
         </w:rPr>
-        <w:t>Task 2.3 · on screen: both scatter plots</w:t>
+        <w:t>[Switch to the ToolPak regression output.]</w:t>
       </w:r>
     </w:p>
     <w:p>
-      <w:pPr>
-        <w:pStyle w:val="ListBullet"/>
-      </w:pPr>
       <w:r>
-        <w:t>Two required pairs plus a third for support — Pearson's r, with scatter plots and fitted trendlines</w:t>
+        <w:t>So then we regressed monthly revenue on monthly order count, over those 57 complete months. The equation is:</w:t>
+      </w:r>
+    </w:p>
+    <w:p>
+      <w:r>
+        <w:t>Revenue equals negative 1,353.65, plus 5,224.25 times orders.</w:t>
+      </w:r>
+    </w:p>
+    <w:p>
+      <w:r>
+        <w:t>There are four things to read in that.</w:t>
       </w:r>
     </w:p>
     <w:p>
@@ -3489,28 +1138,10 @@
         <w:rPr>
           <w:b/>
         </w:rPr>
-        <w:t>Pair one — monthly order count against monthly revenue: r = 0.9227.</w:t>
+        <w:t>The slope is 5,224.25</w:t>
       </w:r>
       <w:r>
-        <w:t xml:space="preserve"> Strong positive. Order count explains about </w:t>
-      </w:r>
-      <w:r>
-        <w:rPr>
-          <w:b/>
-        </w:rPr>
-        <w:t>85%</w:t>
-      </w:r>
-      <w:r>
-        <w:t xml:space="preserve"> of the variation in monthly revenue. Checkpoint 1 </w:t>
-      </w:r>
-      <w:r>
-        <w:rPr>
-          <w:i/>
-        </w:rPr>
-        <w:t>inferred</w:t>
-      </w:r>
-      <w:r>
-        <w:t xml:space="preserve"> that fewer orders were the mechanism; this measures it.</w:t>
+        <w:t xml:space="preserve"> — one additional order in a month is associated with about 5,224 more revenue that month. And here's the check that makes it convincing: the mean order value in our data is 5,178.09. The slope lands within 0.9 percent of it. The regression rediscovered the average order value without ever being told what it was.</w:t>
       </w:r>
     </w:p>
     <w:p>
@@ -3518,19 +1149,10 @@
         <w:rPr>
           <w:b/>
         </w:rPr>
-        <w:t>Pair two — line quantity against line amount: r = 0.0446, p = 0.123.</w:t>
+        <w:t>R-squared is 0.8514</w:t>
       </w:r>
       <w:r>
-        <w:t xml:space="preserve"> No relationship, and not statistically significant, so the null hypothesis that the true correlation is zero cannot be rejected. Stress that this is a </w:t>
-      </w:r>
-      <w:r>
-        <w:rPr>
-          <w:b/>
-        </w:rPr>
-        <w:t>negative result being kept</w:t>
-      </w:r>
-      <w:r>
-        <w:t>, because it kills an obvious strategy: a "sell more units" target would not move revenue in this business. Price per line varies far more than units per line.</w:t>
+        <w:t xml:space="preserve"> — order count explains 85 percent of the month-to-month variation in revenue.</w:t>
       </w:r>
     </w:p>
     <w:p>
@@ -3538,41 +1160,31 @@
         <w:rPr>
           <w:b/>
         </w:rPr>
-        <w:t>Supporting pair — amount against profit: r = 0.6753</w:t>
+        <w:t>For significance, t is 17.75 on 55 degrees of freedom, and p is 1.98 times ten to the negative 24.</w:t>
       </w:r>
       <w:r>
-        <w:t xml:space="preserve">, so about </w:t>
+        <w:t xml:space="preserve"> So the slope is not zero, and that's not a marginal result.</w:t>
       </w:r>
+    </w:p>
+    <w:p>
       <w:r>
         <w:rPr>
           <w:b/>
         </w:rPr>
-        <w:t>46%</w:t>
+        <w:t>And the intercept, negative 1,353.65, isn't meaningful</w:t>
       </w:r>
       <w:r>
-        <w:t xml:space="preserve"> of profit variation tracks revenue. Moderate, not strong — the same conclusion as the coefficients of variation a moment ago, reached a different way.</w:t>
+        <w:t xml:space="preserve"> — zero orders can't produce negative revenue. It's where the fitted line crosses the axis, extrapolated outside our data, so we don't interpret it.</w:t>
       </w:r>
     </w:p>
     <w:p>
       <w:r>
-        <w:t xml:space="preserve">Then the caveat, said explicitly: </w:t>
-      </w:r>
-      <w:r>
-        <w:rPr>
-          <w:b/>
-        </w:rPr>
-        <w:t>correlation is not causation.</w:t>
-      </w:r>
-      <w:r>
-        <w:t xml:space="preserve"> Order count and revenue could both be driven by something else — market conditions, a campaign not visible in this data. What can be said is that the association is strong and consistent over 57 months, not that one causes the other.</w:t>
+        <w:t>Then the forecast. The company is running about four orders per month below its 2022 level. At 5,224 per order, closing that gap is worth roughly 250,000 a year. And Checkpoint 1 arrived at 257,297 by a completely different route — just summing the actual category shortfalls. Two independent methods landing within 3 percent of each other. That's the strongest single piece of evidence in this project.</w:t>
       </w:r>
     </w:p>
     <w:p>
-      <w:pPr>
-        <w:pStyle w:val="Heading2"/>
-      </w:pPr>
       <w:r>
-        <w:t>Regression</w:t>
+        <w:t>We list six limitations. The three that matter most: it's a single predictor, so it says nothing about why orders fell; it's fitted on 57 monthly points, which isn't many; and it shouldn't be extrapolated beyond the range of order counts we actually observed.</w:t>
       </w:r>
     </w:p>
     <w:p>
@@ -3580,161 +1192,32 @@
         <w:rPr>
           <w:i/>
         </w:rPr>
-        <w:t>Task 2.4 · on screen: the ToolPak output</w:t>
-      </w:r>
-    </w:p>
-    <w:p>
-      <w:pPr>
-        <w:pStyle w:val="ListBullet"/>
-      </w:pPr>
-      <w:r>
-        <w:t>Monthly revenue regressed on monthly order count, over the 57 complete months</w:t>
+        <w:t>[Switch to Figure 2, with the regime shading.]</w:t>
       </w:r>
     </w:p>
     <w:p>
       <w:r>
-        <w:t>State the equation clearly, and slowly enough to be heard:</w:t>
+        <w:t>Last, the trend itself — which is what our topic is named after, so I want to be precise about what we found and what we didn't.</w:t>
       </w:r>
     </w:p>
     <w:p>
       <w:r>
-        <w:rPr>
-          <w:b/>
-        </w:rPr>
-        <w:t>Revenue = −1,353.65 + 5,224.25 × Orders</w:t>
+        <w:t>The trend is real, and this is the finding: the series runs in two regimes. Growth from 2020 to 2022 — 92,934 up to 121,648 per month, so plus 30.9 percent. Then a plateau from 2022 to 2024, down to 100,207, which is minus 17.6 percent. You can see both here; the shading marks where one ends and the other begins.</w:t>
       </w:r>
     </w:p>
     <w:p>
       <w:r>
-        <w:t>Then read it properly, four parts:</w:t>
-      </w:r>
-    </w:p>
-    <w:p>
-      <w:pPr>
-        <w:pStyle w:val="ListBullet"/>
-      </w:pPr>
-      <w:r>
-        <w:rPr>
-          <w:b/>
-        </w:rPr>
-        <w:t>The slope, 5,224.25.</w:t>
-      </w:r>
-      <w:r>
-        <w:t xml:space="preserve"> One additional order in a month is associated with about 5,224 more revenue that month. Here is the check that makes it convincing: the mean order value in the data is </w:t>
-      </w:r>
-      <w:r>
-        <w:rPr>
-          <w:b/>
-        </w:rPr>
-        <w:t>5,178.09</w:t>
-      </w:r>
-      <w:r>
-        <w:t xml:space="preserve">. The slope lands within </w:t>
-      </w:r>
-      <w:r>
-        <w:rPr>
-          <w:b/>
-        </w:rPr>
-        <w:t>0.9%</w:t>
-      </w:r>
-      <w:r>
-        <w:t xml:space="preserve"> of it — the regression rediscovered the average order value without being told it</w:t>
-      </w:r>
-    </w:p>
-    <w:p>
-      <w:pPr>
-        <w:pStyle w:val="ListBullet"/>
-      </w:pPr>
-      <w:r>
-        <w:rPr>
-          <w:b/>
-        </w:rPr>
-        <w:t>R² = 0.8514.</w:t>
-      </w:r>
-      <w:r>
-        <w:t xml:space="preserve"> Order count explains 85% of the month-to-month variation in revenue</w:t>
-      </w:r>
-    </w:p>
-    <w:p>
-      <w:pPr>
-        <w:pStyle w:val="ListBullet"/>
-      </w:pPr>
-      <w:r>
-        <w:rPr>
-          <w:b/>
-        </w:rPr>
-        <w:t>Significance: t = 17.75, 55 degrees of freedom, p = 1.98 × 10⁻²⁴.</w:t>
-      </w:r>
-      <w:r>
-        <w:t xml:space="preserve"> The slope is not zero, and that is not a marginal result</w:t>
-      </w:r>
-    </w:p>
-    <w:p>
-      <w:pPr>
-        <w:pStyle w:val="ListBullet"/>
-      </w:pPr>
-      <w:r>
-        <w:rPr>
-          <w:b/>
-        </w:rPr>
-        <w:t>The intercept, −1,353.65, is not meaningful.</w:t>
-      </w:r>
-      <w:r>
-        <w:t xml:space="preserve"> Zero orders cannot produce negative revenue. It is where the fitted line crosses the axis, extrapolated outside the range of the data, and it is not interpreted</w:t>
+        <w:t>So the obvious question is, why isn't there a growth rate in our forecast?</w:t>
       </w:r>
     </w:p>
     <w:p>
       <w:r>
-        <w:t xml:space="preserve">Then the forecast the brief asks for: the company is running about </w:t>
-      </w:r>
-      <w:r>
-        <w:rPr>
-          <w:b/>
-        </w:rPr>
-        <w:t>four orders per month</w:t>
-      </w:r>
-      <w:r>
-        <w:t xml:space="preserve"> below its 2022 level. At 5,224 per order, closing that gap is worth roughly </w:t>
-      </w:r>
-      <w:r>
-        <w:rPr>
-          <w:b/>
-        </w:rPr>
-        <w:t>250,000 a year</w:t>
-      </w:r>
-      <w:r>
-        <w:t xml:space="preserve">. Checkpoint 1 arrived at </w:t>
-      </w:r>
-      <w:r>
-        <w:rPr>
-          <w:b/>
-        </w:rPr>
-        <w:t>257,297</w:t>
-      </w:r>
-      <w:r>
-        <w:t xml:space="preserve"> by an entirely different route — summing the actual category shortfalls. Two independent methods landing within 3% of each other is the strongest single piece of evidence in this project. Say that sentence deliberately; it is the high point of the whole recording.</w:t>
+        <w:t>Because we tested for one, and there isn't a single one. We fitted a straight line across all 57 months and it explains under 1 percent of the variation — R-squared of 0.0078, p-value of 0.515. We ran it on four different windows and got the same answer every time.</w:t>
       </w:r>
     </w:p>
     <w:p>
       <w:r>
-        <w:t xml:space="preserve">Close the section with limitations — six are listed; name the three that matter: single predictor, so it says nothing about </w:t>
-      </w:r>
-      <w:r>
-        <w:rPr>
-          <w:i/>
-        </w:rPr>
-        <w:t>why</w:t>
-      </w:r>
-      <w:r>
-        <w:t xml:space="preserve"> orders fell; fitted on 57 monthly points, which is not many; and it should not be extrapolated beyond the observed range of order counts.</w:t>
-      </w:r>
-    </w:p>
-    <w:p>
-      <w:pPr>
-        <w:pStyle w:val="Heading2"/>
-      </w:pPr>
-      <w:r>
-        <w:t>Trend and seasonality</w:t>
+        <w:t>Here's the interpretation, and this is the part that matters. That result is not "there's no trend." It's "no single straight line fits both regimes" — which is exactly what you'd expect from a series that rises and then flattens. The up-slope and the flat part cancel each other out, and the average comes out nearly horizontal. Reporting that honestly, and refusing to project a growth rate we can't demonstrate, is the correct handling. Projecting one anyway would be inventing a number.</w:t>
       </w:r>
     </w:p>
     <w:p>
@@ -3742,230 +1225,32 @@
         <w:rPr>
           <w:i/>
         </w:rPr>
-        <w:t>Task 2.5 · on screen: Figure 2 with the shading, then the forecast chart</w:t>
+        <w:t>[Switch to the forecast chart.]</w:t>
       </w:r>
     </w:p>
     <w:p>
       <w:r>
-        <w:t>This is the section the topic is named after. Be precise about what was and was not found, and do not rush the middle of it.</w:t>
-      </w:r>
-    </w:p>
-    <w:p>
-      <w:pPr>
-        <w:pStyle w:val="ListBullet"/>
-      </w:pPr>
-      <w:r>
-        <w:rPr>
-          <w:b/>
-        </w:rPr>
-        <w:t>The trend is real, and it is the finding: the series runs in two regimes.</w:t>
-      </w:r>
-      <w:r>
-        <w:t xml:space="preserve"> Growth from 2020 to 2022 — </w:t>
-      </w:r>
-      <w:r>
-        <w:rPr>
-          <w:b/>
-        </w:rPr>
-        <w:t>92,934 up to 121,648</w:t>
-      </w:r>
-      <w:r>
-        <w:t xml:space="preserve"> per month, </w:t>
-      </w:r>
-      <w:r>
-        <w:rPr>
-          <w:b/>
-        </w:rPr>
-        <w:t>+30.9%</w:t>
-      </w:r>
-      <w:r>
-        <w:t xml:space="preserve">. Then a plateau from 2022 to 2024 — down to </w:t>
-      </w:r>
-      <w:r>
-        <w:rPr>
-          <w:b/>
-        </w:rPr>
-        <w:t>100,207</w:t>
-      </w:r>
-      <w:r>
-        <w:t xml:space="preserve">, </w:t>
-      </w:r>
-      <w:r>
-        <w:rPr>
-          <w:b/>
-        </w:rPr>
-        <w:t>−17.6%</w:t>
-      </w:r>
-      <w:r>
-        <w:t>. Both are visible on Figure 2; the shading marks where one ends and the other begins</w:t>
-      </w:r>
-    </w:p>
-    <w:p>
-      <w:pPr>
-        <w:pStyle w:val="ListBullet"/>
-      </w:pPr>
-      <w:r>
-        <w:t xml:space="preserve">Then raise the obvious question and answer it: </w:t>
-      </w:r>
-      <w:r>
-        <w:rPr>
-          <w:i/>
-        </w:rPr>
-        <w:t>so why is there no growth rate in the forecast?</w:t>
-      </w:r>
-      <w:r>
-        <w:t xml:space="preserve"> Because one was tested for and there is not a single one. A straight line fitted across all 57 months explains </w:t>
-      </w:r>
-      <w:r>
-        <w:rPr>
-          <w:b/>
-        </w:rPr>
-        <w:t>under 1% of the variation — R² = 0.0078, p = 0.515.</w:t>
-      </w:r>
-      <w:r>
-        <w:t xml:space="preserve"> It was run on four different windows and gave the same answer each time</w:t>
-      </w:r>
-    </w:p>
-    <w:p>
-      <w:pPr>
-        <w:pStyle w:val="ListBullet"/>
-      </w:pPr>
-      <w:r>
-        <w:t xml:space="preserve">Now the interpretation, which is the part that matters: that result is </w:t>
-      </w:r>
-      <w:r>
-        <w:rPr>
-          <w:b/>
-        </w:rPr>
-        <w:t>not</w:t>
-      </w:r>
-      <w:r>
-        <w:t xml:space="preserve"> "no trend". It is "</w:t>
-      </w:r>
-      <w:r>
-        <w:rPr>
-          <w:b/>
-        </w:rPr>
-        <w:t>no single straight line fits both regimes</w:t>
-      </w:r>
-      <w:r>
-        <w:t>", which is exactly what you would expect from a series that rises and then flattens — the up-slope and the flat cancel out, and the average of the two is nearly horizontal. Reporting that honestly, and refusing to project a growth rate that cannot be demonstrated, is the correct handling. Projecting one anyway would be inventing a number</w:t>
-      </w:r>
-    </w:p>
-    <w:p>
-      <w:pPr>
-        <w:pStyle w:val="ListBullet"/>
-      </w:pPr>
-      <w:r>
-        <w:t xml:space="preserve">So the forecast is built from </w:t>
-      </w:r>
-      <w:r>
-        <w:rPr>
-          <w:b/>
-        </w:rPr>
-        <w:t>level and seasonality</w:t>
-      </w:r>
-      <w:r>
-        <w:t xml:space="preserve"> instead. Monthly seasonal indices were computed — </w:t>
-      </w:r>
-      <w:r>
-        <w:rPr>
-          <w:b/>
-        </w:rPr>
-        <w:t>January 0.679, October 1.229, December 1.273</w:t>
-      </w:r>
-      <w:r>
-        <w:t xml:space="preserve"> — and applied to the recent level to project the six months from January to June 2025</w:t>
+        <w:t>So the forecast is built on level and seasonality instead. We computed monthly seasonal indices — January comes out at 0.679, October at 1.229, December at 1.273 — and applied them to the recent level to project six months forward, January to June 2025.</w:t>
       </w:r>
     </w:p>
     <w:p>
       <w:r>
-        <w:t>Then the honest check, which is the part most worth having on the recording:</w:t>
-      </w:r>
-    </w:p>
-    <w:p>
-      <w:pPr>
-        <w:pStyle w:val="ListBullet"/>
-      </w:pPr>
-      <w:r>
-        <w:t xml:space="preserve">The two months that could be checked were held out, and the seasonal forecast was compared against a naive flat average. </w:t>
-      </w:r>
-      <w:r>
-        <w:rPr>
-          <w:b/>
-        </w:rPr>
-        <w:t>The seasonal forecast lost.</w:t>
-      </w:r>
-      <w:r>
-        <w:t xml:space="preserve"> Mean absolute error </w:t>
-      </w:r>
-      <w:r>
-        <w:rPr>
-          <w:b/>
-        </w:rPr>
-        <w:t>22.7%</w:t>
-      </w:r>
-      <w:r>
-        <w:t xml:space="preserve"> against the flat average's </w:t>
-      </w:r>
-      <w:r>
-        <w:rPr>
-          <w:b/>
-        </w:rPr>
-        <w:t>14.9%</w:t>
-      </w:r>
-      <w:r>
-        <w:t>. It ranks fifth of the eight methods tested</w:t>
-      </w:r>
-    </w:p>
-    <w:p>
-      <w:pPr>
-        <w:pStyle w:val="ListBullet"/>
-      </w:pPr>
-      <w:r>
-        <w:t xml:space="preserve">The reason is visible: </w:t>
-      </w:r>
-      <w:r>
-        <w:rPr>
-          <w:b/>
-        </w:rPr>
-        <w:t>January 2025 came in at 112,906 against a prediction of 68,853.</w:t>
-      </w:r>
-      <w:r>
-        <w:t xml:space="preserve"> January's index says January is the weakest month of the year, and this January was not</w:t>
-      </w:r>
-    </w:p>
-    <w:p>
-      <w:pPr>
-        <w:pStyle w:val="ListBullet"/>
-      </w:pPr>
-      <w:r>
-        <w:t xml:space="preserve">Answer </w:t>
-      </w:r>
-      <w:r>
-        <w:rPr>
-          <w:i/>
-        </w:rPr>
-        <w:t>why keep the method, then?</w:t>
-      </w:r>
-      <w:r>
-        <w:t xml:space="preserve"> Because switching on the strength of two observations is overfitting the holdout — you would be choosing the model that happened to win on a two-month sample, which is not evidence. The result is reported, the method is kept, and the forecast's reliability over this horizon is stated plainly as weak. The reliability discussion the brief asks for is not a formality here: the error was measured, and it is 22.7%</w:t>
+        <w:t>And then we checked it, which is the part I'd most want you to see. We held out the two months we could actually verify and compared our seasonal forecast against a naive flat average. The seasonal forecast lost. Mean absolute error of 22.7 percent, against the flat average's 14.9. It ranks fifth out of the eight methods we tested.</w:t>
       </w:r>
     </w:p>
     <w:p>
       <w:r>
-        <w:rPr>
-          <w:b/>
-        </w:rPr>
-        <w:t>End the part on this line:</w:t>
-      </w:r>
-      <w:r>
-        <w:t xml:space="preserve"> building that monthly series also turned up something nobody expected — and it was a mistake of our own.</w:t>
+        <w:t>You can see why. January 2025 came in at 112,906, against our prediction of 68,853. Our index says January is the weakest month of the year — and this January wasn't.</w:t>
       </w:r>
     </w:p>
     <w:p>
       <w:r>
-        <w:br w:type="page"/>
+        <w:t>So why keep the method? Because switching on the strength of two observations is overfitting the holdout. You'd be picking whichever model happened to win on a two-month sample, and that isn't evidence. So we report the result, we keep the method, and we say plainly that our forecast reliability over this horizon is weak. The reliability discussion the brief asks for isn't a formality here — we measured our own error, and it's 22.7 percent.</w:t>
+      </w:r>
+    </w:p>
+    <w:p>
+      <w:r>
+        <w:t>Building that monthly series also turned up something nobody expected. And it was a mistake of our own.</w:t>
       </w:r>
     </w:p>
     <w:p>
@@ -3981,15 +1266,35 @@
         <w:rPr>
           <w:i/>
         </w:rPr>
-        <w:t>About 6 minutes. Record straight through — no need to say your name again.</w:t>
+        <w:t>[The correction table from the Checkpoint 2 report on screen.]</w:t>
+      </w:r>
+    </w:p>
+    <w:p>
+      <w:r>
+        <w:t>This part we're raising ourselves, because volunteering an error is worth more than having somebody find it.</w:t>
+      </w:r>
+    </w:p>
+    <w:p>
+      <w:r>
+        <w:t>Building the Checkpoint 2 monthly series exposed a mistake in our own Checkpoint</w:t>
       </w:r>
     </w:p>
     <w:p>
       <w:pPr>
-        <w:pStyle w:val="Heading2"/>
+        <w:pStyle w:val="ListNumber"/>
       </w:pPr>
       <w:r>
-        <w:t>The correction</w:t>
+        <w:t>We treated 2020 as a full year. But the file starts on 22 March, so 2020 only holds nine months of trading. That overstated our 2020-to-2022 growth as 69.9 percent, when the like-for-like figure is 30.9. It also distorted March's seasonal index, pulling it from 1.025 down to 0.876.</w:t>
+      </w:r>
+    </w:p>
+    <w:p>
+      <w:r>
+        <w:t>What it affected was that growth figure and that one index. What it did not affect: the minus 17.6 percent decline from peak to 2024, because those are both full years. Printers down 136,865. Electronics down 40.8 percent. The category-specific seasonality. The geography finding. All of that stands.</w:t>
+      </w:r>
+    </w:p>
+    <w:p>
+      <w:r>
+        <w:t>So the central thesis is unchanged — one supporting number was overstated. Checkpoint 1 has been reissued with an is_complete_month flag and a per-month column in Query 3, so the mistake can't happen again. And it's documented in the Checkpoint 2 report either way.</w:t>
       </w:r>
     </w:p>
     <w:p>
@@ -3997,441 +1302,12 @@
         <w:rPr>
           <w:i/>
         </w:rPr>
-        <w:t>On screen: the correction table from the Checkpoint 2 report</w:t>
+        <w:t>[Switch to the findings summary.]</w:t>
       </w:r>
     </w:p>
     <w:p>
       <w:r>
-        <w:t>This section exists because volunteering an error is worth more than having it found. Do not soften it.</w:t>
-      </w:r>
-    </w:p>
-    <w:p>
-      <w:pPr>
-        <w:pStyle w:val="ListBullet"/>
-      </w:pPr>
-      <w:r>
-        <w:t xml:space="preserve">Building the Checkpoint 2 monthly series exposed an </w:t>
-      </w:r>
-      <w:r>
-        <w:rPr>
-          <w:b/>
-        </w:rPr>
-        <w:t>error in our own Checkpoint 1</w:t>
-      </w:r>
-    </w:p>
-    <w:p>
-      <w:pPr>
-        <w:pStyle w:val="ListBullet"/>
-      </w:pPr>
-      <w:r>
-        <w:t xml:space="preserve">2020 was treated as a full year. The file starts 22 March, so 2020 holds only </w:t>
-      </w:r>
-      <w:r>
-        <w:rPr>
-          <w:b/>
-        </w:rPr>
-        <w:t>nine months</w:t>
-      </w:r>
-      <w:r>
-        <w:t xml:space="preserve">. That overstated 2020-to-2022 growth as </w:t>
-      </w:r>
-      <w:r>
-        <w:rPr>
-          <w:b/>
-        </w:rPr>
-        <w:t>69.9%</w:t>
-      </w:r>
-      <w:r>
-        <w:t xml:space="preserve"> when the like-for-like figure is </w:t>
-      </w:r>
-      <w:r>
-        <w:rPr>
-          <w:b/>
-        </w:rPr>
-        <w:t>30.9%</w:t>
-      </w:r>
-      <w:r>
-        <w:t>. It also distorted March's seasonal index, from 1.025 down to 0.876</w:t>
-      </w:r>
-    </w:p>
-    <w:p>
-      <w:pPr>
-        <w:pStyle w:val="ListBullet"/>
-      </w:pPr>
-      <w:r>
-        <w:t>What it did and did not touch:</w:t>
-      </w:r>
-    </w:p>
-    <w:tbl>
-      <w:tblPr>
-        <w:tblStyle w:val="LightGrid-Accent1"/>
-        <w:tblW w:type="auto" w:w="0"/>
-        <w:jc w:val="center"/>
-        <w:tblLayout w:type="autofit"/>
-        <w:tblLook w:firstColumn="1" w:firstRow="1" w:lastColumn="0" w:lastRow="0" w:noHBand="0" w:noVBand="1" w:val="04A0"/>
-      </w:tblPr>
-      <w:tblGrid>
-        <w:gridCol w:w="4680"/>
-        <w:gridCol w:w="4680"/>
-      </w:tblGrid>
-      <w:tr>
-        <w:tc>
-          <w:tcPr>
-            <w:tcW w:type="dxa" w:w="4680"/>
-          </w:tcPr>
-          <w:p>
-            <w:r>
-              <w:rPr>
-                <w:b/>
-              </w:rPr>
-            </w:r>
-            <w:r>
-              <w:rPr>
-                <w:b/>
-              </w:rPr>
-              <w:t>Affected</w:t>
-            </w:r>
-          </w:p>
-        </w:tc>
-        <w:tc>
-          <w:tcPr>
-            <w:tcW w:type="dxa" w:w="4680"/>
-          </w:tcPr>
-          <w:p>
-            <w:r>
-              <w:rPr>
-                <w:b/>
-              </w:rPr>
-            </w:r>
-            <w:r>
-              <w:rPr>
-                <w:b/>
-              </w:rPr>
-              <w:t>Unaffected</w:t>
-            </w:r>
-          </w:p>
-        </w:tc>
-      </w:tr>
-      <w:tr>
-        <w:tc>
-          <w:tcPr>
-            <w:tcW w:type="dxa" w:w="4680"/>
-          </w:tcPr>
-          <w:p>
-            <w:pPr>
-              <w:spacing w:line="240" w:lineRule="auto"/>
-            </w:pPr>
-            <w:r>
-              <w:rPr>
-                <w:sz w:val="18"/>
-              </w:rPr>
-            </w:r>
-            <w:r>
-              <w:rPr>
-                <w:sz w:val="18"/>
-              </w:rPr>
-              <w:t>The 2020→2022 growth figure</w:t>
-            </w:r>
-          </w:p>
-        </w:tc>
-        <w:tc>
-          <w:tcPr>
-            <w:tcW w:type="dxa" w:w="4680"/>
-          </w:tcPr>
-          <w:p>
-            <w:pPr>
-              <w:spacing w:line="240" w:lineRule="auto"/>
-            </w:pPr>
-            <w:r>
-              <w:rPr>
-                <w:sz w:val="18"/>
-              </w:rPr>
-            </w:r>
-            <w:r>
-              <w:rPr>
-                <w:sz w:val="18"/>
-              </w:rPr>
-              <w:t>The −17.6% peak-to-2024 decline — both are full years</w:t>
-            </w:r>
-          </w:p>
-        </w:tc>
-      </w:tr>
-      <w:tr>
-        <w:tc>
-          <w:tcPr>
-            <w:tcW w:type="dxa" w:w="4680"/>
-          </w:tcPr>
-          <w:p>
-            <w:pPr>
-              <w:spacing w:line="240" w:lineRule="auto"/>
-            </w:pPr>
-            <w:r>
-              <w:rPr>
-                <w:sz w:val="18"/>
-              </w:rPr>
-            </w:r>
-            <w:r>
-              <w:rPr>
-                <w:sz w:val="18"/>
-              </w:rPr>
-              <w:t>March's seasonal index</w:t>
-            </w:r>
-          </w:p>
-        </w:tc>
-        <w:tc>
-          <w:tcPr>
-            <w:tcW w:type="dxa" w:w="4680"/>
-          </w:tcPr>
-          <w:p>
-            <w:pPr>
-              <w:spacing w:line="240" w:lineRule="auto"/>
-            </w:pPr>
-            <w:r>
-              <w:rPr>
-                <w:sz w:val="18"/>
-              </w:rPr>
-            </w:r>
-            <w:r>
-              <w:rPr>
-                <w:sz w:val="18"/>
-              </w:rPr>
-              <w:t>Printers −136,865; Electronics −40.8%</w:t>
-            </w:r>
-          </w:p>
-        </w:tc>
-      </w:tr>
-      <w:tr>
-        <w:tc>
-          <w:tcPr>
-            <w:tcW w:type="dxa" w:w="4680"/>
-          </w:tcPr>
-          <w:p>
-            <w:pPr>
-              <w:spacing w:line="240" w:lineRule="auto"/>
-            </w:pPr>
-            <w:r>
-              <w:rPr>
-                <w:sz w:val="18"/>
-              </w:rPr>
-            </w:r>
-          </w:p>
-        </w:tc>
-        <w:tc>
-          <w:tcPr>
-            <w:tcW w:type="dxa" w:w="4680"/>
-          </w:tcPr>
-          <w:p>
-            <w:pPr>
-              <w:spacing w:line="240" w:lineRule="auto"/>
-            </w:pPr>
-            <w:r>
-              <w:rPr>
-                <w:sz w:val="18"/>
-              </w:rPr>
-            </w:r>
-            <w:r>
-              <w:rPr>
-                <w:sz w:val="18"/>
-              </w:rPr>
-              <w:t>Category-specific seasonality; the geography finding</w:t>
-            </w:r>
-          </w:p>
-        </w:tc>
-      </w:tr>
-    </w:tbl>
-    <w:p>
-      <w:pPr>
-        <w:spacing w:after="200" w:line="240" w:lineRule="auto"/>
-        <w:jc w:val="center"/>
-      </w:pPr>
-      <w:r>
-        <w:rPr>
-          <w:i/>
-          <w:color w:val="7B8994"/>
-          <w:sz w:val="20"/>
-        </w:rPr>
-        <w:t>Table 4. The correction</w:t>
-      </w:r>
-    </w:p>
-    <w:p>
-      <w:pPr>
-        <w:pStyle w:val="ListBullet"/>
-      </w:pPr>
-      <w:r>
-        <w:t>The central thesis is unchanged; one supporting number was overstated</w:t>
-      </w:r>
-    </w:p>
-    <w:p>
-      <w:pPr>
-        <w:pStyle w:val="ListBullet"/>
-      </w:pPr>
-      <w:r>
-        <w:t xml:space="preserve">Checkpoint 1 was reissued with an </w:t>
-      </w:r>
-      <w:r>
-        <w:rPr>
-          <w:rFonts w:ascii="Consolas" w:hAnsi="Consolas"/>
-          <w:color w:val="2F6F9F"/>
-          <w:sz w:val="18"/>
-        </w:rPr>
-        <w:t>is_complete_month</w:t>
-      </w:r>
-      <w:r>
-        <w:t xml:space="preserve"> flag and a per-month column in Query 3, so the mistake cannot recur, and it is documented in the Checkpoint 2 report either way</w:t>
-      </w:r>
-    </w:p>
-    <w:p>
-      <w:pPr>
-        <w:pStyle w:val="Heading2"/>
-      </w:pPr>
-      <w:r>
-        <w:t>What it means for the business</w:t>
-      </w:r>
-    </w:p>
-    <w:p>
-      <w:r>
-        <w:rPr>
-          <w:i/>
-        </w:rPr>
-        <w:t>On screen: the findings summary</w:t>
-      </w:r>
-    </w:p>
-    <w:p>
-      <w:r>
-        <w:t>With that correction made, here is what the analysis actually tells the business. Three recommendations, each tied to a measurement rather than an opinion:</w:t>
-      </w:r>
-    </w:p>
-    <w:p>
-      <w:pPr>
-        <w:pStyle w:val="ListBullet"/>
-      </w:pPr>
-      <w:r>
-        <w:rPr>
-          <w:b/>
-        </w:rPr>
-        <w:t>Track order count, not revenue.</w:t>
-      </w:r>
-      <w:r>
-        <w:t xml:space="preserve"> Revenue is the lagging indicator; order count is what drives it, r = 0.923, and it is the thing the business can act on</w:t>
-      </w:r>
-    </w:p>
-    <w:p>
-      <w:pPr>
-        <w:pStyle w:val="ListBullet"/>
-      </w:pPr>
-      <w:r>
-        <w:rPr>
-          <w:b/>
-        </w:rPr>
-        <w:t>Plan seasonality by category, not company-wide.</w:t>
-      </w:r>
-      <w:r>
-        <w:t xml:space="preserve"> The blended curve is wrong for all three categories — Electronics peaks in Q2, Furniture and Office Supplies in Q4. A single planning curve over-stocks Electronics in Q4 and under-stocks it in Q2</w:t>
-      </w:r>
-    </w:p>
-    <w:p>
-      <w:pPr>
-        <w:pStyle w:val="ListBullet"/>
-      </w:pPr>
-      <w:r>
-        <w:rPr>
-          <w:b/>
-        </w:rPr>
-        <w:t>Investigate Printers first.</w:t>
-      </w:r>
-      <w:r>
-        <w:t xml:space="preserve"> One sub-category, </w:t>
-      </w:r>
-      <w:r>
-        <w:rPr>
-          <w:b/>
-        </w:rPr>
-        <w:t>136,865</w:t>
-      </w:r>
-      <w:r>
-        <w:t xml:space="preserve"> lost, over half the entire gap. Whether that is supply, competition, or a category in structural decline is not something this dataset can answer — but it tells us where to look, and that is what the analysis was for</w:t>
-      </w:r>
-    </w:p>
-    <w:p>
-      <w:pPr>
-        <w:pStyle w:val="Heading2"/>
-      </w:pPr>
-      <w:r>
-        <w:t>The limitations</w:t>
-      </w:r>
-    </w:p>
-    <w:p>
-      <w:r>
-        <w:t>Three, stated plainly and in your own voice:</w:t>
-      </w:r>
-    </w:p>
-    <w:p>
-      <w:pPr>
-        <w:pStyle w:val="ListBullet"/>
-      </w:pPr>
-      <w:r>
-        <w:rPr>
-          <w:b/>
-        </w:rPr>
-        <w:t>The data is synthetic.</w:t>
-      </w:r>
-      <w:r>
-        <w:t xml:space="preserve"> The figures illustrate the method rather than describe a real company. It was proved, it was stated, and no corrections were invented, because that would have been worse</w:t>
-      </w:r>
-    </w:p>
-    <w:p>
-      <w:pPr>
-        <w:pStyle w:val="ListBullet"/>
-      </w:pPr>
-      <w:r>
-        <w:rPr>
-          <w:b/>
-        </w:rPr>
-        <w:t>The forecast is weak.</w:t>
-      </w:r>
-      <w:r>
-        <w:t xml:space="preserve"> 22.7% mean absolute error against a flat average's 14.9%. Our own error was measured and reported rather than the test quietly dropped</w:t>
-      </w:r>
-    </w:p>
-    <w:p>
-      <w:pPr>
-        <w:pStyle w:val="ListBullet"/>
-      </w:pPr>
-      <w:r>
-        <w:rPr>
-          <w:b/>
-        </w:rPr>
-        <w:t>Correlation is not causation.</w:t>
-      </w:r>
-      <w:r>
-        <w:t xml:space="preserve"> Order count and revenue move together; that is not proof that one causes the other</w:t>
-      </w:r>
-    </w:p>
-    <w:p>
-      <w:r>
-        <w:t xml:space="preserve">Then what the group </w:t>
-      </w:r>
-      <w:r>
-        <w:rPr>
-          <w:i/>
-        </w:rPr>
-        <w:t>would</w:t>
-      </w:r>
-      <w:r>
-        <w:t xml:space="preserve"> stand behind: the method. A defect-documented dataset, a normalised schema with enforced constraints, queries verified on two database engines, and statistics tested for significance rather than eyeballed — with the negative results reported alongside the positive ones.</w:t>
-      </w:r>
-    </w:p>
-    <w:p>
-      <w:pPr>
-        <w:pStyle w:val="Heading2"/>
-      </w:pPr>
-      <w:r>
-        <w:t>The questions we would expect</w:t>
-      </w:r>
-    </w:p>
-    <w:p>
-      <w:r>
-        <w:t>Still speaking continuously, raise these and answer them in your own words. This is the part that stands in for a live defense, so take it slowly.</w:t>
+        <w:t>So with that correction made, here's what the analysis actually tells this business. Three recommendations, and each one is tied to a measurement rather than an opinion.</w:t>
       </w:r>
     </w:p>
     <w:p>
@@ -4439,28 +1315,10 @@
         <w:rPr>
           <w:b/>
         </w:rPr>
-        <w:t>Does a fake dataset invalidate the project?</w:t>
+        <w:t>First — track order count, not revenue.</w:t>
       </w:r>
       <w:r>
-        <w:t xml:space="preserve"> It invalidates the </w:t>
-      </w:r>
-      <w:r>
-        <w:rPr>
-          <w:i/>
-        </w:rPr>
-        <w:t>figures</w:t>
-      </w:r>
-      <w:r>
-        <w:t xml:space="preserve">, not the </w:t>
-      </w:r>
-      <w:r>
-        <w:rPr>
-          <w:i/>
-        </w:rPr>
-        <w:t>method</w:t>
-      </w:r>
-      <w:r>
-        <w:t>. It was proved with five signals and no corrections were fabricated, which would have been worse. The schema, the queries and the analysis would run identically on real data.</w:t>
+        <w:t xml:space="preserve"> Revenue is the lagging indicator. Order count is what drives it, at r of 0.923, and it's the thing the business can actually act on.</w:t>
       </w:r>
     </w:p>
     <w:p>
@@ -4468,7 +1326,70 @@
         <w:rPr>
           <w:b/>
         </w:rPr>
-        <w:t>Why not use `Order ID` as the primary key?</w:t>
+        <w:t>Second — plan seasonality by category, not company-wide.</w:t>
+      </w:r>
+      <w:r>
+        <w:t xml:space="preserve"> The blended curve is wrong for all three categories. Electronics peaks in Q2; Furniture and Office Supplies peak in Q4. A single planning curve over-stocks Electronics in Q4 and under-stocks it in Q2.</w:t>
+      </w:r>
+    </w:p>
+    <w:p>
+      <w:r>
+        <w:rPr>
+          <w:b/>
+        </w:rPr>
+        <w:t>Third — investigate Printers first.</w:t>
+      </w:r>
+      <w:r>
+        <w:t xml:space="preserve"> One sub-category, 136,865 lost, more than half the entire gap. Whether that's a supply problem, a competitive loss, or a category in structural decline is not something this dataset can tell us. But it tells us where to look — and that's what the analysis was for.</w:t>
+      </w:r>
+    </w:p>
+    <w:p>
+      <w:r>
+        <w:t>Now the limitations, and we'd rather say these ourselves.</w:t>
+      </w:r>
+    </w:p>
+    <w:p>
+      <w:r>
+        <w:t>The data is synthetic. So these figures illustrate a method; they don't describe a real company. We proved that, we said it, and we didn't invent corrections, because that would have been worse.</w:t>
+      </w:r>
+    </w:p>
+    <w:p>
+      <w:r>
+        <w:t>The forecast is weak. 22.7 percent error against a flat average's 14.9. We measured our own error and reported it, rather than quietly dropping the test.</w:t>
+      </w:r>
+    </w:p>
+    <w:p>
+      <w:r>
+        <w:t>And correlation is not causation. Order count and revenue move together. That is not proof that one causes the other.</w:t>
+      </w:r>
+    </w:p>
+    <w:p>
+      <w:r>
+        <w:t>What we would stand behind is the method. A dataset whose defects are documented rather than hidden. A normalised schema with constraints that are enforced and tested. Queries verified on two different database engines. And statistics tested for significance rather than eyeballed — with the negative results reported right alongside the positive ones.</w:t>
+      </w:r>
+    </w:p>
+    <w:p>
+      <w:r>
+        <w:t>Let me finish with the questions we'd expect to be asked.</w:t>
+      </w:r>
+    </w:p>
+    <w:p>
+      <w:r>
+        <w:rPr>
+          <w:b/>
+        </w:rPr>
+        <w:t>Doesn't a fake dataset invalidate the project?</w:t>
+      </w:r>
+      <w:r>
+        <w:t xml:space="preserve"> It invalidates the figures, not the method. We proved it with five signals, and we didn't fabricate corrections, which would have been worse. The schema, the queries and the analysis would run identically on real data.</w:t>
+      </w:r>
+    </w:p>
+    <w:p>
+      <w:r>
+        <w:rPr>
+          <w:b/>
+        </w:rPr>
+        <w:t>Why not use Order ID as the primary key?</w:t>
       </w:r>
       <w:r>
         <w:t xml:space="preserve"> 1,194 rows, 547 distinct IDs, and the repeats span different dates and different customers. It identifies neither a row nor an order.</w:t>
@@ -4482,7 +1403,7 @@
         <w:t>Why exclude 2025, and why show 2020 per month?</w:t>
       </w:r>
       <w:r>
-        <w:t xml:space="preserve"> Both ends of the file are partial. Including them whole would show fake growth at one end and a fake collapse at the other — which is exactly the mistake we made and corrected.</w:t>
+        <w:t xml:space="preserve"> Because both ends of the file are partial. Including them whole would show fake growth at one end and a fake collapse at the other — which is exactly the mistake we made, and corrected.</w:t>
       </w:r>
     </w:p>
     <w:p>
@@ -4490,10 +1411,10 @@
         <w:rPr>
           <w:b/>
         </w:rPr>
-        <w:t>Is R² = 0.85 good?</w:t>
+        <w:t>Is an R-squared of 0.85 good?</w:t>
       </w:r>
       <w:r>
-        <w:t xml:space="preserve"> For cross-sectional business data, yes — but R² alone is not the test. The p-value of 1.98 × 10⁻²⁴ is what says the slope is not zero.</w:t>
+        <w:t xml:space="preserve"> For cross-sectional business data, yes. But R-squared on its own isn't the test. The p-value — 1.98 times ten to the negative 24 — is what tells you the slope isn't zero.</w:t>
       </w:r>
     </w:p>
     <w:p>
@@ -4501,10 +1422,10 @@
         <w:rPr>
           <w:b/>
         </w:rPr>
-        <w:t>The trend test found nothing — doesn't that sink a *trend* project?</w:t>
+        <w:t>Your trend test found nothing. Doesn't that sink a trend project?</w:t>
       </w:r>
       <w:r>
-        <w:t xml:space="preserve"> It found that no single line fits both regimes, which is itself the finding. The trend is real, it is just piecewise, and Figure 2 shows it.</w:t>
+        <w:t xml:space="preserve"> It found that no single line fits both regimes, and that is itself the finding. The trend is real; it's just piecewise. Figure 2 shows it.</w:t>
       </w:r>
     </w:p>
     <w:p>
@@ -4512,10 +1433,10 @@
         <w:rPr>
           <w:b/>
         </w:rPr>
-        <w:t>The forecast lost to a flat average — why keep it?</w:t>
+        <w:t>Your forecast lost to a flat average. Why keep it?</w:t>
       </w:r>
       <w:r>
-        <w:t xml:space="preserve"> Choosing a method on two observations is overfitting the holdout. The loss is reported and the reliability stated honestly.</w:t>
+        <w:t xml:space="preserve"> Because choosing a method on the strength of two observations is overfitting the holdout. We report the loss and state the reliability honestly.</w:t>
       </w:r>
     </w:p>
     <w:p>
@@ -4526,7 +1447,7 @@
         <w:t>What would you do differently?</w:t>
       </w:r>
       <w:r>
-        <w:t xml:space="preserve"> Validate the source before building on it, and check the completeness of both ends of the date range first — that is exactly what caused the one real error, and it would have cost ten minutes to catch at the start.</w:t>
+        <w:t xml:space="preserve"> Validate the source before building on it, and check the completeness of both ends of the date range first. That's exactly what caused our one real error, and it would have taken ten minutes to catch at the start.</w:t>
       </w:r>
     </w:p>
     <w:p>
@@ -4534,36 +1455,10 @@
         <w:rPr>
           <w:b/>
         </w:rPr>
-        <w:t>What is next?</w:t>
+        <w:t>And what's next?</w:t>
       </w:r>
       <w:r>
-        <w:t xml:space="preserve"> Checkpoint 3, the dashboard, built on </w:t>
-      </w:r>
-      <w:r>
-        <w:rPr>
-          <w:b/>
-        </w:rPr>
-        <w:t>order count</w:t>
-      </w:r>
-      <w:r>
-        <w:t xml:space="preserve"> as the primary KPI rather than revenue because it is the leading indicator and the actionable one, and segmented on </w:t>
-      </w:r>
-      <w:r>
-        <w:rPr>
-          <w:b/>
-        </w:rPr>
-        <w:t>margin</w:t>
-      </w:r>
-      <w:r>
-        <w:t xml:space="preserve"> rather than revenue, given how weakly those two turned out to be related.</w:t>
-      </w:r>
-    </w:p>
-    <w:p>
-      <w:pPr>
-        <w:pStyle w:val="Heading2"/>
-      </w:pPr>
-      <w:r>
-        <w:t>Close</w:t>
+        <w:t xml:space="preserve"> Checkpoint 3, the dashboard. We'd build it on order count as the primary KPI rather than revenue, because that's the leading indicator and the actionable one. And we'd segment on margin rather than revenue, given how weakly those two turned out to be related.</w:t>
       </w:r>
     </w:p>
     <w:p>
@@ -4571,134 +1466,17 @@
         <w:rPr>
           <w:i/>
         </w:rPr>
-        <w:t>On screen: the cover page again, or the team slide</w:t>
-      </w:r>
-    </w:p>
-    <w:p>
-      <w:pPr>
-        <w:pStyle w:val="ListBullet"/>
-      </w:pPr>
-      <w:r>
-        <w:t>One sentence on what the project found: growth stopped in 2022, it was driven by a small number of sub-categories rather than a general slowdown, and order count is the measurable driver</w:t>
-      </w:r>
-    </w:p>
-    <w:p>
-      <w:pPr>
-        <w:pStyle w:val="ListBullet"/>
-      </w:pPr>
-      <w:r>
-        <w:t>Thank the instructor, name the three of you, and state that any member can answer questions on any part of the project — which is what Section 1.4 asks for, and which is true if you have rehearsed</w:t>
+        <w:t>[Cover page, or the team slide.]</w:t>
       </w:r>
     </w:p>
     <w:p>
       <w:r>
-        <w:br w:type="page"/>
-      </w:r>
-    </w:p>
-    <w:p>
-      <w:pPr>
-        <w:pStyle w:val="Heading2"/>
-      </w:pPr>
-      <w:r>
-        <w:t>Checklist</w:t>
+        <w:t>So, to sum up. Growth stopped in 2022. It was driven by a small number of sub-categories rather than a general slowdown. And order count is the measurable driver behind it.</w:t>
       </w:r>
     </w:p>
     <w:p>
       <w:r>
-        <w:t>Each of you, before you record:</w:t>
-      </w:r>
-    </w:p>
-    <w:p>
-      <w:pPr>
-        <w:pStyle w:val="ListBullet"/>
-      </w:pPr>
-      <w:r>
-        <w:t>Every number you say out loud, you can point to — a query, a figure, or a cell</w:t>
-      </w:r>
-    </w:p>
-    <w:p>
-      <w:pPr>
-        <w:pStyle w:val="ListBullet"/>
-      </w:pPr>
-      <w:r>
-        <w:t>You can say your section's beats with the script closed</w:t>
-      </w:r>
-    </w:p>
-    <w:p>
-      <w:pPr>
-        <w:pStyle w:val="ListBullet"/>
-      </w:pPr>
-      <w:r>
-        <w:t>You can answer a question about any section, not only the one you recorded — Section 1.4 lets the instructor ask any member about any part</w:t>
-      </w:r>
-    </w:p>
-    <w:p>
-      <w:pPr>
-        <w:pStyle w:val="ListBullet"/>
-      </w:pPr>
-      <w:r>
-        <w:t>Your exhibits are open and on the right screen before you press record</w:t>
-      </w:r>
-    </w:p>
-    <w:p>
-      <w:pPr>
-        <w:pStyle w:val="ListBullet"/>
-      </w:pPr>
-      <w:r>
-        <w:t>You have done the thirty-second test</w:t>
-      </w:r>
-    </w:p>
-    <w:p>
-      <w:r>
-        <w:t>Alber, before you submit:</w:t>
-      </w:r>
-    </w:p>
-    <w:p>
-      <w:pPr>
-        <w:pStyle w:val="ListBullet"/>
-      </w:pPr>
-      <w:r>
-        <w:t>All five parts present and in order, no task missing</w:t>
-      </w:r>
-    </w:p>
-    <w:p>
-      <w:pPr>
-        <w:pStyle w:val="ListBullet"/>
-      </w:pPr>
-      <w:r>
-        <w:t>Audio levels normalised across all three speakers</w:t>
-      </w:r>
-    </w:p>
-    <w:p>
-      <w:pPr>
-        <w:pStyle w:val="ListBullet"/>
-      </w:pPr>
-      <w:r>
-        <w:t>Each speaker names themselves once, and nobody claims a task or a role</w:t>
-      </w:r>
-    </w:p>
-    <w:p>
-      <w:pPr>
-        <w:pStyle w:val="ListBullet"/>
-      </w:pPr>
-      <w:r>
-        <w:t>The synthetic data, the Checkpoint 1 correction and the forecast that lost are all audibly in the recording</w:t>
-      </w:r>
-    </w:p>
-    <w:p>
-      <w:pPr>
-        <w:pStyle w:val="ListBullet"/>
-      </w:pPr>
-      <w:r>
-        <w:t>Played back end to end — the file opens, the audio does not cut out, the on-screen numbers are legible, and the length fits any limit you were given</w:t>
-      </w:r>
-    </w:p>
-    <w:p>
-      <w:pPr>
-        <w:pStyle w:val="ListBullet"/>
-      </w:pPr>
-      <w:r>
-        <w:t>File named with your group and the checkpoint</w:t>
+        <w:t>Thank you for watching. That's Alber, Julebeth and Mardy — and any of us can answer questions on any part of this project.</w:t>
       </w:r>
     </w:p>
     <w:sectPr>

</xml_diff>

<commit_message>
Re-split the parts: Checkpoint 1 to Julebeth and Mardy, Checkpoint 2 to Alber
Julebeth now takes the dataset and its five problems, Mardy the database and
the eight queries, and Alber the whole of Checkpoint 2 alongside the framing
and the close. Five parts still, with the seams rewritten: Julebeth ends
handing the raw file on to the database, Mardy ends handing Checkpoint 1 on to
Checkpoint 2, and Alber picks the workbook up from there.

Timings: Alber 19 minutes across three files, Julebeth 3:30, Mardy 5:30, total
unchanged at about 28. Alber's Checkpoint 2 part runs ten minutes, so it is
flagged as recordable in two sittings with the break after the regression.

Co-Authored-By: Claude Opus 5 <noreply@anthropic.com>
Claude-Session: https://claude.ai/code/session_01VZUVZ4Kh74tBbebjZDm9fE
</commit_message>
<xml_diff>
--- a/docs/Discussion_Script.docx
+++ b/docs/Discussion_Script.docx
@@ -255,7 +255,7 @@
               <w:rPr>
                 <w:sz w:val="18"/>
               </w:rPr>
-              <w:t>Checkpoint 1 — the dataset, the database, the queries</w:t>
+              <w:t>Checkpoint 1 — the dataset and its five problems</w:t>
             </w:r>
           </w:p>
         </w:tc>
@@ -276,7 +276,7 @@
               <w:rPr>
                 <w:sz w:val="18"/>
               </w:rPr>
-              <w:t>8:45</w:t>
+              <w:t>3:30</w:t>
             </w:r>
           </w:p>
         </w:tc>
@@ -320,7 +320,7 @@
               <w:rPr>
                 <w:sz w:val="18"/>
               </w:rPr>
-              <w:t>Alber</w:t>
+              <w:t>Mardy</w:t>
             </w:r>
           </w:p>
         </w:tc>
@@ -341,7 +341,7 @@
               <w:rPr>
                 <w:sz w:val="18"/>
               </w:rPr>
-              <w:t>The Checkpoint 2 workbook</w:t>
+              <w:t>Checkpoint 1 — the database, and the eight queries</w:t>
             </w:r>
           </w:p>
         </w:tc>
@@ -362,7 +362,7 @@
               <w:rPr>
                 <w:sz w:val="18"/>
               </w:rPr>
-              <w:t>1:30</w:t>
+              <w:t>5:30</w:t>
             </w:r>
           </w:p>
         </w:tc>
@@ -406,7 +406,7 @@
               <w:rPr>
                 <w:sz w:val="18"/>
               </w:rPr>
-              <w:t>Mardy</w:t>
+              <w:t>Alber</w:t>
             </w:r>
           </w:p>
         </w:tc>
@@ -427,7 +427,7 @@
               <w:rPr>
                 <w:sz w:val="18"/>
               </w:rPr>
-              <w:t>Checkpoint 2 — statistics, correlation, regression, the trend</w:t>
+              <w:t>Checkpoint 2 — the workbook, statistics, regression, the trend</w:t>
             </w:r>
           </w:p>
         </w:tc>
@@ -448,7 +448,7 @@
               <w:rPr>
                 <w:sz w:val="18"/>
               </w:rPr>
-              <w:t>8:30</w:t>
+              <w:t>10:00</w:t>
             </w:r>
           </w:p>
         </w:tc>
@@ -565,7 +565,12 @@
         <w:t>28 minutes</w:t>
       </w:r>
       <w:r>
-        <w:t xml:space="preserve"> at a normal speaking pace — Alber 10:30 across his three parts, Julebeth 8:45, Mardy 8:30. If you need it shorter, cut the six limitations down to one line in Part 4 and drop three of the eight questions in Part 5; that takes off about three minutes without losing a task.</w:t>
+        <w:t xml:space="preserve"> at a normal speaking pace. Alber carries Checkpoint 2 and the framing — 19 minutes across three files — while Julebeth and Mardy split Checkpoint 1 between them. Alber's Part 4 is the long one, so record it in two sittings if you need to; there is a natural break after the regression.</w:t>
+      </w:r>
+    </w:p>
+    <w:p>
+      <w:r>
+        <w:t>If you need it shorter, cut the six limitations in Part 4 down to one line and drop three of the eight questions in Part 5; that takes off about three minutes without losing a task.</w:t>
       </w:r>
     </w:p>
     <w:p>
@@ -810,10 +815,33 @@
     </w:p>
     <w:p>
       <w:r>
+        <w:t>That is the state of the raw data we started from. What we built out of it next was a proper database.</w:t>
+      </w:r>
+    </w:p>
+    <w:p>
+      <w:r>
+        <w:br w:type="page"/>
+      </w:r>
+    </w:p>
+    <w:p>
+      <w:pPr>
+        <w:pStyle w:val="Heading1"/>
+      </w:pPr>
+      <w:r>
+        <w:t>Part 3 — Mardy</w:t>
+      </w:r>
+    </w:p>
+    <w:p>
+      <w:r>
         <w:rPr>
           <w:i/>
         </w:rPr>
-        <w:t>[Switch to the ERD.]</w:t>
+        <w:t>[The ERD on screen.]</w:t>
+      </w:r>
+    </w:p>
+    <w:p>
+      <w:r>
+        <w:t>I'm Mardy, and I'll take the database and the queries.</w:t>
       </w:r>
     </w:p>
     <w:p>
@@ -948,11 +976,16 @@
       </w:r>
     </w:p>
     <w:p>
+      <w:r>
+        <w:br w:type="page"/>
+      </w:r>
+    </w:p>
+    <w:p>
       <w:pPr>
         <w:pStyle w:val="Heading1"/>
       </w:pPr>
       <w:r>
-        <w:t>Part 3 — Alber</w:t>
+        <w:t>Part 4 — Alber</w:t>
       </w:r>
     </w:p>
     <w:p>
@@ -965,7 +998,7 @@
     </w:p>
     <w:p>
       <w:r>
-        <w:t>The first thing Checkpoint 2 needed was the workbook itself, built on the same dataset, which the brief requires.</w:t>
+        <w:t>So, Checkpoint 2. The first thing it needed was the workbook itself, built on the same dataset, which the brief requires.</w:t>
       </w:r>
     </w:p>
     <w:p>
@@ -1003,33 +1036,15 @@
     </w:p>
     <w:p>
       <w:r>
-        <w:br w:type="page"/>
-      </w:r>
-    </w:p>
-    <w:p>
-      <w:pPr>
-        <w:pStyle w:val="Heading1"/>
-      </w:pPr>
-      <w:r>
-        <w:t>Part 4 — Mardy</w:t>
+        <w:rPr>
+          <w:i/>
+        </w:rPr>
+        <w:t>[Switch to the Amount histogram.]</w:t>
       </w:r>
     </w:p>
     <w:p>
       <w:r>
-        <w:rPr>
-          <w:i/>
-        </w:rPr>
-        <w:t>[The Amount histogram on screen.]</w:t>
-      </w:r>
-    </w:p>
-    <w:p>
-      <w:r>
-        <w:t>I'm Mardy, and I'll take the analysis.</w:t>
-      </w:r>
-    </w:p>
-    <w:p>
-      <w:r>
-        <w:t>The first thing we asked of that data was simply what it looks like. Three numerical variables — Amount, Profit and Quantity — and for each one we have the mean, median and mode, standard deviation, variance, range, quartiles, the interquartile range and the coefficient of variation, plus a frequency distribution and a histogram.</w:t>
+        <w:t>So the first thing we asked of that data was simply what it looks like. Three numerical variables — Amount, Profit and Quantity — and for each one we have the mean, median and mode, standard deviation, variance, range, quartiles, the interquartile range and the coefficient of variation, plus a frequency distribution and a histogram.</w:t>
       </w:r>
     </w:p>
     <w:p>
@@ -1251,6 +1266,11 @@
     <w:p>
       <w:r>
         <w:t>Building that monthly series also turned up something nobody expected. And it was a mistake of our own.</w:t>
+      </w:r>
+    </w:p>
+    <w:p>
+      <w:r>
+        <w:br w:type="page"/>
       </w:r>
     </w:p>
     <w:p>

</xml_diff>